<commit_message>
Atualizacao do relatorio do dia 21/08
</commit_message>
<xml_diff>
--- a/doc/_RELATORIOS DE ATIV. PRATICAS - GRUPO 04.docx
+++ b/doc/_RELATORIOS DE ATIV. PRATICAS - GRUPO 04.docx
@@ -352,10 +352,14 @@
           <w:sz w:val="24"/>
           <w:szCs w:val="24"/>
         </w:rPr>
-        <w:t xml:space="preserve">ISAQUE BEZERRA REIS, SUELEN </w:t>
-      </w:r>
-      <w:proofErr w:type="gramStart"/>
-      <w:r>
+        <w:t>ISAQUE REIS</w:t>
+      </w:r>
+    </w:p>
+    <w:p>
+      <w:pPr>
+        <w:widowControl/>
+        <w:spacing w:after="120"/>
+        <w:jc w:val="center"/>
         <w:rPr>
           <w:rFonts w:ascii="Arial" w:eastAsia="Arial" w:hAnsi="Arial" w:cs="Arial"/>
           <w:b/>
@@ -363,9 +367,7 @@
           <w:sz w:val="24"/>
           <w:szCs w:val="24"/>
         </w:rPr>
-        <w:t>TAVARES,SUELY</w:t>
-      </w:r>
-      <w:proofErr w:type="gramEnd"/>
+      </w:pPr>
       <w:r>
         <w:rPr>
           <w:rFonts w:ascii="Arial" w:eastAsia="Arial" w:hAnsi="Arial" w:cs="Arial"/>
@@ -374,10 +376,14 @@
           <w:sz w:val="24"/>
           <w:szCs w:val="24"/>
         </w:rPr>
-        <w:t xml:space="preserve"> </w:t>
-      </w:r>
-      <w:proofErr w:type="gramStart"/>
-      <w:r>
+        <w:t>JOQUEBEDE SANTOS</w:t>
+      </w:r>
+    </w:p>
+    <w:p>
+      <w:pPr>
+        <w:widowControl/>
+        <w:spacing w:after="120"/>
+        <w:jc w:val="center"/>
         <w:rPr>
           <w:rFonts w:ascii="Arial" w:eastAsia="Arial" w:hAnsi="Arial" w:cs="Arial"/>
           <w:b/>
@@ -385,9 +391,7 @@
           <w:sz w:val="24"/>
           <w:szCs w:val="24"/>
         </w:rPr>
-        <w:t>NASCIMENTO,JOQUEBEDE</w:t>
-      </w:r>
-      <w:proofErr w:type="gramEnd"/>
+      </w:pPr>
       <w:r>
         <w:rPr>
           <w:rFonts w:ascii="Arial" w:eastAsia="Arial" w:hAnsi="Arial" w:cs="Arial"/>
@@ -396,7 +400,7 @@
           <w:sz w:val="24"/>
           <w:szCs w:val="24"/>
         </w:rPr>
-        <w:t xml:space="preserve"> SANTOS E SOPHIA ROQUE MARTINS</w:t>
+        <w:t>SUELEN TAVARES</w:t>
       </w:r>
     </w:p>
     <w:p>
@@ -412,6 +416,16 @@
           <w:szCs w:val="24"/>
         </w:rPr>
       </w:pPr>
+      <w:r>
+        <w:rPr>
+          <w:rFonts w:ascii="Arial" w:eastAsia="Arial" w:hAnsi="Arial" w:cs="Arial"/>
+          <w:b/>
+          <w:bCs/>
+          <w:sz w:val="24"/>
+          <w:szCs w:val="24"/>
+        </w:rPr>
+        <w:t>SUELY NASCIMENTO</w:t>
+      </w:r>
     </w:p>
     <w:p>
       <w:pPr>
@@ -426,6 +440,16 @@
           <w:szCs w:val="24"/>
         </w:rPr>
       </w:pPr>
+      <w:r>
+        <w:rPr>
+          <w:rFonts w:ascii="Arial" w:eastAsia="Arial" w:hAnsi="Arial" w:cs="Arial"/>
+          <w:b/>
+          <w:bCs/>
+          <w:sz w:val="24"/>
+          <w:szCs w:val="24"/>
+        </w:rPr>
+        <w:t>SOPHIA ROQUE MARTINS</w:t>
+      </w:r>
     </w:p>
     <w:p>
       <w:pPr>
@@ -515,6 +539,7 @@
       <w:pPr>
         <w:widowControl/>
         <w:spacing w:after="120"/>
+        <w:jc w:val="center"/>
         <w:rPr>
           <w:rFonts w:ascii="Arial" w:eastAsia="Arial" w:hAnsi="Arial" w:cs="Arial"/>
           <w:b/>
@@ -528,7 +553,6 @@
       <w:pPr>
         <w:widowControl/>
         <w:spacing w:after="120"/>
-        <w:jc w:val="center"/>
         <w:rPr>
           <w:rFonts w:ascii="Arial" w:eastAsia="Arial" w:hAnsi="Arial" w:cs="Arial"/>
           <w:b/>
@@ -559,6 +583,7 @@
           <w:sz w:val="24"/>
           <w:szCs w:val="24"/>
         </w:rPr>
+        <w:lastRenderedPageBreak/>
         <w:t>MANAUS/AM - 2026</w:t>
       </w:r>
     </w:p>
@@ -1106,6 +1131,51 @@
     <w:p>
       <w:pPr>
         <w:widowControl/>
+        <w:tabs>
+          <w:tab w:val="left" w:pos="567"/>
+        </w:tabs>
+        <w:spacing w:before="240" w:after="240" w:line="360" w:lineRule="auto"/>
+        <w:jc w:val="both"/>
+        <w:rPr>
+          <w:rFonts w:ascii="Arial" w:eastAsia="Arial" w:hAnsi="Arial" w:cs="Arial"/>
+          <w:sz w:val="24"/>
+          <w:szCs w:val="24"/>
+        </w:rPr>
+      </w:pPr>
+    </w:p>
+    <w:p>
+      <w:pPr>
+        <w:widowControl/>
+        <w:tabs>
+          <w:tab w:val="left" w:pos="567"/>
+        </w:tabs>
+        <w:spacing w:before="240" w:after="240" w:line="360" w:lineRule="auto"/>
+        <w:jc w:val="both"/>
+        <w:rPr>
+          <w:rFonts w:ascii="Arial" w:eastAsia="Arial" w:hAnsi="Arial" w:cs="Arial"/>
+          <w:sz w:val="24"/>
+          <w:szCs w:val="24"/>
+        </w:rPr>
+      </w:pPr>
+    </w:p>
+    <w:p>
+      <w:pPr>
+        <w:widowControl/>
+        <w:tabs>
+          <w:tab w:val="left" w:pos="567"/>
+        </w:tabs>
+        <w:spacing w:before="240" w:after="240" w:line="360" w:lineRule="auto"/>
+        <w:jc w:val="both"/>
+        <w:rPr>
+          <w:rFonts w:ascii="Arial" w:eastAsia="Arial" w:hAnsi="Arial" w:cs="Arial"/>
+          <w:sz w:val="24"/>
+          <w:szCs w:val="24"/>
+        </w:rPr>
+      </w:pPr>
+    </w:p>
+    <w:p>
+      <w:pPr>
+        <w:widowControl/>
         <w:numPr>
           <w:ilvl w:val="0"/>
           <w:numId w:val="1"/>
@@ -1142,6 +1212,7 @@
           <w:sz w:val="24"/>
           <w:szCs w:val="24"/>
         </w:rPr>
+        <w:lastRenderedPageBreak/>
         <w:t>DESENVOLVIMENTO</w:t>
       </w:r>
     </w:p>
@@ -1242,7 +1313,6 @@
           <w:sz w:val="24"/>
           <w:szCs w:val="24"/>
         </w:rPr>
-        <w:lastRenderedPageBreak/>
         <w:t>Objetivo:</w:t>
       </w:r>
     </w:p>
@@ -1526,14 +1596,6 @@
           <w:szCs w:val="24"/>
         </w:rPr>
       </w:pPr>
-      <w:r>
-        <w:rPr>
-          <w:rFonts w:ascii="Arial" w:eastAsia="Arial" w:hAnsi="Arial" w:cs="Arial"/>
-          <w:sz w:val="24"/>
-          <w:szCs w:val="24"/>
-        </w:rPr>
-        <w:t>AULA 2 - ARQUITETURA MVC E SPRING BOOT</w:t>
-      </w:r>
     </w:p>
     <w:p>
       <w:pPr>
@@ -1551,14 +1613,6 @@
           <w:szCs w:val="24"/>
         </w:rPr>
       </w:pPr>
-      <w:r>
-        <w:rPr>
-          <w:rFonts w:ascii="Arial" w:eastAsia="Arial" w:hAnsi="Arial" w:cs="Arial"/>
-          <w:sz w:val="24"/>
-          <w:szCs w:val="24"/>
-        </w:rPr>
-        <w:t>Data: 11/08/2026</w:t>
-      </w:r>
     </w:p>
     <w:p>
       <w:pPr>
@@ -1576,14 +1630,6 @@
           <w:szCs w:val="24"/>
         </w:rPr>
       </w:pPr>
-      <w:r>
-        <w:rPr>
-          <w:rFonts w:ascii="Arial" w:eastAsia="Arial" w:hAnsi="Arial" w:cs="Arial"/>
-          <w:sz w:val="24"/>
-          <w:szCs w:val="24"/>
-        </w:rPr>
-        <w:t>Tema: Arquitetura MVC, Maven, Spring Boot</w:t>
-      </w:r>
     </w:p>
     <w:p>
       <w:pPr>
@@ -1601,14 +1647,6 @@
           <w:szCs w:val="24"/>
         </w:rPr>
       </w:pPr>
-      <w:r>
-        <w:rPr>
-          <w:rFonts w:ascii="Arial" w:eastAsia="Arial" w:hAnsi="Arial" w:cs="Arial"/>
-          <w:sz w:val="24"/>
-          <w:szCs w:val="24"/>
-        </w:rPr>
-        <w:t>Objetivo:</w:t>
-      </w:r>
     </w:p>
     <w:p>
       <w:pPr>
@@ -1626,14 +1664,6 @@
           <w:szCs w:val="24"/>
         </w:rPr>
       </w:pPr>
-      <w:r>
-        <w:rPr>
-          <w:rFonts w:ascii="Arial" w:eastAsia="Arial" w:hAnsi="Arial" w:cs="Arial"/>
-          <w:sz w:val="24"/>
-          <w:szCs w:val="24"/>
-        </w:rPr>
-        <w:t>Compreender a estrutura de uma aplicação web utilizando a arquitetura MVC e o Spring Boot, conhecendo a organização do projeto, suas principais dependências e as Annotations utilizadas no desenvolvimento.</w:t>
-      </w:r>
     </w:p>
     <w:p>
       <w:pPr>
@@ -1668,6 +1698,15 @@
           <w:szCs w:val="24"/>
         </w:rPr>
       </w:pPr>
+      <w:r>
+        <w:rPr>
+          <w:rFonts w:ascii="Arial" w:eastAsia="Arial" w:hAnsi="Arial" w:cs="Arial"/>
+          <w:sz w:val="24"/>
+          <w:szCs w:val="24"/>
+        </w:rPr>
+        <w:lastRenderedPageBreak/>
+        <w:t>AULA 2 - ARQUITETURA MVC E SPRING BOOT</w:t>
+      </w:r>
     </w:p>
     <w:p>
       <w:pPr>
@@ -1685,6 +1724,14 @@
           <w:szCs w:val="24"/>
         </w:rPr>
       </w:pPr>
+      <w:r>
+        <w:rPr>
+          <w:rFonts w:ascii="Arial" w:eastAsia="Arial" w:hAnsi="Arial" w:cs="Arial"/>
+          <w:sz w:val="24"/>
+          <w:szCs w:val="24"/>
+        </w:rPr>
+        <w:t>Data: 11/08/2026</w:t>
+      </w:r>
     </w:p>
     <w:p>
       <w:pPr>
@@ -1708,7 +1755,149 @@
           <w:sz w:val="24"/>
           <w:szCs w:val="24"/>
         </w:rPr>
-        <w:lastRenderedPageBreak/>
+        <w:t xml:space="preserve">Tema: </w:t>
+      </w:r>
+      <w:r>
+        <w:rPr>
+          <w:rFonts w:ascii="Arial" w:eastAsia="Arial" w:hAnsi="Arial" w:cs="Arial"/>
+          <w:sz w:val="24"/>
+          <w:szCs w:val="24"/>
+        </w:rPr>
+        <w:t xml:space="preserve">Banco de </w:t>
+      </w:r>
+      <w:proofErr w:type="spellStart"/>
+      <w:r>
+        <w:rPr>
+          <w:rFonts w:ascii="Arial" w:eastAsia="Arial" w:hAnsi="Arial" w:cs="Arial"/>
+          <w:sz w:val="24"/>
+          <w:szCs w:val="24"/>
+        </w:rPr>
+        <w:t>dados</w:t>
+      </w:r>
+      <w:r>
+        <w:rPr>
+          <w:rFonts w:ascii="Arial" w:eastAsia="Arial" w:hAnsi="Arial" w:cs="Arial"/>
+          <w:sz w:val="24"/>
+          <w:szCs w:val="24"/>
+        </w:rPr>
+        <w:t>Arquitetura</w:t>
+      </w:r>
+      <w:proofErr w:type="spellEnd"/>
+      <w:r>
+        <w:rPr>
+          <w:rFonts w:ascii="Arial" w:eastAsia="Arial" w:hAnsi="Arial" w:cs="Arial"/>
+          <w:sz w:val="24"/>
+          <w:szCs w:val="24"/>
+        </w:rPr>
+        <w:t xml:space="preserve"> MVC, </w:t>
+      </w:r>
+      <w:proofErr w:type="spellStart"/>
+      <w:r>
+        <w:rPr>
+          <w:rFonts w:ascii="Arial" w:eastAsia="Arial" w:hAnsi="Arial" w:cs="Arial"/>
+          <w:sz w:val="24"/>
+          <w:szCs w:val="24"/>
+        </w:rPr>
+        <w:t>Maven</w:t>
+      </w:r>
+      <w:proofErr w:type="spellEnd"/>
+      <w:r>
+        <w:rPr>
+          <w:rFonts w:ascii="Arial" w:eastAsia="Arial" w:hAnsi="Arial" w:cs="Arial"/>
+          <w:sz w:val="24"/>
+          <w:szCs w:val="24"/>
+        </w:rPr>
+        <w:t>, Spring Boot</w:t>
+      </w:r>
+    </w:p>
+    <w:p>
+      <w:pPr>
+        <w:widowControl/>
+        <w:tabs>
+          <w:tab w:val="left" w:pos="66"/>
+          <w:tab w:val="left" w:pos="142"/>
+        </w:tabs>
+        <w:spacing w:after="200" w:line="360" w:lineRule="auto"/>
+        <w:ind w:left="490"/>
+        <w:jc w:val="both"/>
+        <w:rPr>
+          <w:rFonts w:ascii="Arial" w:eastAsia="Arial" w:hAnsi="Arial" w:cs="Arial"/>
+          <w:sz w:val="24"/>
+          <w:szCs w:val="24"/>
+        </w:rPr>
+      </w:pPr>
+      <w:r>
+        <w:rPr>
+          <w:rFonts w:ascii="Arial" w:eastAsia="Arial" w:hAnsi="Arial" w:cs="Arial"/>
+          <w:sz w:val="24"/>
+          <w:szCs w:val="24"/>
+        </w:rPr>
+        <w:t>Objetivo:</w:t>
+      </w:r>
+    </w:p>
+    <w:p>
+      <w:pPr>
+        <w:widowControl/>
+        <w:tabs>
+          <w:tab w:val="left" w:pos="66"/>
+          <w:tab w:val="left" w:pos="142"/>
+        </w:tabs>
+        <w:spacing w:after="200" w:line="360" w:lineRule="auto"/>
+        <w:ind w:left="490"/>
+        <w:jc w:val="both"/>
+        <w:rPr>
+          <w:rFonts w:ascii="Arial" w:eastAsia="Arial" w:hAnsi="Arial" w:cs="Arial"/>
+          <w:sz w:val="24"/>
+          <w:szCs w:val="24"/>
+        </w:rPr>
+      </w:pPr>
+      <w:r>
+        <w:rPr>
+          <w:rFonts w:ascii="Arial" w:eastAsia="Arial" w:hAnsi="Arial" w:cs="Arial"/>
+          <w:sz w:val="24"/>
+          <w:szCs w:val="24"/>
+        </w:rPr>
+        <w:t xml:space="preserve">Compreender a estrutura de uma aplicação web utilizando a arquitetura MVC e o Spring Boot, conhecendo a organização do projeto, suas principais dependências e </w:t>
+      </w:r>
+      <w:r>
+        <w:rPr>
+          <w:rFonts w:ascii="Arial" w:eastAsia="Arial" w:hAnsi="Arial" w:cs="Arial"/>
+          <w:sz w:val="24"/>
+          <w:szCs w:val="24"/>
+        </w:rPr>
+        <w:t>criação do banco de dados</w:t>
+      </w:r>
+      <w:r>
+        <w:rPr>
+          <w:rFonts w:ascii="Arial" w:eastAsia="Arial" w:hAnsi="Arial" w:cs="Arial"/>
+          <w:sz w:val="24"/>
+          <w:szCs w:val="24"/>
+        </w:rPr>
+        <w:t>.</w:t>
+      </w:r>
+    </w:p>
+    <w:p>
+      <w:pPr>
+        <w:widowControl/>
+        <w:tabs>
+          <w:tab w:val="left" w:pos="66"/>
+          <w:tab w:val="left" w:pos="142"/>
+        </w:tabs>
+        <w:spacing w:after="200" w:line="360" w:lineRule="auto"/>
+        <w:ind w:left="490"/>
+        <w:jc w:val="both"/>
+        <w:rPr>
+          <w:rFonts w:ascii="Arial" w:eastAsia="Arial" w:hAnsi="Arial" w:cs="Arial"/>
+          <w:sz w:val="24"/>
+          <w:szCs w:val="24"/>
+        </w:rPr>
+      </w:pPr>
+      <w:r>
+        <w:rPr>
+          <w:rFonts w:ascii="Arial" w:eastAsia="Arial" w:hAnsi="Arial" w:cs="Arial"/>
+          <w:sz w:val="24"/>
+          <w:szCs w:val="24"/>
+        </w:rPr>
         <w:t>Conteúdo Abordado:</w:t>
       </w:r>
     </w:p>
@@ -1788,14 +1977,27 @@
       <w:r>
         <w:t xml:space="preserve">Figura </w:t>
       </w:r>
-      <w:fldSimple w:instr=" SEQ Figura \* ARABIC ">
-        <w:r>
-          <w:rPr>
-            <w:noProof/>
-          </w:rPr>
-          <w:t>1</w:t>
-        </w:r>
-      </w:fldSimple>
+      <w:r>
+        <w:fldChar w:fldCharType="begin"/>
+      </w:r>
+      <w:r>
+        <w:instrText xml:space="preserve"> SEQ Figura \* ARABIC </w:instrText>
+      </w:r>
+      <w:r>
+        <w:fldChar w:fldCharType="separate"/>
+      </w:r>
+      <w:r>
+        <w:rPr>
+          <w:noProof/>
+        </w:rPr>
+        <w:t>1</w:t>
+      </w:r>
+      <w:r>
+        <w:rPr>
+          <w:noProof/>
+        </w:rPr>
+        <w:fldChar w:fldCharType="end"/>
+      </w:r>
       <w:r>
         <w:t xml:space="preserve"> 1Estrutura do Projeto em Camadas (MVC)</w:t>
       </w:r>
@@ -1909,6 +2111,7 @@
           <w:sz w:val="24"/>
           <w:szCs w:val="24"/>
         </w:rPr>
+        <w:lastRenderedPageBreak/>
         <w:t>4. Annotations: foram apresentadas as Annotations utilizadas pelo Spring e pelo JPA, como "@Service", "@</w:t>
       </w:r>
       <w:proofErr w:type="spellStart"/>
@@ -2074,16 +2277,7 @@
           <w:sz w:val="24"/>
           <w:szCs w:val="24"/>
         </w:rPr>
-        <w:t xml:space="preserve">Foi realizada a configuração da estrutura inicial do projeto utilizando Spring Boot e Maven, com foco na inclusão e compreensão das principais dependências no </w:t>
-      </w:r>
-      <w:r>
-        <w:rPr>
-          <w:rFonts w:ascii="Arial" w:eastAsia="Arial" w:hAnsi="Arial" w:cs="Arial"/>
-          <w:sz w:val="24"/>
-          <w:szCs w:val="24"/>
-        </w:rPr>
-        <w:lastRenderedPageBreak/>
-        <w:t xml:space="preserve">arquivo pom.xml. Foram apresentadas dependências como Spring Web, </w:t>
+        <w:t xml:space="preserve">Foi realizada a configuração da estrutura inicial do projeto utilizando Spring Boot e Maven, com foco na inclusão e compreensão das principais dependências no arquivo pom.xml. Foram apresentadas dependências como Spring Web, </w:t>
       </w:r>
       <w:proofErr w:type="spellStart"/>
       <w:r>
@@ -2144,11 +2338,12 @@
           <w:sz w:val="24"/>
           <w:szCs w:val="24"/>
         </w:rPr>
-        <w:t>AULA 3 - INTRODUÇÃO AO GIT E TRABALHO EM EQUIPE</w:t>
-      </w:r>
-    </w:p>
-    <w:p>
-      <w:pPr>
+        <w:t>6.Ciação do banco de dados.</w:t>
+      </w:r>
+    </w:p>
+    <w:p>
+      <w:pPr>
+        <w:keepNext/>
         <w:widowControl/>
         <w:tabs>
           <w:tab w:val="left" w:pos="66"/>
@@ -2156,22 +2351,79 @@
         </w:tabs>
         <w:spacing w:after="200" w:line="360" w:lineRule="auto"/>
         <w:ind w:left="490"/>
-        <w:jc w:val="both"/>
-        <w:rPr>
-          <w:rFonts w:ascii="Arial" w:eastAsia="Arial" w:hAnsi="Arial" w:cs="Arial"/>
-          <w:sz w:val="24"/>
-          <w:szCs w:val="24"/>
-        </w:rPr>
-      </w:pPr>
-      <w:r>
-        <w:rPr>
-          <w:rFonts w:ascii="Arial" w:eastAsia="Arial" w:hAnsi="Arial" w:cs="Arial"/>
-          <w:sz w:val="24"/>
-          <w:szCs w:val="24"/>
-        </w:rPr>
-        <w:t>Data: 12/08/2026</w:t>
-      </w:r>
-    </w:p>
+        <w:jc w:val="center"/>
+      </w:pPr>
+      <w:r>
+        <w:rPr>
+          <w:noProof/>
+        </w:rPr>
+        <w:drawing>
+          <wp:inline distT="0" distB="0" distL="0" distR="0" wp14:anchorId="62E830C9" wp14:editId="4C0E9137">
+            <wp:extent cx="5540110" cy="2228850"/>
+            <wp:effectExtent l="0" t="0" r="3810" b="0"/>
+            <wp:docPr id="897507779" name="Imagem 1"/>
+            <wp:cNvGraphicFramePr>
+              <a:graphicFrameLocks xmlns:a="http://schemas.openxmlformats.org/drawingml/2006/main" noChangeAspect="1"/>
+            </wp:cNvGraphicFramePr>
+            <a:graphic xmlns:a="http://schemas.openxmlformats.org/drawingml/2006/main">
+              <a:graphicData uri="http://schemas.openxmlformats.org/drawingml/2006/picture">
+                <pic:pic xmlns:pic="http://schemas.openxmlformats.org/drawingml/2006/picture">
+                  <pic:nvPicPr>
+                    <pic:cNvPr id="897507779" name=""/>
+                    <pic:cNvPicPr/>
+                  </pic:nvPicPr>
+                  <pic:blipFill>
+                    <a:blip r:embed="rId9"/>
+                    <a:stretch>
+                      <a:fillRect/>
+                    </a:stretch>
+                  </pic:blipFill>
+                  <pic:spPr>
+                    <a:xfrm>
+                      <a:off x="0" y="0"/>
+                      <a:ext cx="5541029" cy="2229220"/>
+                    </a:xfrm>
+                    <a:prstGeom prst="rect">
+                      <a:avLst/>
+                    </a:prstGeom>
+                  </pic:spPr>
+                </pic:pic>
+              </a:graphicData>
+            </a:graphic>
+          </wp:inline>
+        </w:drawing>
+      </w:r>
+    </w:p>
+    <w:p>
+      <w:pPr>
+        <w:pStyle w:val="Legenda"/>
+      </w:pPr>
+      <w:r>
+        <w:t xml:space="preserve">Figura </w:t>
+      </w:r>
+      <w:r>
+        <w:fldChar w:fldCharType="begin"/>
+      </w:r>
+      <w:r>
+        <w:instrText xml:space="preserve"> SEQ Figura \* ARABIC </w:instrText>
+      </w:r>
+      <w:r>
+        <w:fldChar w:fldCharType="separate"/>
+      </w:r>
+      <w:r>
+        <w:rPr>
+          <w:noProof/>
+        </w:rPr>
+        <w:t>2</w:t>
+      </w:r>
+      <w:r>
+        <w:fldChar w:fldCharType="end"/>
+      </w:r>
+      <w:r>
+        <w:t xml:space="preserve"> Banco de Dados da Loja Virtual de Roupa</w:t>
+      </w:r>
+    </w:p>
+    <w:p/>
     <w:p>
       <w:pPr>
         <w:widowControl/>
@@ -2194,25 +2446,7 @@
           <w:sz w:val="24"/>
           <w:szCs w:val="24"/>
         </w:rPr>
-        <w:t xml:space="preserve">Tema: Controle de Versão com </w:t>
-      </w:r>
-      <w:proofErr w:type="spellStart"/>
-      <w:r>
-        <w:rPr>
-          <w:rFonts w:ascii="Arial" w:eastAsia="Arial" w:hAnsi="Arial" w:cs="Arial"/>
-          <w:sz w:val="24"/>
-          <w:szCs w:val="24"/>
-        </w:rPr>
-        <w:t>Git</w:t>
-      </w:r>
-      <w:proofErr w:type="spellEnd"/>
-      <w:r>
-        <w:rPr>
-          <w:rFonts w:ascii="Arial" w:eastAsia="Arial" w:hAnsi="Arial" w:cs="Arial"/>
-          <w:sz w:val="24"/>
-          <w:szCs w:val="24"/>
-        </w:rPr>
-        <w:t xml:space="preserve"> e GitHub</w:t>
+        <w:t>AULA 3 - INTRODUÇÃO AO GIT E TRABALHO EM EQUIPE</w:t>
       </w:r>
     </w:p>
     <w:p>
@@ -2237,7 +2471,7 @@
           <w:sz w:val="24"/>
           <w:szCs w:val="24"/>
         </w:rPr>
-        <w:t>Objetivo:</w:t>
+        <w:t>Data: 12/08/2026</w:t>
       </w:r>
     </w:p>
     <w:p>
@@ -2262,6 +2496,75 @@
           <w:sz w:val="24"/>
           <w:szCs w:val="24"/>
         </w:rPr>
+        <w:t xml:space="preserve">Tema: Controle de Versão com </w:t>
+      </w:r>
+      <w:proofErr w:type="spellStart"/>
+      <w:r>
+        <w:rPr>
+          <w:rFonts w:ascii="Arial" w:eastAsia="Arial" w:hAnsi="Arial" w:cs="Arial"/>
+          <w:sz w:val="24"/>
+          <w:szCs w:val="24"/>
+        </w:rPr>
+        <w:t>Git</w:t>
+      </w:r>
+      <w:proofErr w:type="spellEnd"/>
+      <w:r>
+        <w:rPr>
+          <w:rFonts w:ascii="Arial" w:eastAsia="Arial" w:hAnsi="Arial" w:cs="Arial"/>
+          <w:sz w:val="24"/>
+          <w:szCs w:val="24"/>
+        </w:rPr>
+        <w:t xml:space="preserve"> e GitHub</w:t>
+      </w:r>
+    </w:p>
+    <w:p>
+      <w:pPr>
+        <w:widowControl/>
+        <w:tabs>
+          <w:tab w:val="left" w:pos="66"/>
+          <w:tab w:val="left" w:pos="142"/>
+        </w:tabs>
+        <w:spacing w:after="200" w:line="360" w:lineRule="auto"/>
+        <w:ind w:left="490"/>
+        <w:jc w:val="both"/>
+        <w:rPr>
+          <w:rFonts w:ascii="Arial" w:eastAsia="Arial" w:hAnsi="Arial" w:cs="Arial"/>
+          <w:sz w:val="24"/>
+          <w:szCs w:val="24"/>
+        </w:rPr>
+      </w:pPr>
+      <w:r>
+        <w:rPr>
+          <w:rFonts w:ascii="Arial" w:eastAsia="Arial" w:hAnsi="Arial" w:cs="Arial"/>
+          <w:sz w:val="24"/>
+          <w:szCs w:val="24"/>
+        </w:rPr>
+        <w:t>Objetivo:</w:t>
+      </w:r>
+    </w:p>
+    <w:p>
+      <w:pPr>
+        <w:widowControl/>
+        <w:tabs>
+          <w:tab w:val="left" w:pos="66"/>
+          <w:tab w:val="left" w:pos="142"/>
+        </w:tabs>
+        <w:spacing w:after="200" w:line="360" w:lineRule="auto"/>
+        <w:ind w:left="490"/>
+        <w:jc w:val="both"/>
+        <w:rPr>
+          <w:rFonts w:ascii="Arial" w:eastAsia="Arial" w:hAnsi="Arial" w:cs="Arial"/>
+          <w:sz w:val="24"/>
+          <w:szCs w:val="24"/>
+        </w:rPr>
+      </w:pPr>
+      <w:r>
+        <w:rPr>
+          <w:rFonts w:ascii="Arial" w:eastAsia="Arial" w:hAnsi="Arial" w:cs="Arial"/>
+          <w:sz w:val="24"/>
+          <w:szCs w:val="24"/>
+        </w:rPr>
+        <w:lastRenderedPageBreak/>
         <w:t xml:space="preserve">Aprender a utilizar a ferramenta </w:t>
       </w:r>
       <w:proofErr w:type="spellStart"/>
@@ -2480,7 +2783,7 @@
                     <pic:cNvPicPr/>
                   </pic:nvPicPr>
                   <pic:blipFill>
-                    <a:blip r:embed="rId9"/>
+                    <a:blip r:embed="rId10"/>
                     <a:stretch>
                       <a:fillRect/>
                     </a:stretch>
@@ -2513,14 +2816,27 @@
       <w:r>
         <w:t xml:space="preserve">Figura </w:t>
       </w:r>
-      <w:fldSimple w:instr=" SEQ Figura \* ARABIC ">
-        <w:r>
-          <w:rPr>
-            <w:noProof/>
-          </w:rPr>
-          <w:t>2</w:t>
-        </w:r>
-      </w:fldSimple>
+      <w:r>
+        <w:fldChar w:fldCharType="begin"/>
+      </w:r>
+      <w:r>
+        <w:instrText xml:space="preserve"> SEQ Figura \* ARABIC </w:instrText>
+      </w:r>
+      <w:r>
+        <w:fldChar w:fldCharType="separate"/>
+      </w:r>
+      <w:r>
+        <w:rPr>
+          <w:noProof/>
+        </w:rPr>
+        <w:t>3</w:t>
+      </w:r>
+      <w:r>
+        <w:rPr>
+          <w:noProof/>
+        </w:rPr>
+        <w:fldChar w:fldCharType="end"/>
+      </w:r>
       <w:r>
         <w:t xml:space="preserve"> Clonagem do Projeto do Grupo 4</w:t>
       </w:r>
@@ -2650,7 +2966,6 @@
           <w:sz w:val="24"/>
           <w:szCs w:val="24"/>
         </w:rPr>
-        <w:lastRenderedPageBreak/>
         <w:t>Atividades Realizadas:</w:t>
       </w:r>
     </w:p>
@@ -2731,6 +3046,7 @@
         <w:rPr>
           <w:noProof/>
         </w:rPr>
+        <w:lastRenderedPageBreak/>
         <w:drawing>
           <wp:inline distT="0" distB="0" distL="0" distR="0" wp14:anchorId="52E8E201" wp14:editId="4B332C1C">
             <wp:extent cx="3467100" cy="1428750"/>
@@ -2747,7 +3063,7 @@
                     <pic:cNvPicPr/>
                   </pic:nvPicPr>
                   <pic:blipFill>
-                    <a:blip r:embed="rId10"/>
+                    <a:blip r:embed="rId11"/>
                     <a:stretch>
                       <a:fillRect/>
                     </a:stretch>
@@ -2780,14 +3096,27 @@
       <w:r>
         <w:t xml:space="preserve">Figura </w:t>
       </w:r>
-      <w:fldSimple w:instr=" SEQ Figura \* ARABIC ">
-        <w:r>
-          <w:rPr>
-            <w:noProof/>
-          </w:rPr>
-          <w:t>3</w:t>
-        </w:r>
-      </w:fldSimple>
+      <w:r>
+        <w:fldChar w:fldCharType="begin"/>
+      </w:r>
+      <w:r>
+        <w:instrText xml:space="preserve"> SEQ Figura \* ARABIC </w:instrText>
+      </w:r>
+      <w:r>
+        <w:fldChar w:fldCharType="separate"/>
+      </w:r>
+      <w:r>
+        <w:rPr>
+          <w:noProof/>
+        </w:rPr>
+        <w:t>4</w:t>
+      </w:r>
+      <w:r>
+        <w:rPr>
+          <w:noProof/>
+        </w:rPr>
+        <w:fldChar w:fldCharType="end"/>
+      </w:r>
       <w:r>
         <w:t xml:space="preserve"> Criação das Branches</w:t>
       </w:r>
@@ -3114,53 +3443,53 @@
           <w:sz w:val="24"/>
           <w:szCs w:val="24"/>
         </w:rPr>
+        <w:t xml:space="preserve">Conteúdo Abordado: </w:t>
+      </w:r>
+    </w:p>
+    <w:p>
+      <w:pPr>
+        <w:widowControl/>
+        <w:tabs>
+          <w:tab w:val="left" w:pos="567"/>
+        </w:tabs>
+        <w:spacing w:after="200" w:line="360" w:lineRule="auto"/>
+        <w:ind w:left="1425"/>
+        <w:rPr>
+          <w:rFonts w:ascii="Arial" w:eastAsia="Arial" w:hAnsi="Arial" w:cs="Arial"/>
+          <w:sz w:val="24"/>
+          <w:szCs w:val="24"/>
+        </w:rPr>
+      </w:pPr>
+      <w:r>
+        <w:rPr>
+          <w:rFonts w:ascii="Arial" w:eastAsia="Arial" w:hAnsi="Arial" w:cs="Arial"/>
+          <w:sz w:val="24"/>
+          <w:szCs w:val="24"/>
+        </w:rPr>
+        <w:t>1. Interface e Recursos: Apresentação e navegação no MySQL Workbench</w:t>
+      </w:r>
+    </w:p>
+    <w:p>
+      <w:pPr>
+        <w:widowControl/>
+        <w:tabs>
+          <w:tab w:val="left" w:pos="567"/>
+        </w:tabs>
+        <w:spacing w:after="200" w:line="360" w:lineRule="auto"/>
+        <w:ind w:left="1425"/>
+        <w:rPr>
+          <w:rFonts w:ascii="Arial" w:eastAsia="Arial" w:hAnsi="Arial" w:cs="Arial"/>
+          <w:sz w:val="24"/>
+          <w:szCs w:val="24"/>
+        </w:rPr>
+      </w:pPr>
+      <w:r>
+        <w:rPr>
+          <w:rFonts w:ascii="Arial" w:eastAsia="Arial" w:hAnsi="Arial" w:cs="Arial"/>
+          <w:sz w:val="24"/>
+          <w:szCs w:val="24"/>
+        </w:rPr>
         <w:lastRenderedPageBreak/>
-        <w:t xml:space="preserve">Conteúdo Abordado: </w:t>
-      </w:r>
-    </w:p>
-    <w:p>
-      <w:pPr>
-        <w:widowControl/>
-        <w:tabs>
-          <w:tab w:val="left" w:pos="567"/>
-        </w:tabs>
-        <w:spacing w:after="200" w:line="360" w:lineRule="auto"/>
-        <w:ind w:left="1425"/>
-        <w:rPr>
-          <w:rFonts w:ascii="Arial" w:eastAsia="Arial" w:hAnsi="Arial" w:cs="Arial"/>
-          <w:sz w:val="24"/>
-          <w:szCs w:val="24"/>
-        </w:rPr>
-      </w:pPr>
-      <w:r>
-        <w:rPr>
-          <w:rFonts w:ascii="Arial" w:eastAsia="Arial" w:hAnsi="Arial" w:cs="Arial"/>
-          <w:sz w:val="24"/>
-          <w:szCs w:val="24"/>
-        </w:rPr>
-        <w:t>1. Interface e Recursos: Apresentação e navegação no MySQL Workbench</w:t>
-      </w:r>
-    </w:p>
-    <w:p>
-      <w:pPr>
-        <w:widowControl/>
-        <w:tabs>
-          <w:tab w:val="left" w:pos="567"/>
-        </w:tabs>
-        <w:spacing w:after="200" w:line="360" w:lineRule="auto"/>
-        <w:ind w:left="1425"/>
-        <w:rPr>
-          <w:rFonts w:ascii="Arial" w:eastAsia="Arial" w:hAnsi="Arial" w:cs="Arial"/>
-          <w:sz w:val="24"/>
-          <w:szCs w:val="24"/>
-        </w:rPr>
-      </w:pPr>
-      <w:r>
-        <w:rPr>
-          <w:rFonts w:ascii="Arial" w:eastAsia="Arial" w:hAnsi="Arial" w:cs="Arial"/>
-          <w:sz w:val="24"/>
-          <w:szCs w:val="24"/>
-        </w:rPr>
         <w:t>2. Modelagem de Dados: Conceitos e criação do Diagrama Entidade-Relacionamento (DER)</w:t>
       </w:r>
     </w:p>
@@ -3195,7 +3524,7 @@
                     <pic:cNvPicPr/>
                   </pic:nvPicPr>
                   <pic:blipFill>
-                    <a:blip r:embed="rId11">
+                    <a:blip r:embed="rId12">
                       <a:extLst>
                         <a:ext uri="{28A0092B-C50C-407E-A947-70E740481C1C}">
                           <a14:useLocalDpi xmlns:a14="http://schemas.microsoft.com/office/drawing/2010/main" val="0"/>
@@ -3229,14 +3558,27 @@
       <w:r>
         <w:t xml:space="preserve">Figura </w:t>
       </w:r>
-      <w:fldSimple w:instr=" SEQ Figura \* ARABIC ">
-        <w:r>
-          <w:rPr>
-            <w:noProof/>
-          </w:rPr>
-          <w:t>4</w:t>
-        </w:r>
-      </w:fldSimple>
+      <w:r>
+        <w:fldChar w:fldCharType="begin"/>
+      </w:r>
+      <w:r>
+        <w:instrText xml:space="preserve"> SEQ Figura \* ARABIC </w:instrText>
+      </w:r>
+      <w:r>
+        <w:fldChar w:fldCharType="separate"/>
+      </w:r>
+      <w:r>
+        <w:rPr>
+          <w:noProof/>
+        </w:rPr>
+        <w:t>5</w:t>
+      </w:r>
+      <w:r>
+        <w:rPr>
+          <w:noProof/>
+        </w:rPr>
+        <w:fldChar w:fldCharType="end"/>
+      </w:r>
       <w:r>
         <w:t xml:space="preserve"> Diagrama Entidade-Relacionamento (DER)</w:t>
       </w:r>
@@ -3261,9 +3603,69 @@
           <w:sz w:val="24"/>
           <w:szCs w:val="24"/>
         </w:rPr>
+        <w:t>3. Estruturação de Tabelas: Definição de atributos, Chaves Primárias (PK) e Chaves Estrangeiras (FK)</w:t>
+      </w:r>
+    </w:p>
+    <w:p>
+      <w:pPr>
+        <w:widowControl/>
+        <w:tabs>
+          <w:tab w:val="left" w:pos="567"/>
+        </w:tabs>
+        <w:spacing w:after="200" w:line="360" w:lineRule="auto"/>
+        <w:ind w:left="1425"/>
+        <w:rPr>
+          <w:rFonts w:ascii="Arial" w:eastAsia="Arial" w:hAnsi="Arial" w:cs="Arial"/>
+          <w:sz w:val="24"/>
+          <w:szCs w:val="24"/>
+        </w:rPr>
+      </w:pPr>
+      <w:r>
+        <w:rPr>
+          <w:rFonts w:ascii="Arial" w:eastAsia="Arial" w:hAnsi="Arial" w:cs="Arial"/>
+          <w:sz w:val="24"/>
+          <w:szCs w:val="24"/>
+        </w:rPr>
+        <w:t>4. Scripts SQL: Execução de comandos DDL para criação e alteração do banco de dados</w:t>
+      </w:r>
+    </w:p>
+    <w:p>
+      <w:pPr>
+        <w:widowControl/>
+        <w:tabs>
+          <w:tab w:val="left" w:pos="567"/>
+        </w:tabs>
+        <w:spacing w:after="200" w:line="360" w:lineRule="auto"/>
+        <w:ind w:left="1425"/>
+        <w:rPr>
+          <w:rFonts w:ascii="Arial" w:eastAsia="Arial" w:hAnsi="Arial" w:cs="Arial"/>
+          <w:sz w:val="24"/>
+          <w:szCs w:val="24"/>
+        </w:rPr>
+      </w:pPr>
+      <w:r>
+        <w:rPr>
+          <w:rFonts w:ascii="Arial" w:eastAsia="Arial" w:hAnsi="Arial" w:cs="Arial"/>
+          <w:sz w:val="24"/>
+          <w:szCs w:val="24"/>
+        </w:rPr>
         <w:lastRenderedPageBreak/>
-        <w:t>3. Estruturação de Tabelas: Definição de atributos, Chaves Primárias (PK) e Chaves Estrangeiras (FK)</w:t>
-      </w:r>
+        <w:t>Atividades Realizadas: Aula prática focada na criação do banco de dados, onde foram definidos os atributos, as chaves primárias e estrangeiras. Foram exploradas as principais funções do MySQL Workbench para a construção do diagrama DER e a geração do script SQL correspondente.</w:t>
+      </w:r>
+    </w:p>
+    <w:p>
+      <w:pPr>
+        <w:widowControl/>
+        <w:tabs>
+          <w:tab w:val="left" w:pos="567"/>
+        </w:tabs>
+        <w:spacing w:after="200" w:line="360" w:lineRule="auto"/>
+        <w:rPr>
+          <w:rFonts w:ascii="Arial" w:eastAsia="Arial" w:hAnsi="Arial" w:cs="Arial"/>
+          <w:sz w:val="24"/>
+          <w:szCs w:val="24"/>
+        </w:rPr>
+      </w:pPr>
     </w:p>
     <w:p>
       <w:pPr>
@@ -3285,7 +3687,7 @@
           <w:sz w:val="24"/>
           <w:szCs w:val="24"/>
         </w:rPr>
-        <w:t>4. Scripts SQL: Execução de comandos DDL para criação e alteração do banco de dados</w:t>
+        <w:t>AULA 5 - CRIAÇÃO DA CLASSE CLIENTE E INTEGRAÇÃO COM O BANCO DE DADOS</w:t>
       </w:r>
     </w:p>
     <w:p>
@@ -3308,22 +3710,8 @@
           <w:sz w:val="24"/>
           <w:szCs w:val="24"/>
         </w:rPr>
-        <w:t>Atividades Realizadas: Aula prática focada na criação do banco de dados, onde foram definidos os atributos, as chaves primárias e estrangeiras. Foram exploradas as principais funções do MySQL Workbench para a construção do diagrama DER e a geração do script SQL correspondente.</w:t>
-      </w:r>
-    </w:p>
-    <w:p>
-      <w:pPr>
-        <w:widowControl/>
-        <w:tabs>
-          <w:tab w:val="left" w:pos="567"/>
-        </w:tabs>
-        <w:spacing w:after="200" w:line="360" w:lineRule="auto"/>
-        <w:rPr>
-          <w:rFonts w:ascii="Arial" w:eastAsia="Arial" w:hAnsi="Arial" w:cs="Arial"/>
-          <w:sz w:val="24"/>
-          <w:szCs w:val="24"/>
-        </w:rPr>
-      </w:pPr>
+        <w:t>Data: 17/08/2026</w:t>
+      </w:r>
     </w:p>
     <w:p>
       <w:pPr>
@@ -3345,8 +3733,38 @@
           <w:sz w:val="24"/>
           <w:szCs w:val="24"/>
         </w:rPr>
-        <w:t>AULA 5 - CRIAÇÃO DA CLASSE CLIENTE E INTEGRAÇÃO COM O BANCO DE DADOS</w:t>
-      </w:r>
+        <w:t xml:space="preserve">Tema: Criação </w:t>
+      </w:r>
+      <w:proofErr w:type="spellStart"/>
+      <w:proofErr w:type="gramStart"/>
+      <w:r>
+        <w:rPr>
+          <w:rFonts w:ascii="Arial" w:eastAsia="Arial" w:hAnsi="Arial" w:cs="Arial"/>
+          <w:sz w:val="24"/>
+          <w:szCs w:val="24"/>
+        </w:rPr>
+        <w:t>Cliente.java,ClienteRepository</w:t>
+      </w:r>
+      <w:proofErr w:type="spellEnd"/>
+      <w:proofErr w:type="gramEnd"/>
+      <w:r>
+        <w:rPr>
+          <w:rFonts w:ascii="Arial" w:eastAsia="Arial" w:hAnsi="Arial" w:cs="Arial"/>
+          <w:sz w:val="24"/>
+          <w:szCs w:val="24"/>
+        </w:rPr>
+        <w:t xml:space="preserve"> e </w:t>
+      </w:r>
+      <w:proofErr w:type="spellStart"/>
+      <w:r>
+        <w:rPr>
+          <w:rFonts w:ascii="Arial" w:eastAsia="Arial" w:hAnsi="Arial" w:cs="Arial"/>
+          <w:sz w:val="24"/>
+          <w:szCs w:val="24"/>
+        </w:rPr>
+        <w:t>ClienteController</w:t>
+      </w:r>
+      <w:proofErr w:type="spellEnd"/>
     </w:p>
     <w:p>
       <w:pPr>
@@ -3368,7 +3786,7 @@
           <w:sz w:val="24"/>
           <w:szCs w:val="24"/>
         </w:rPr>
-        <w:t>Data: 17/08/2026</w:t>
+        <w:t>Objetivo:</w:t>
       </w:r>
     </w:p>
     <w:p>
@@ -3391,25 +3809,76 @@
           <w:sz w:val="24"/>
           <w:szCs w:val="24"/>
         </w:rPr>
-        <w:t xml:space="preserve">Tema: Criação </w:t>
-      </w:r>
-      <w:proofErr w:type="gramStart"/>
-      <w:r>
-        <w:rPr>
-          <w:rFonts w:ascii="Arial" w:eastAsia="Arial" w:hAnsi="Arial" w:cs="Arial"/>
-          <w:sz w:val="24"/>
-          <w:szCs w:val="24"/>
-        </w:rPr>
-        <w:t>Cliente.java,ClienteRepository</w:t>
-      </w:r>
-      <w:proofErr w:type="gramEnd"/>
-      <w:r>
-        <w:rPr>
-          <w:rFonts w:ascii="Arial" w:eastAsia="Arial" w:hAnsi="Arial" w:cs="Arial"/>
-          <w:sz w:val="24"/>
-          <w:szCs w:val="24"/>
-        </w:rPr>
-        <w:t xml:space="preserve"> e </w:t>
+        <w:t>Dar continuidade ao desenvolvimento do projeto, criando a estrutura responsável pelo cadastro e gerenciamento dos clientes, além de compreender a integração entre Model, Repository e Controller.</w:t>
+      </w:r>
+    </w:p>
+    <w:p>
+      <w:pPr>
+        <w:widowControl/>
+        <w:tabs>
+          <w:tab w:val="left" w:pos="567"/>
+        </w:tabs>
+        <w:spacing w:after="200" w:line="360" w:lineRule="auto"/>
+        <w:ind w:left="1425"/>
+        <w:rPr>
+          <w:rFonts w:ascii="Arial" w:eastAsia="Arial" w:hAnsi="Arial" w:cs="Arial"/>
+          <w:sz w:val="24"/>
+          <w:szCs w:val="24"/>
+        </w:rPr>
+      </w:pPr>
+      <w:r>
+        <w:rPr>
+          <w:rFonts w:ascii="Arial" w:eastAsia="Arial" w:hAnsi="Arial" w:cs="Arial"/>
+          <w:sz w:val="24"/>
+          <w:szCs w:val="24"/>
+        </w:rPr>
+        <w:t>Conteúdo Abordado:</w:t>
+      </w:r>
+    </w:p>
+    <w:p>
+      <w:pPr>
+        <w:widowControl/>
+        <w:tabs>
+          <w:tab w:val="left" w:pos="567"/>
+        </w:tabs>
+        <w:spacing w:after="200" w:line="360" w:lineRule="auto"/>
+        <w:ind w:left="1425"/>
+        <w:rPr>
+          <w:rFonts w:ascii="Arial" w:eastAsia="Arial" w:hAnsi="Arial" w:cs="Arial"/>
+          <w:sz w:val="24"/>
+          <w:szCs w:val="24"/>
+        </w:rPr>
+      </w:pPr>
+      <w:r>
+        <w:rPr>
+          <w:rFonts w:ascii="Arial" w:eastAsia="Arial" w:hAnsi="Arial" w:cs="Arial"/>
+          <w:sz w:val="24"/>
+          <w:szCs w:val="24"/>
+        </w:rPr>
+        <w:t>Classe Cliente: criação da classe responsável por representar os dados dos clientes, utilizando a anotação @Entity para realizar o mapeamento com o banco de dados.</w:t>
+      </w:r>
+    </w:p>
+    <w:p>
+      <w:pPr>
+        <w:widowControl/>
+        <w:tabs>
+          <w:tab w:val="left" w:pos="567"/>
+        </w:tabs>
+        <w:spacing w:after="200" w:line="360" w:lineRule="auto"/>
+        <w:ind w:left="1425"/>
+        <w:rPr>
+          <w:rFonts w:ascii="Arial" w:eastAsia="Arial" w:hAnsi="Arial" w:cs="Arial"/>
+          <w:sz w:val="24"/>
+          <w:szCs w:val="24"/>
+        </w:rPr>
+      </w:pPr>
+      <w:r>
+        <w:rPr>
+          <w:rFonts w:ascii="Arial" w:eastAsia="Arial" w:hAnsi="Arial" w:cs="Arial"/>
+          <w:sz w:val="24"/>
+          <w:szCs w:val="24"/>
+        </w:rPr>
+        <w:t xml:space="preserve">Atributos e Chaves: definição dos atributos id, nome, </w:t>
       </w:r>
       <w:proofErr w:type="spellStart"/>
       <w:r>
@@ -3418,9 +3887,120 @@
           <w:sz w:val="24"/>
           <w:szCs w:val="24"/>
         </w:rPr>
+        <w:t>email</w:t>
+      </w:r>
+      <w:proofErr w:type="spellEnd"/>
+      <w:r>
+        <w:rPr>
+          <w:rFonts w:ascii="Arial" w:eastAsia="Arial" w:hAnsi="Arial" w:cs="Arial"/>
+          <w:sz w:val="24"/>
+          <w:szCs w:val="24"/>
+        </w:rPr>
+        <w:t xml:space="preserve"> e telefone, utilizando @Id e @GeneratedValue para configuração da chave primária.</w:t>
+      </w:r>
+    </w:p>
+    <w:p>
+      <w:pPr>
+        <w:widowControl/>
+        <w:tabs>
+          <w:tab w:val="left" w:pos="567"/>
+        </w:tabs>
+        <w:spacing w:after="200" w:line="360" w:lineRule="auto"/>
+        <w:ind w:left="1425"/>
+        <w:rPr>
+          <w:rFonts w:ascii="Arial" w:eastAsia="Arial" w:hAnsi="Arial" w:cs="Arial"/>
+          <w:sz w:val="24"/>
+          <w:szCs w:val="24"/>
+        </w:rPr>
+      </w:pPr>
+      <w:proofErr w:type="spellStart"/>
+      <w:r>
+        <w:rPr>
+          <w:rFonts w:ascii="Arial" w:eastAsia="Arial" w:hAnsi="Arial" w:cs="Arial"/>
+          <w:sz w:val="24"/>
+          <w:szCs w:val="24"/>
+        </w:rPr>
+        <w:t>ClienteRepository</w:t>
+      </w:r>
+      <w:proofErr w:type="spellEnd"/>
+      <w:r>
+        <w:rPr>
+          <w:rFonts w:ascii="Arial" w:eastAsia="Arial" w:hAnsi="Arial" w:cs="Arial"/>
+          <w:sz w:val="24"/>
+          <w:szCs w:val="24"/>
+        </w:rPr>
+        <w:t xml:space="preserve">: criação do repositório utilizando </w:t>
+      </w:r>
+      <w:proofErr w:type="spellStart"/>
+      <w:r>
+        <w:rPr>
+          <w:rFonts w:ascii="Arial" w:eastAsia="Arial" w:hAnsi="Arial" w:cs="Arial"/>
+          <w:sz w:val="24"/>
+          <w:szCs w:val="24"/>
+        </w:rPr>
+        <w:t>JpaRepository</w:t>
+      </w:r>
+      <w:proofErr w:type="spellEnd"/>
+      <w:r>
+        <w:rPr>
+          <w:rFonts w:ascii="Arial" w:eastAsia="Arial" w:hAnsi="Arial" w:cs="Arial"/>
+          <w:sz w:val="24"/>
+          <w:szCs w:val="24"/>
+        </w:rPr>
+        <w:t>, permitindo realizar operações como salvar, consultar e excluir clientes no banco de dados.</w:t>
+      </w:r>
+    </w:p>
+    <w:p>
+      <w:pPr>
+        <w:widowControl/>
+        <w:tabs>
+          <w:tab w:val="left" w:pos="567"/>
+        </w:tabs>
+        <w:spacing w:after="200" w:line="360" w:lineRule="auto"/>
+        <w:ind w:left="1425"/>
+        <w:rPr>
+          <w:rFonts w:ascii="Arial" w:eastAsia="Arial" w:hAnsi="Arial" w:cs="Arial"/>
+          <w:sz w:val="24"/>
+          <w:szCs w:val="24"/>
+        </w:rPr>
+      </w:pPr>
+      <w:proofErr w:type="spellStart"/>
+      <w:r>
+        <w:rPr>
+          <w:rFonts w:ascii="Arial" w:eastAsia="Arial" w:hAnsi="Arial" w:cs="Arial"/>
+          <w:sz w:val="24"/>
+          <w:szCs w:val="24"/>
+        </w:rPr>
+        <w:lastRenderedPageBreak/>
         <w:t>ClienteController</w:t>
       </w:r>
       <w:proofErr w:type="spellEnd"/>
+      <w:r>
+        <w:rPr>
+          <w:rFonts w:ascii="Arial" w:eastAsia="Arial" w:hAnsi="Arial" w:cs="Arial"/>
+          <w:sz w:val="24"/>
+          <w:szCs w:val="24"/>
+        </w:rPr>
+        <w:t xml:space="preserve">: atualização do </w:t>
+      </w:r>
+      <w:proofErr w:type="spellStart"/>
+      <w:r>
+        <w:rPr>
+          <w:rFonts w:ascii="Arial" w:eastAsia="Arial" w:hAnsi="Arial" w:cs="Arial"/>
+          <w:sz w:val="24"/>
+          <w:szCs w:val="24"/>
+        </w:rPr>
+        <w:t>Controller</w:t>
+      </w:r>
+      <w:proofErr w:type="spellEnd"/>
+      <w:r>
+        <w:rPr>
+          <w:rFonts w:ascii="Arial" w:eastAsia="Arial" w:hAnsi="Arial" w:cs="Arial"/>
+          <w:sz w:val="24"/>
+          <w:szCs w:val="24"/>
+        </w:rPr>
+        <w:t xml:space="preserve"> para receber requisições da aplicação e realizar operações de cadastro, consulta, exclusão e paginação dos clientes.</w:t>
+      </w:r>
     </w:p>
     <w:p>
       <w:pPr>
@@ -3442,6 +4022,317 @@
           <w:sz w:val="24"/>
           <w:szCs w:val="24"/>
         </w:rPr>
+        <w:t>Integração entre as camadas: compreensão do funcionamento conjunto entre Model, Repository e Controller, permitindo que os dados sejam enviados pela interface, processados pela aplicação e armazenados no banco de dados.</w:t>
+      </w:r>
+    </w:p>
+    <w:p>
+      <w:pPr>
+        <w:widowControl/>
+        <w:tabs>
+          <w:tab w:val="left" w:pos="567"/>
+        </w:tabs>
+        <w:spacing w:after="200" w:line="360" w:lineRule="auto"/>
+        <w:ind w:left="1425"/>
+        <w:rPr>
+          <w:rFonts w:ascii="Arial" w:eastAsia="Arial" w:hAnsi="Arial" w:cs="Arial"/>
+          <w:sz w:val="24"/>
+          <w:szCs w:val="24"/>
+        </w:rPr>
+      </w:pPr>
+    </w:p>
+    <w:p>
+      <w:pPr>
+        <w:widowControl/>
+        <w:tabs>
+          <w:tab w:val="left" w:pos="567"/>
+        </w:tabs>
+        <w:spacing w:after="200" w:line="360" w:lineRule="auto"/>
+        <w:ind w:left="1425"/>
+        <w:rPr>
+          <w:rFonts w:ascii="Arial" w:eastAsia="Arial" w:hAnsi="Arial" w:cs="Arial"/>
+          <w:sz w:val="24"/>
+          <w:szCs w:val="24"/>
+        </w:rPr>
+      </w:pPr>
+      <w:r>
+        <w:rPr>
+          <w:rFonts w:ascii="Arial" w:eastAsia="Arial" w:hAnsi="Arial" w:cs="Arial"/>
+          <w:sz w:val="24"/>
+          <w:szCs w:val="24"/>
+        </w:rPr>
+        <w:t>Atividades Realizadas:</w:t>
+      </w:r>
+    </w:p>
+    <w:p>
+      <w:pPr>
+        <w:widowControl/>
+        <w:tabs>
+          <w:tab w:val="left" w:pos="567"/>
+        </w:tabs>
+        <w:spacing w:after="200" w:line="360" w:lineRule="auto"/>
+        <w:ind w:left="1425"/>
+        <w:rPr>
+          <w:rFonts w:ascii="Arial" w:eastAsia="Arial" w:hAnsi="Arial" w:cs="Arial"/>
+          <w:sz w:val="24"/>
+          <w:szCs w:val="24"/>
+        </w:rPr>
+      </w:pPr>
+      <w:r>
+        <w:rPr>
+          <w:rFonts w:ascii="Arial" w:eastAsia="Arial" w:hAnsi="Arial" w:cs="Arial"/>
+          <w:sz w:val="24"/>
+          <w:szCs w:val="24"/>
+        </w:rPr>
+        <w:t xml:space="preserve">Foi realizada uma reunião com o docente para organizar as ideias e acompanhar o andamento do projeto. Durante a aula, foram esclarecidas dúvidas e recebidas orientações sobre as próximas etapas do desenvolvimento. Em seguida, a equipe iniciou a implementação da funcionalidade de clientes, realizando atualizações no arquivo </w:t>
+      </w:r>
+      <w:proofErr w:type="spellStart"/>
+      <w:r>
+        <w:rPr>
+          <w:rFonts w:ascii="Arial" w:eastAsia="Arial" w:hAnsi="Arial" w:cs="Arial"/>
+          <w:sz w:val="24"/>
+          <w:szCs w:val="24"/>
+        </w:rPr>
+        <w:t>ClienteController</w:t>
+      </w:r>
+      <w:proofErr w:type="spellEnd"/>
+      <w:r>
+        <w:rPr>
+          <w:rFonts w:ascii="Arial" w:eastAsia="Arial" w:hAnsi="Arial" w:cs="Arial"/>
+          <w:sz w:val="24"/>
+          <w:szCs w:val="24"/>
+        </w:rPr>
+        <w:t xml:space="preserve">, criando o </w:t>
+      </w:r>
+      <w:proofErr w:type="spellStart"/>
+      <w:r>
+        <w:rPr>
+          <w:rFonts w:ascii="Arial" w:eastAsia="Arial" w:hAnsi="Arial" w:cs="Arial"/>
+          <w:sz w:val="24"/>
+          <w:szCs w:val="24"/>
+        </w:rPr>
+        <w:t>ClienteRepository</w:t>
+      </w:r>
+      <w:proofErr w:type="spellEnd"/>
+      <w:r>
+        <w:rPr>
+          <w:rFonts w:ascii="Arial" w:eastAsia="Arial" w:hAnsi="Arial" w:cs="Arial"/>
+          <w:sz w:val="24"/>
+          <w:szCs w:val="24"/>
+        </w:rPr>
+        <w:t xml:space="preserve"> e desenvolvendo a classe Cliente. Também foi trabalhada a integração entre essas classes, preparando a aplicação para realizar o cadastro, consulta, paginação e exclusão de clientes.</w:t>
+      </w:r>
+    </w:p>
+    <w:p>
+      <w:pPr>
+        <w:widowControl/>
+        <w:tabs>
+          <w:tab w:val="left" w:pos="567"/>
+        </w:tabs>
+        <w:spacing w:after="200" w:line="360" w:lineRule="auto"/>
+        <w:ind w:left="1425"/>
+        <w:rPr>
+          <w:rFonts w:ascii="Arial" w:eastAsia="Arial" w:hAnsi="Arial" w:cs="Arial"/>
+          <w:sz w:val="24"/>
+          <w:szCs w:val="24"/>
+        </w:rPr>
+      </w:pPr>
+    </w:p>
+    <w:p>
+      <w:pPr>
+        <w:widowControl/>
+        <w:tabs>
+          <w:tab w:val="left" w:pos="567"/>
+        </w:tabs>
+        <w:spacing w:after="200" w:line="360" w:lineRule="auto"/>
+        <w:ind w:left="1425"/>
+        <w:rPr>
+          <w:rFonts w:ascii="Arial" w:eastAsia="Arial" w:hAnsi="Arial" w:cs="Arial"/>
+          <w:sz w:val="24"/>
+          <w:szCs w:val="24"/>
+        </w:rPr>
+      </w:pPr>
+    </w:p>
+    <w:p>
+      <w:pPr>
+        <w:widowControl/>
+        <w:tabs>
+          <w:tab w:val="left" w:pos="567"/>
+        </w:tabs>
+        <w:spacing w:after="200" w:line="360" w:lineRule="auto"/>
+        <w:ind w:left="1425"/>
+        <w:rPr>
+          <w:rFonts w:ascii="Arial" w:eastAsia="Arial" w:hAnsi="Arial" w:cs="Arial"/>
+          <w:sz w:val="24"/>
+          <w:szCs w:val="24"/>
+        </w:rPr>
+      </w:pPr>
+    </w:p>
+    <w:p>
+      <w:pPr>
+        <w:widowControl/>
+        <w:tabs>
+          <w:tab w:val="left" w:pos="567"/>
+        </w:tabs>
+        <w:spacing w:after="200" w:line="360" w:lineRule="auto"/>
+        <w:ind w:left="1425"/>
+        <w:rPr>
+          <w:rFonts w:ascii="Arial" w:eastAsia="Arial" w:hAnsi="Arial" w:cs="Arial"/>
+          <w:sz w:val="24"/>
+          <w:szCs w:val="24"/>
+        </w:rPr>
+      </w:pPr>
+    </w:p>
+    <w:p>
+      <w:pPr>
+        <w:widowControl/>
+        <w:tabs>
+          <w:tab w:val="left" w:pos="567"/>
+        </w:tabs>
+        <w:spacing w:after="200" w:line="360" w:lineRule="auto"/>
+        <w:ind w:left="1425"/>
+        <w:rPr>
+          <w:rFonts w:ascii="Arial" w:eastAsia="Arial" w:hAnsi="Arial" w:cs="Arial"/>
+          <w:sz w:val="24"/>
+          <w:szCs w:val="24"/>
+        </w:rPr>
+      </w:pPr>
+    </w:p>
+    <w:p>
+      <w:pPr>
+        <w:widowControl/>
+        <w:tabs>
+          <w:tab w:val="left" w:pos="567"/>
+        </w:tabs>
+        <w:spacing w:after="200" w:line="360" w:lineRule="auto"/>
+        <w:ind w:left="1425"/>
+        <w:rPr>
+          <w:rFonts w:ascii="Arial" w:eastAsia="Arial" w:hAnsi="Arial" w:cs="Arial"/>
+          <w:sz w:val="24"/>
+          <w:szCs w:val="24"/>
+        </w:rPr>
+      </w:pPr>
+    </w:p>
+    <w:p>
+      <w:pPr>
+        <w:widowControl/>
+        <w:tabs>
+          <w:tab w:val="left" w:pos="567"/>
+        </w:tabs>
+        <w:spacing w:after="200" w:line="360" w:lineRule="auto"/>
+        <w:ind w:left="1425"/>
+        <w:rPr>
+          <w:rFonts w:ascii="Arial" w:eastAsia="Arial" w:hAnsi="Arial" w:cs="Arial"/>
+          <w:sz w:val="24"/>
+          <w:szCs w:val="24"/>
+        </w:rPr>
+      </w:pPr>
+    </w:p>
+    <w:p>
+      <w:pPr>
+        <w:widowControl/>
+        <w:tabs>
+          <w:tab w:val="left" w:pos="567"/>
+        </w:tabs>
+        <w:spacing w:after="200" w:line="360" w:lineRule="auto"/>
+        <w:ind w:left="1425"/>
+        <w:rPr>
+          <w:rFonts w:ascii="Arial" w:eastAsia="Arial" w:hAnsi="Arial" w:cs="Arial"/>
+          <w:sz w:val="24"/>
+          <w:szCs w:val="24"/>
+        </w:rPr>
+      </w:pPr>
+      <w:r>
+        <w:rPr>
+          <w:rFonts w:ascii="Arial" w:eastAsia="Arial" w:hAnsi="Arial" w:cs="Arial"/>
+          <w:sz w:val="24"/>
+          <w:szCs w:val="24"/>
+        </w:rPr>
+        <w:lastRenderedPageBreak/>
+        <w:t>AULA 6 - DESENVOLVIMENTO DO BACKEND E INTEGRAÇÃO DAS ENTIDADES COM O BANCO DE DADOS</w:t>
+      </w:r>
+    </w:p>
+    <w:p>
+      <w:pPr>
+        <w:widowControl/>
+        <w:tabs>
+          <w:tab w:val="left" w:pos="567"/>
+        </w:tabs>
+        <w:spacing w:after="200" w:line="360" w:lineRule="auto"/>
+        <w:ind w:left="1425"/>
+        <w:rPr>
+          <w:rFonts w:ascii="Arial" w:eastAsia="Arial" w:hAnsi="Arial" w:cs="Arial"/>
+          <w:sz w:val="24"/>
+          <w:szCs w:val="24"/>
+        </w:rPr>
+      </w:pPr>
+      <w:r>
+        <w:rPr>
+          <w:rFonts w:ascii="Arial" w:eastAsia="Arial" w:hAnsi="Arial" w:cs="Arial"/>
+          <w:sz w:val="24"/>
+          <w:szCs w:val="24"/>
+        </w:rPr>
+        <w:t>Data: 18/08/2026</w:t>
+      </w:r>
+    </w:p>
+    <w:p>
+      <w:pPr>
+        <w:widowControl/>
+        <w:tabs>
+          <w:tab w:val="left" w:pos="567"/>
+        </w:tabs>
+        <w:spacing w:after="200" w:line="360" w:lineRule="auto"/>
+        <w:ind w:left="1425"/>
+        <w:rPr>
+          <w:rFonts w:ascii="Arial" w:eastAsia="Arial" w:hAnsi="Arial" w:cs="Arial"/>
+          <w:sz w:val="24"/>
+          <w:szCs w:val="24"/>
+        </w:rPr>
+      </w:pPr>
+      <w:r>
+        <w:rPr>
+          <w:rFonts w:ascii="Arial" w:eastAsia="Arial" w:hAnsi="Arial" w:cs="Arial"/>
+          <w:sz w:val="24"/>
+          <w:szCs w:val="24"/>
+        </w:rPr>
+        <w:t>Tema: Desenvolvimento das classes Pessoa,</w:t>
+      </w:r>
+      <w:r>
+        <w:rPr>
+          <w:rFonts w:ascii="Arial" w:eastAsia="Arial" w:hAnsi="Arial" w:cs="Arial"/>
+          <w:sz w:val="24"/>
+          <w:szCs w:val="24"/>
+        </w:rPr>
+        <w:t xml:space="preserve"> </w:t>
+      </w:r>
+      <w:r>
+        <w:rPr>
+          <w:rFonts w:ascii="Arial" w:eastAsia="Arial" w:hAnsi="Arial" w:cs="Arial"/>
+          <w:sz w:val="24"/>
+          <w:szCs w:val="24"/>
+        </w:rPr>
+        <w:t>Repository do sistema.</w:t>
+      </w:r>
+    </w:p>
+    <w:p>
+      <w:pPr>
+        <w:widowControl/>
+        <w:tabs>
+          <w:tab w:val="left" w:pos="567"/>
+        </w:tabs>
+        <w:spacing w:after="200" w:line="360" w:lineRule="auto"/>
+        <w:ind w:left="1425"/>
+        <w:rPr>
+          <w:rFonts w:ascii="Arial" w:eastAsia="Arial" w:hAnsi="Arial" w:cs="Arial"/>
+          <w:sz w:val="24"/>
+          <w:szCs w:val="24"/>
+        </w:rPr>
+      </w:pPr>
+      <w:r>
+        <w:rPr>
+          <w:rFonts w:ascii="Arial" w:eastAsia="Arial" w:hAnsi="Arial" w:cs="Arial"/>
+          <w:sz w:val="24"/>
+          <w:szCs w:val="24"/>
+        </w:rPr>
         <w:t>Objetivo:</w:t>
       </w:r>
     </w:p>
@@ -3465,7 +4356,33 @@
           <w:sz w:val="24"/>
           <w:szCs w:val="24"/>
         </w:rPr>
-        <w:t>Dar continuidade ao desenvolvimento do projeto, criando a estrutura responsável pelo cadastro e gerenciamento dos clientes, além de compreender a integração entre Model, Repository e Controller.</w:t>
+        <w:t xml:space="preserve">Dar continuidade ao desenvolvimento do sistema de controle para a loja de moda, implementando a estrutura do </w:t>
+      </w:r>
+      <w:proofErr w:type="spellStart"/>
+      <w:r>
+        <w:rPr>
+          <w:rFonts w:ascii="Arial" w:eastAsia="Arial" w:hAnsi="Arial" w:cs="Arial"/>
+          <w:sz w:val="24"/>
+          <w:szCs w:val="24"/>
+        </w:rPr>
+        <w:t>backend</w:t>
+      </w:r>
+      <w:proofErr w:type="spellEnd"/>
+      <w:r>
+        <w:rPr>
+          <w:rFonts w:ascii="Arial" w:eastAsia="Arial" w:hAnsi="Arial" w:cs="Arial"/>
+          <w:sz w:val="24"/>
+          <w:szCs w:val="24"/>
+        </w:rPr>
+        <w:t xml:space="preserve"> responsável pelo gerenciamento de pessoas, clientes, funcionários, fornecedores e categorias</w:t>
+      </w:r>
+      <w:r>
+        <w:rPr>
+          <w:rFonts w:ascii="Arial" w:eastAsia="Arial" w:hAnsi="Arial" w:cs="Arial"/>
+          <w:sz w:val="24"/>
+          <w:szCs w:val="24"/>
+        </w:rPr>
+        <w:t>.</w:t>
       </w:r>
     </w:p>
     <w:p>
@@ -3511,7 +4428,15 @@
           <w:sz w:val="24"/>
           <w:szCs w:val="24"/>
         </w:rPr>
-        <w:t>Classe Cliente: criação da classe responsável por representar os dados dos clientes, utilizando a anotação @Entity para realizar o mapeamento com o banco de dados.</w:t>
+        <w:t>Classe Pessoa: desenvolvimento da classe Pessoa.java, responsável por representar os dados das pessoas cadastradas no sistema e realizar o mapeamento da tabela pessoa do banco de dados</w:t>
+      </w:r>
+      <w:r>
+        <w:rPr>
+          <w:rFonts w:ascii="Arial" w:eastAsia="Arial" w:hAnsi="Arial" w:cs="Arial"/>
+          <w:sz w:val="24"/>
+          <w:szCs w:val="24"/>
+        </w:rPr>
+        <w:t>.</w:t>
       </w:r>
     </w:p>
     <w:p>
@@ -3528,14 +4453,6 @@
           <w:szCs w:val="24"/>
         </w:rPr>
       </w:pPr>
-      <w:r>
-        <w:rPr>
-          <w:rFonts w:ascii="Arial" w:eastAsia="Arial" w:hAnsi="Arial" w:cs="Arial"/>
-          <w:sz w:val="24"/>
-          <w:szCs w:val="24"/>
-        </w:rPr>
-        <w:t xml:space="preserve">Atributos e Chaves: definição dos atributos id, nome, </w:t>
-      </w:r>
       <w:proofErr w:type="spellStart"/>
       <w:r>
         <w:rPr>
@@ -3543,7 +4460,7 @@
           <w:sz w:val="24"/>
           <w:szCs w:val="24"/>
         </w:rPr>
-        <w:t>email</w:t>
+        <w:t>PessoaRepository</w:t>
       </w:r>
       <w:proofErr w:type="spellEnd"/>
       <w:r>
@@ -3552,7 +4469,43 @@
           <w:sz w:val="24"/>
           <w:szCs w:val="24"/>
         </w:rPr>
-        <w:t xml:space="preserve"> e telefone, utilizando @Id e @GeneratedValue para configuração da chave primária.</w:t>
+        <w:t xml:space="preserve">: criação e configuração do </w:t>
+      </w:r>
+      <w:proofErr w:type="spellStart"/>
+      <w:r>
+        <w:rPr>
+          <w:rFonts w:ascii="Arial" w:eastAsia="Arial" w:hAnsi="Arial" w:cs="Arial"/>
+          <w:sz w:val="24"/>
+          <w:szCs w:val="24"/>
+        </w:rPr>
+        <w:t>PessoaRepository</w:t>
+      </w:r>
+      <w:proofErr w:type="spellEnd"/>
+      <w:r>
+        <w:rPr>
+          <w:rFonts w:ascii="Arial" w:eastAsia="Arial" w:hAnsi="Arial" w:cs="Arial"/>
+          <w:sz w:val="24"/>
+          <w:szCs w:val="24"/>
+        </w:rPr>
+        <w:t xml:space="preserve">, utilizando </w:t>
+      </w:r>
+      <w:proofErr w:type="spellStart"/>
+      <w:r>
+        <w:rPr>
+          <w:rFonts w:ascii="Arial" w:eastAsia="Arial" w:hAnsi="Arial" w:cs="Arial"/>
+          <w:sz w:val="24"/>
+          <w:szCs w:val="24"/>
+        </w:rPr>
+        <w:t>JpaRepository</w:t>
+      </w:r>
+      <w:proofErr w:type="spellEnd"/>
+      <w:r>
+        <w:rPr>
+          <w:rFonts w:ascii="Arial" w:eastAsia="Arial" w:hAnsi="Arial" w:cs="Arial"/>
+          <w:sz w:val="24"/>
+          <w:szCs w:val="24"/>
+        </w:rPr>
+        <w:t>, possibilitando realizar operações de persistência, consulta, alteração e exclusão dos registros da tabela pessoa.</w:t>
       </w:r>
     </w:p>
     <w:p>
@@ -3569,6 +4522,30 @@
           <w:szCs w:val="24"/>
         </w:rPr>
       </w:pPr>
+      <w:r>
+        <w:rPr>
+          <w:rFonts w:ascii="Arial" w:eastAsia="Arial" w:hAnsi="Arial" w:cs="Arial"/>
+          <w:sz w:val="24"/>
+          <w:szCs w:val="24"/>
+        </w:rPr>
+        <w:t>Integração entre as camadas: compreensão da comunicação entre Model</w:t>
+      </w:r>
+      <w:r>
+        <w:rPr>
+          <w:rFonts w:ascii="Arial" w:eastAsia="Arial" w:hAnsi="Arial" w:cs="Arial"/>
+          <w:sz w:val="24"/>
+          <w:szCs w:val="24"/>
+        </w:rPr>
+        <w:t xml:space="preserve"> e</w:t>
+      </w:r>
+      <w:r>
+        <w:rPr>
+          <w:rFonts w:ascii="Arial" w:eastAsia="Arial" w:hAnsi="Arial" w:cs="Arial"/>
+          <w:sz w:val="24"/>
+          <w:szCs w:val="24"/>
+        </w:rPr>
+        <w:t xml:space="preserve"> Repository permitindo que as informações recebidas pela aplicação sejam processadas pelo </w:t>
+      </w:r>
       <w:proofErr w:type="spellStart"/>
       <w:r>
         <w:rPr>
@@ -3576,706 +4553,89 @@
           <w:sz w:val="24"/>
           <w:szCs w:val="24"/>
         </w:rPr>
+        <w:t>backend</w:t>
+      </w:r>
+      <w:proofErr w:type="spellEnd"/>
+      <w:r>
+        <w:rPr>
+          <w:rFonts w:ascii="Arial" w:eastAsia="Arial" w:hAnsi="Arial" w:cs="Arial"/>
+          <w:sz w:val="24"/>
+          <w:szCs w:val="24"/>
+        </w:rPr>
+        <w:t xml:space="preserve"> e posteriormente armazenadas ou consultadas no banco de dados.</w:t>
+      </w:r>
+    </w:p>
+    <w:p>
+      <w:pPr>
+        <w:widowControl/>
+        <w:tabs>
+          <w:tab w:val="left" w:pos="567"/>
+        </w:tabs>
+        <w:spacing w:after="200" w:line="360" w:lineRule="auto"/>
+        <w:ind w:left="1425"/>
+        <w:rPr>
+          <w:rFonts w:ascii="Arial" w:eastAsia="Arial" w:hAnsi="Arial" w:cs="Arial"/>
+          <w:sz w:val="24"/>
+          <w:szCs w:val="24"/>
+        </w:rPr>
+      </w:pPr>
+      <w:r>
+        <w:rPr>
+          <w:rFonts w:ascii="Arial" w:eastAsia="Arial" w:hAnsi="Arial" w:cs="Arial"/>
+          <w:sz w:val="24"/>
+          <w:szCs w:val="24"/>
+        </w:rPr>
+        <w:t>Atividades Realizadas:</w:t>
+      </w:r>
+    </w:p>
+    <w:p>
+      <w:pPr>
+        <w:widowControl/>
+        <w:tabs>
+          <w:tab w:val="left" w:pos="567"/>
+        </w:tabs>
+        <w:spacing w:after="200" w:line="360" w:lineRule="auto"/>
+        <w:ind w:left="1425"/>
+        <w:rPr>
+          <w:rFonts w:ascii="Arial" w:eastAsia="Arial" w:hAnsi="Arial" w:cs="Arial"/>
+          <w:sz w:val="24"/>
+          <w:szCs w:val="24"/>
+        </w:rPr>
+      </w:pPr>
+      <w:r>
+        <w:rPr>
+          <w:rFonts w:ascii="Arial" w:eastAsia="Arial" w:hAnsi="Arial" w:cs="Arial"/>
+          <w:sz w:val="24"/>
+          <w:szCs w:val="24"/>
+        </w:rPr>
+        <w:t xml:space="preserve">Durante a aula, foi dada continuidade ao desenvolvimento do </w:t>
+      </w:r>
+      <w:proofErr w:type="spellStart"/>
+      <w:r>
+        <w:rPr>
+          <w:rFonts w:ascii="Arial" w:eastAsia="Arial" w:hAnsi="Arial" w:cs="Arial"/>
+          <w:sz w:val="24"/>
+          <w:szCs w:val="24"/>
+        </w:rPr>
+        <w:t>backend</w:t>
+      </w:r>
+      <w:proofErr w:type="spellEnd"/>
+      <w:r>
+        <w:rPr>
+          <w:rFonts w:ascii="Arial" w:eastAsia="Arial" w:hAnsi="Arial" w:cs="Arial"/>
+          <w:sz w:val="24"/>
+          <w:szCs w:val="24"/>
+        </w:rPr>
+        <w:t xml:space="preserve"> do sistema da loja de moda. Inicialmente, foi realizada a implementação e configuração da classe Pessoa, responsável pelo mapeamento da tabela pessoa existente no banco de dados. Foram configurados os atributos da entidade e suas respectivas anotações do </w:t>
+      </w:r>
+      <w:r>
+        <w:rPr>
+          <w:rFonts w:ascii="Arial" w:eastAsia="Arial" w:hAnsi="Arial" w:cs="Arial"/>
+          <w:sz w:val="24"/>
+          <w:szCs w:val="24"/>
+        </w:rPr>
         <w:lastRenderedPageBreak/>
-        <w:t>ClienteRepository</w:t>
-      </w:r>
-      <w:proofErr w:type="spellEnd"/>
-      <w:r>
-        <w:rPr>
-          <w:rFonts w:ascii="Arial" w:eastAsia="Arial" w:hAnsi="Arial" w:cs="Arial"/>
-          <w:sz w:val="24"/>
-          <w:szCs w:val="24"/>
-        </w:rPr>
-        <w:t xml:space="preserve">: criação do repositório utilizando </w:t>
-      </w:r>
-      <w:proofErr w:type="spellStart"/>
-      <w:r>
-        <w:rPr>
-          <w:rFonts w:ascii="Arial" w:eastAsia="Arial" w:hAnsi="Arial" w:cs="Arial"/>
-          <w:sz w:val="24"/>
-          <w:szCs w:val="24"/>
-        </w:rPr>
-        <w:t>JpaRepository</w:t>
-      </w:r>
-      <w:proofErr w:type="spellEnd"/>
-      <w:r>
-        <w:rPr>
-          <w:rFonts w:ascii="Arial" w:eastAsia="Arial" w:hAnsi="Arial" w:cs="Arial"/>
-          <w:sz w:val="24"/>
-          <w:szCs w:val="24"/>
-        </w:rPr>
-        <w:t>, permitindo realizar operações como salvar, consultar e excluir clientes no banco de dados.</w:t>
-      </w:r>
-    </w:p>
-    <w:p>
-      <w:pPr>
-        <w:widowControl/>
-        <w:tabs>
-          <w:tab w:val="left" w:pos="567"/>
-        </w:tabs>
-        <w:spacing w:after="200" w:line="360" w:lineRule="auto"/>
-        <w:ind w:left="1425"/>
-        <w:rPr>
-          <w:rFonts w:ascii="Arial" w:eastAsia="Arial" w:hAnsi="Arial" w:cs="Arial"/>
-          <w:sz w:val="24"/>
-          <w:szCs w:val="24"/>
-        </w:rPr>
-      </w:pPr>
-      <w:proofErr w:type="spellStart"/>
-      <w:r>
-        <w:rPr>
-          <w:rFonts w:ascii="Arial" w:eastAsia="Arial" w:hAnsi="Arial" w:cs="Arial"/>
-          <w:sz w:val="24"/>
-          <w:szCs w:val="24"/>
-        </w:rPr>
-        <w:t>ClienteController</w:t>
-      </w:r>
-      <w:proofErr w:type="spellEnd"/>
-      <w:r>
-        <w:rPr>
-          <w:rFonts w:ascii="Arial" w:eastAsia="Arial" w:hAnsi="Arial" w:cs="Arial"/>
-          <w:sz w:val="24"/>
-          <w:szCs w:val="24"/>
-        </w:rPr>
-        <w:t xml:space="preserve">: atualização do </w:t>
-      </w:r>
-      <w:proofErr w:type="spellStart"/>
-      <w:r>
-        <w:rPr>
-          <w:rFonts w:ascii="Arial" w:eastAsia="Arial" w:hAnsi="Arial" w:cs="Arial"/>
-          <w:sz w:val="24"/>
-          <w:szCs w:val="24"/>
-        </w:rPr>
-        <w:t>Controller</w:t>
-      </w:r>
-      <w:proofErr w:type="spellEnd"/>
-      <w:r>
-        <w:rPr>
-          <w:rFonts w:ascii="Arial" w:eastAsia="Arial" w:hAnsi="Arial" w:cs="Arial"/>
-          <w:sz w:val="24"/>
-          <w:szCs w:val="24"/>
-        </w:rPr>
-        <w:t xml:space="preserve"> para receber requisições da aplicação e realizar operações de cadastro, consulta, exclusão e paginação dos clientes.</w:t>
-      </w:r>
-    </w:p>
-    <w:p>
-      <w:pPr>
-        <w:widowControl/>
-        <w:tabs>
-          <w:tab w:val="left" w:pos="567"/>
-        </w:tabs>
-        <w:spacing w:after="200" w:line="360" w:lineRule="auto"/>
-        <w:ind w:left="1425"/>
-        <w:rPr>
-          <w:rFonts w:ascii="Arial" w:eastAsia="Arial" w:hAnsi="Arial" w:cs="Arial"/>
-          <w:sz w:val="24"/>
-          <w:szCs w:val="24"/>
-        </w:rPr>
-      </w:pPr>
-      <w:r>
-        <w:rPr>
-          <w:rFonts w:ascii="Arial" w:eastAsia="Arial" w:hAnsi="Arial" w:cs="Arial"/>
-          <w:sz w:val="24"/>
-          <w:szCs w:val="24"/>
-        </w:rPr>
-        <w:t>Integração entre as camadas: compreensão do funcionamento conjunto entre Model, Repository e Controller, permitindo que os dados sejam enviados pela interface, processados pela aplicação e armazenados no banco de dados.</w:t>
-      </w:r>
-    </w:p>
-    <w:p>
-      <w:pPr>
-        <w:widowControl/>
-        <w:tabs>
-          <w:tab w:val="left" w:pos="567"/>
-        </w:tabs>
-        <w:spacing w:after="200" w:line="360" w:lineRule="auto"/>
-        <w:ind w:left="1425"/>
-        <w:rPr>
-          <w:rFonts w:ascii="Arial" w:eastAsia="Arial" w:hAnsi="Arial" w:cs="Arial"/>
-          <w:sz w:val="24"/>
-          <w:szCs w:val="24"/>
-        </w:rPr>
-      </w:pPr>
-    </w:p>
-    <w:p>
-      <w:pPr>
-        <w:widowControl/>
-        <w:tabs>
-          <w:tab w:val="left" w:pos="567"/>
-        </w:tabs>
-        <w:spacing w:after="200" w:line="360" w:lineRule="auto"/>
-        <w:ind w:left="1425"/>
-        <w:rPr>
-          <w:rFonts w:ascii="Arial" w:eastAsia="Arial" w:hAnsi="Arial" w:cs="Arial"/>
-          <w:sz w:val="24"/>
-          <w:szCs w:val="24"/>
-        </w:rPr>
-      </w:pPr>
-      <w:r>
-        <w:rPr>
-          <w:rFonts w:ascii="Arial" w:eastAsia="Arial" w:hAnsi="Arial" w:cs="Arial"/>
-          <w:sz w:val="24"/>
-          <w:szCs w:val="24"/>
-        </w:rPr>
-        <w:t>Atividades Realizadas:</w:t>
-      </w:r>
-    </w:p>
-    <w:p>
-      <w:pPr>
-        <w:widowControl/>
-        <w:tabs>
-          <w:tab w:val="left" w:pos="567"/>
-        </w:tabs>
-        <w:spacing w:after="200" w:line="360" w:lineRule="auto"/>
-        <w:ind w:left="1425"/>
-        <w:rPr>
-          <w:rFonts w:ascii="Arial" w:eastAsia="Arial" w:hAnsi="Arial" w:cs="Arial"/>
-          <w:sz w:val="24"/>
-          <w:szCs w:val="24"/>
-        </w:rPr>
-      </w:pPr>
-      <w:r>
-        <w:rPr>
-          <w:rFonts w:ascii="Arial" w:eastAsia="Arial" w:hAnsi="Arial" w:cs="Arial"/>
-          <w:sz w:val="24"/>
-          <w:szCs w:val="24"/>
-        </w:rPr>
-        <w:t xml:space="preserve">Foi realizada uma reunião com o docente para organizar as ideias e acompanhar o andamento do projeto. Durante a aula, foram esclarecidas dúvidas e recebidas orientações sobre as próximas etapas do desenvolvimento. Em seguida, a equipe iniciou a implementação da funcionalidade de clientes, realizando atualizações no arquivo </w:t>
-      </w:r>
-      <w:proofErr w:type="spellStart"/>
-      <w:r>
-        <w:rPr>
-          <w:rFonts w:ascii="Arial" w:eastAsia="Arial" w:hAnsi="Arial" w:cs="Arial"/>
-          <w:sz w:val="24"/>
-          <w:szCs w:val="24"/>
-        </w:rPr>
-        <w:t>ClienteController</w:t>
-      </w:r>
-      <w:proofErr w:type="spellEnd"/>
-      <w:r>
-        <w:rPr>
-          <w:rFonts w:ascii="Arial" w:eastAsia="Arial" w:hAnsi="Arial" w:cs="Arial"/>
-          <w:sz w:val="24"/>
-          <w:szCs w:val="24"/>
-        </w:rPr>
-        <w:t xml:space="preserve">, criando o </w:t>
-      </w:r>
-      <w:proofErr w:type="spellStart"/>
-      <w:r>
-        <w:rPr>
-          <w:rFonts w:ascii="Arial" w:eastAsia="Arial" w:hAnsi="Arial" w:cs="Arial"/>
-          <w:sz w:val="24"/>
-          <w:szCs w:val="24"/>
-        </w:rPr>
-        <w:t>ClienteRepository</w:t>
-      </w:r>
-      <w:proofErr w:type="spellEnd"/>
-      <w:r>
-        <w:rPr>
-          <w:rFonts w:ascii="Arial" w:eastAsia="Arial" w:hAnsi="Arial" w:cs="Arial"/>
-          <w:sz w:val="24"/>
-          <w:szCs w:val="24"/>
-        </w:rPr>
-        <w:t xml:space="preserve"> e desenvolvendo a classe Cliente. Também foi trabalhada a integração entre essas classes, preparando a aplicação para realizar o cadastro, consulta, paginação e exclusão de clientes.</w:t>
-      </w:r>
-    </w:p>
-    <w:p>
-      <w:pPr>
-        <w:widowControl/>
-        <w:tabs>
-          <w:tab w:val="left" w:pos="567"/>
-        </w:tabs>
-        <w:spacing w:after="200" w:line="360" w:lineRule="auto"/>
-        <w:ind w:left="1425"/>
-        <w:rPr>
-          <w:rFonts w:ascii="Arial" w:eastAsia="Arial" w:hAnsi="Arial" w:cs="Arial"/>
-          <w:sz w:val="24"/>
-          <w:szCs w:val="24"/>
-        </w:rPr>
-      </w:pPr>
-    </w:p>
-    <w:p>
-      <w:pPr>
-        <w:widowControl/>
-        <w:tabs>
-          <w:tab w:val="left" w:pos="567"/>
-        </w:tabs>
-        <w:spacing w:after="200" w:line="360" w:lineRule="auto"/>
-        <w:ind w:left="1425"/>
-        <w:rPr>
-          <w:rFonts w:ascii="Arial" w:eastAsia="Arial" w:hAnsi="Arial" w:cs="Arial"/>
-          <w:sz w:val="24"/>
-          <w:szCs w:val="24"/>
-        </w:rPr>
-      </w:pPr>
-    </w:p>
-    <w:p>
-      <w:pPr>
-        <w:widowControl/>
-        <w:tabs>
-          <w:tab w:val="left" w:pos="567"/>
-        </w:tabs>
-        <w:spacing w:after="200" w:line="360" w:lineRule="auto"/>
-        <w:ind w:left="1425"/>
-        <w:rPr>
-          <w:rFonts w:ascii="Arial" w:eastAsia="Arial" w:hAnsi="Arial" w:cs="Arial"/>
-          <w:sz w:val="24"/>
-          <w:szCs w:val="24"/>
-        </w:rPr>
-      </w:pPr>
-    </w:p>
-    <w:p>
-      <w:pPr>
-        <w:widowControl/>
-        <w:tabs>
-          <w:tab w:val="left" w:pos="567"/>
-        </w:tabs>
-        <w:spacing w:after="200" w:line="360" w:lineRule="auto"/>
-        <w:ind w:left="1425"/>
-        <w:rPr>
-          <w:rFonts w:ascii="Arial" w:eastAsia="Arial" w:hAnsi="Arial" w:cs="Arial"/>
-          <w:sz w:val="24"/>
-          <w:szCs w:val="24"/>
-        </w:rPr>
-      </w:pPr>
-    </w:p>
-    <w:p>
-      <w:pPr>
-        <w:widowControl/>
-        <w:tabs>
-          <w:tab w:val="left" w:pos="567"/>
-        </w:tabs>
-        <w:spacing w:after="200" w:line="360" w:lineRule="auto"/>
-        <w:ind w:left="1425"/>
-        <w:rPr>
-          <w:rFonts w:ascii="Arial" w:eastAsia="Arial" w:hAnsi="Arial" w:cs="Arial"/>
-          <w:sz w:val="24"/>
-          <w:szCs w:val="24"/>
-        </w:rPr>
-      </w:pPr>
-    </w:p>
-    <w:p>
-      <w:pPr>
-        <w:widowControl/>
-        <w:tabs>
-          <w:tab w:val="left" w:pos="567"/>
-        </w:tabs>
-        <w:spacing w:after="200" w:line="360" w:lineRule="auto"/>
-        <w:ind w:left="1425"/>
-        <w:rPr>
-          <w:rFonts w:ascii="Arial" w:eastAsia="Arial" w:hAnsi="Arial" w:cs="Arial"/>
-          <w:sz w:val="24"/>
-          <w:szCs w:val="24"/>
-        </w:rPr>
-      </w:pPr>
-    </w:p>
-    <w:p>
-      <w:pPr>
-        <w:widowControl/>
-        <w:tabs>
-          <w:tab w:val="left" w:pos="567"/>
-        </w:tabs>
-        <w:spacing w:after="200" w:line="360" w:lineRule="auto"/>
-        <w:ind w:left="1425"/>
-        <w:rPr>
-          <w:rFonts w:ascii="Arial" w:eastAsia="Arial" w:hAnsi="Arial" w:cs="Arial"/>
-          <w:sz w:val="24"/>
-          <w:szCs w:val="24"/>
-        </w:rPr>
-      </w:pPr>
-      <w:r>
-        <w:rPr>
-          <w:rFonts w:ascii="Arial" w:eastAsia="Arial" w:hAnsi="Arial" w:cs="Arial"/>
-          <w:sz w:val="24"/>
-          <w:szCs w:val="24"/>
-        </w:rPr>
-        <w:t>AULA 6 - DESENVOLVIMENTO DO BACKEND E INTEGRAÇÃO DAS ENTIDADES COM O BANCO DE DADOS</w:t>
-      </w:r>
-    </w:p>
-    <w:p>
-      <w:pPr>
-        <w:widowControl/>
-        <w:tabs>
-          <w:tab w:val="left" w:pos="567"/>
-        </w:tabs>
-        <w:spacing w:after="200" w:line="360" w:lineRule="auto"/>
-        <w:ind w:left="1425"/>
-        <w:rPr>
-          <w:rFonts w:ascii="Arial" w:eastAsia="Arial" w:hAnsi="Arial" w:cs="Arial"/>
-          <w:sz w:val="24"/>
-          <w:szCs w:val="24"/>
-        </w:rPr>
-      </w:pPr>
-      <w:r>
-        <w:rPr>
-          <w:rFonts w:ascii="Arial" w:eastAsia="Arial" w:hAnsi="Arial" w:cs="Arial"/>
-          <w:sz w:val="24"/>
-          <w:szCs w:val="24"/>
-        </w:rPr>
-        <w:t>Data: 18/08/2026</w:t>
-      </w:r>
-    </w:p>
-    <w:p>
-      <w:pPr>
-        <w:widowControl/>
-        <w:tabs>
-          <w:tab w:val="left" w:pos="567"/>
-        </w:tabs>
-        <w:spacing w:after="200" w:line="360" w:lineRule="auto"/>
-        <w:ind w:left="1425"/>
-        <w:rPr>
-          <w:rFonts w:ascii="Arial" w:eastAsia="Arial" w:hAnsi="Arial" w:cs="Arial"/>
-          <w:sz w:val="24"/>
-          <w:szCs w:val="24"/>
-        </w:rPr>
-      </w:pPr>
-      <w:r>
-        <w:rPr>
-          <w:rFonts w:ascii="Arial" w:eastAsia="Arial" w:hAnsi="Arial" w:cs="Arial"/>
-          <w:sz w:val="24"/>
-          <w:szCs w:val="24"/>
-        </w:rPr>
-        <w:t>Tema: Desenvolvimento das classes Pessoa,</w:t>
-      </w:r>
-      <w:r>
-        <w:rPr>
-          <w:rFonts w:ascii="Arial" w:eastAsia="Arial" w:hAnsi="Arial" w:cs="Arial"/>
-          <w:sz w:val="24"/>
-          <w:szCs w:val="24"/>
-        </w:rPr>
-        <w:t xml:space="preserve"> </w:t>
-      </w:r>
-      <w:r>
-        <w:rPr>
-          <w:rFonts w:ascii="Arial" w:eastAsia="Arial" w:hAnsi="Arial" w:cs="Arial"/>
-          <w:sz w:val="24"/>
-          <w:szCs w:val="24"/>
-        </w:rPr>
-        <w:t>Repository do sistema.</w:t>
-      </w:r>
-    </w:p>
-    <w:p>
-      <w:pPr>
-        <w:widowControl/>
-        <w:tabs>
-          <w:tab w:val="left" w:pos="567"/>
-        </w:tabs>
-        <w:spacing w:after="200" w:line="360" w:lineRule="auto"/>
-        <w:ind w:left="1425"/>
-        <w:rPr>
-          <w:rFonts w:ascii="Arial" w:eastAsia="Arial" w:hAnsi="Arial" w:cs="Arial"/>
-          <w:sz w:val="24"/>
-          <w:szCs w:val="24"/>
-        </w:rPr>
-      </w:pPr>
-      <w:r>
-        <w:rPr>
-          <w:rFonts w:ascii="Arial" w:eastAsia="Arial" w:hAnsi="Arial" w:cs="Arial"/>
-          <w:sz w:val="24"/>
-          <w:szCs w:val="24"/>
-        </w:rPr>
-        <w:t>Objetivo:</w:t>
-      </w:r>
-    </w:p>
-    <w:p>
-      <w:pPr>
-        <w:widowControl/>
-        <w:tabs>
-          <w:tab w:val="left" w:pos="567"/>
-        </w:tabs>
-        <w:spacing w:after="200" w:line="360" w:lineRule="auto"/>
-        <w:ind w:left="1425"/>
-        <w:rPr>
-          <w:rFonts w:ascii="Arial" w:eastAsia="Arial" w:hAnsi="Arial" w:cs="Arial"/>
-          <w:sz w:val="24"/>
-          <w:szCs w:val="24"/>
-        </w:rPr>
-      </w:pPr>
-      <w:r>
-        <w:rPr>
-          <w:rFonts w:ascii="Arial" w:eastAsia="Arial" w:hAnsi="Arial" w:cs="Arial"/>
-          <w:sz w:val="24"/>
-          <w:szCs w:val="24"/>
-        </w:rPr>
-        <w:t xml:space="preserve">Dar continuidade ao desenvolvimento do sistema de controle para a loja de moda, implementando a estrutura do </w:t>
-      </w:r>
-      <w:proofErr w:type="spellStart"/>
-      <w:r>
-        <w:rPr>
-          <w:rFonts w:ascii="Arial" w:eastAsia="Arial" w:hAnsi="Arial" w:cs="Arial"/>
-          <w:sz w:val="24"/>
-          <w:szCs w:val="24"/>
-        </w:rPr>
-        <w:t>backend</w:t>
-      </w:r>
-      <w:proofErr w:type="spellEnd"/>
-      <w:r>
-        <w:rPr>
-          <w:rFonts w:ascii="Arial" w:eastAsia="Arial" w:hAnsi="Arial" w:cs="Arial"/>
-          <w:sz w:val="24"/>
-          <w:szCs w:val="24"/>
-        </w:rPr>
-        <w:t xml:space="preserve"> responsável pelo gerenciamento de pessoas, clientes, funcionários, fornecedores e categorias</w:t>
-      </w:r>
-      <w:r>
-        <w:rPr>
-          <w:rFonts w:ascii="Arial" w:eastAsia="Arial" w:hAnsi="Arial" w:cs="Arial"/>
-          <w:sz w:val="24"/>
-          <w:szCs w:val="24"/>
-        </w:rPr>
-        <w:t>.</w:t>
-      </w:r>
-    </w:p>
-    <w:p>
-      <w:pPr>
-        <w:widowControl/>
-        <w:tabs>
-          <w:tab w:val="left" w:pos="567"/>
-        </w:tabs>
-        <w:spacing w:after="200" w:line="360" w:lineRule="auto"/>
-        <w:ind w:left="1425"/>
-        <w:rPr>
-          <w:rFonts w:ascii="Arial" w:eastAsia="Arial" w:hAnsi="Arial" w:cs="Arial"/>
-          <w:sz w:val="24"/>
-          <w:szCs w:val="24"/>
-        </w:rPr>
-      </w:pPr>
-      <w:r>
-        <w:rPr>
-          <w:rFonts w:ascii="Arial" w:eastAsia="Arial" w:hAnsi="Arial" w:cs="Arial"/>
-          <w:sz w:val="24"/>
-          <w:szCs w:val="24"/>
-        </w:rPr>
-        <w:t>Conteúdo Abordado:</w:t>
-      </w:r>
-    </w:p>
-    <w:p>
-      <w:pPr>
-        <w:widowControl/>
-        <w:tabs>
-          <w:tab w:val="left" w:pos="567"/>
-        </w:tabs>
-        <w:spacing w:after="200" w:line="360" w:lineRule="auto"/>
-        <w:ind w:left="1425"/>
-        <w:rPr>
-          <w:rFonts w:ascii="Arial" w:eastAsia="Arial" w:hAnsi="Arial" w:cs="Arial"/>
-          <w:sz w:val="24"/>
-          <w:szCs w:val="24"/>
-        </w:rPr>
-      </w:pPr>
-      <w:r>
-        <w:rPr>
-          <w:rFonts w:ascii="Arial" w:eastAsia="Arial" w:hAnsi="Arial" w:cs="Arial"/>
-          <w:sz w:val="24"/>
-          <w:szCs w:val="24"/>
-        </w:rPr>
-        <w:t>Classe Pessoa: desenvolvimento da classe Pessoa.java, responsável por representar os dados das pessoas cadastradas no sistema e realizar o mapeamento da tabela pessoa do banco de dados</w:t>
-      </w:r>
-      <w:r>
-        <w:rPr>
-          <w:rFonts w:ascii="Arial" w:eastAsia="Arial" w:hAnsi="Arial" w:cs="Arial"/>
-          <w:sz w:val="24"/>
-          <w:szCs w:val="24"/>
-        </w:rPr>
-        <w:t>.</w:t>
-      </w:r>
-    </w:p>
-    <w:p>
-      <w:pPr>
-        <w:widowControl/>
-        <w:tabs>
-          <w:tab w:val="left" w:pos="567"/>
-        </w:tabs>
-        <w:spacing w:after="200" w:line="360" w:lineRule="auto"/>
-        <w:ind w:left="1425"/>
-        <w:rPr>
-          <w:rFonts w:ascii="Arial" w:eastAsia="Arial" w:hAnsi="Arial" w:cs="Arial"/>
-          <w:sz w:val="24"/>
-          <w:szCs w:val="24"/>
-        </w:rPr>
-      </w:pPr>
-      <w:proofErr w:type="spellStart"/>
-      <w:r>
-        <w:rPr>
-          <w:rFonts w:ascii="Arial" w:eastAsia="Arial" w:hAnsi="Arial" w:cs="Arial"/>
-          <w:sz w:val="24"/>
-          <w:szCs w:val="24"/>
-        </w:rPr>
-        <w:t>PessoaRepository</w:t>
-      </w:r>
-      <w:proofErr w:type="spellEnd"/>
-      <w:r>
-        <w:rPr>
-          <w:rFonts w:ascii="Arial" w:eastAsia="Arial" w:hAnsi="Arial" w:cs="Arial"/>
-          <w:sz w:val="24"/>
-          <w:szCs w:val="24"/>
-        </w:rPr>
-        <w:t xml:space="preserve">: criação e configuração do </w:t>
-      </w:r>
-      <w:proofErr w:type="spellStart"/>
-      <w:r>
-        <w:rPr>
-          <w:rFonts w:ascii="Arial" w:eastAsia="Arial" w:hAnsi="Arial" w:cs="Arial"/>
-          <w:sz w:val="24"/>
-          <w:szCs w:val="24"/>
-        </w:rPr>
-        <w:t>PessoaRepository</w:t>
-      </w:r>
-      <w:proofErr w:type="spellEnd"/>
-      <w:r>
-        <w:rPr>
-          <w:rFonts w:ascii="Arial" w:eastAsia="Arial" w:hAnsi="Arial" w:cs="Arial"/>
-          <w:sz w:val="24"/>
-          <w:szCs w:val="24"/>
-        </w:rPr>
-        <w:t xml:space="preserve">, utilizando </w:t>
-      </w:r>
-      <w:proofErr w:type="spellStart"/>
-      <w:r>
-        <w:rPr>
-          <w:rFonts w:ascii="Arial" w:eastAsia="Arial" w:hAnsi="Arial" w:cs="Arial"/>
-          <w:sz w:val="24"/>
-          <w:szCs w:val="24"/>
-        </w:rPr>
-        <w:t>JpaRepository</w:t>
-      </w:r>
-      <w:proofErr w:type="spellEnd"/>
-      <w:r>
-        <w:rPr>
-          <w:rFonts w:ascii="Arial" w:eastAsia="Arial" w:hAnsi="Arial" w:cs="Arial"/>
-          <w:sz w:val="24"/>
-          <w:szCs w:val="24"/>
-        </w:rPr>
-        <w:t>, possibilitando realizar operações de persistência, consulta, alteração e exclusão dos registros da tabela pessoa.</w:t>
-      </w:r>
-    </w:p>
-    <w:p>
-      <w:pPr>
-        <w:widowControl/>
-        <w:tabs>
-          <w:tab w:val="left" w:pos="567"/>
-        </w:tabs>
-        <w:spacing w:after="200" w:line="360" w:lineRule="auto"/>
-        <w:ind w:left="1425"/>
-        <w:rPr>
-          <w:rFonts w:ascii="Arial" w:eastAsia="Arial" w:hAnsi="Arial" w:cs="Arial"/>
-          <w:sz w:val="24"/>
-          <w:szCs w:val="24"/>
-        </w:rPr>
-      </w:pPr>
-      <w:r>
-        <w:rPr>
-          <w:rFonts w:ascii="Arial" w:eastAsia="Arial" w:hAnsi="Arial" w:cs="Arial"/>
-          <w:sz w:val="24"/>
-          <w:szCs w:val="24"/>
-        </w:rPr>
-        <w:t>Integração entre as camadas: compreensão da comunicação entre Model</w:t>
-      </w:r>
-      <w:r>
-        <w:rPr>
-          <w:rFonts w:ascii="Arial" w:eastAsia="Arial" w:hAnsi="Arial" w:cs="Arial"/>
-          <w:sz w:val="24"/>
-          <w:szCs w:val="24"/>
-        </w:rPr>
-        <w:t xml:space="preserve"> e</w:t>
-      </w:r>
-      <w:r>
-        <w:rPr>
-          <w:rFonts w:ascii="Arial" w:eastAsia="Arial" w:hAnsi="Arial" w:cs="Arial"/>
-          <w:sz w:val="24"/>
-          <w:szCs w:val="24"/>
-        </w:rPr>
-        <w:t xml:space="preserve"> Repository permitindo que as informações recebidas pela aplicação sejam processadas pelo </w:t>
-      </w:r>
-      <w:proofErr w:type="spellStart"/>
-      <w:r>
-        <w:rPr>
-          <w:rFonts w:ascii="Arial" w:eastAsia="Arial" w:hAnsi="Arial" w:cs="Arial"/>
-          <w:sz w:val="24"/>
-          <w:szCs w:val="24"/>
-        </w:rPr>
-        <w:t>backend</w:t>
-      </w:r>
-      <w:proofErr w:type="spellEnd"/>
-      <w:r>
-        <w:rPr>
-          <w:rFonts w:ascii="Arial" w:eastAsia="Arial" w:hAnsi="Arial" w:cs="Arial"/>
-          <w:sz w:val="24"/>
-          <w:szCs w:val="24"/>
-        </w:rPr>
-        <w:t xml:space="preserve"> e posteriormente armazenadas ou consultadas no banco de dados.</w:t>
-      </w:r>
-    </w:p>
-    <w:p>
-      <w:pPr>
-        <w:widowControl/>
-        <w:tabs>
-          <w:tab w:val="left" w:pos="567"/>
-        </w:tabs>
-        <w:spacing w:after="200" w:line="360" w:lineRule="auto"/>
-        <w:ind w:left="1425"/>
-        <w:rPr>
-          <w:rFonts w:ascii="Arial" w:eastAsia="Arial" w:hAnsi="Arial" w:cs="Arial"/>
-          <w:sz w:val="24"/>
-          <w:szCs w:val="24"/>
-        </w:rPr>
-      </w:pPr>
-      <w:r>
-        <w:rPr>
-          <w:rFonts w:ascii="Arial" w:eastAsia="Arial" w:hAnsi="Arial" w:cs="Arial"/>
-          <w:sz w:val="24"/>
-          <w:szCs w:val="24"/>
-        </w:rPr>
-        <w:t>Atividades Realizadas:</w:t>
-      </w:r>
-    </w:p>
-    <w:p>
-      <w:pPr>
-        <w:widowControl/>
-        <w:tabs>
-          <w:tab w:val="left" w:pos="567"/>
-        </w:tabs>
-        <w:spacing w:after="200" w:line="360" w:lineRule="auto"/>
-        <w:ind w:left="1425"/>
-        <w:rPr>
-          <w:rFonts w:ascii="Arial" w:eastAsia="Arial" w:hAnsi="Arial" w:cs="Arial"/>
-          <w:sz w:val="24"/>
-          <w:szCs w:val="24"/>
-        </w:rPr>
-      </w:pPr>
-      <w:r>
-        <w:rPr>
-          <w:rFonts w:ascii="Arial" w:eastAsia="Arial" w:hAnsi="Arial" w:cs="Arial"/>
-          <w:sz w:val="24"/>
-          <w:szCs w:val="24"/>
-        </w:rPr>
-        <w:t xml:space="preserve">Durante a aula, foi dada continuidade ao desenvolvimento do </w:t>
-      </w:r>
-      <w:proofErr w:type="spellStart"/>
-      <w:r>
-        <w:rPr>
-          <w:rFonts w:ascii="Arial" w:eastAsia="Arial" w:hAnsi="Arial" w:cs="Arial"/>
-          <w:sz w:val="24"/>
-          <w:szCs w:val="24"/>
-        </w:rPr>
-        <w:t>backend</w:t>
-      </w:r>
-      <w:proofErr w:type="spellEnd"/>
-      <w:r>
-        <w:rPr>
-          <w:rFonts w:ascii="Arial" w:eastAsia="Arial" w:hAnsi="Arial" w:cs="Arial"/>
-          <w:sz w:val="24"/>
-          <w:szCs w:val="24"/>
-        </w:rPr>
-        <w:t xml:space="preserve"> do sistema da loja de moda. Inicialmente, foi realizada a implementação e configuração da classe Pessoa, responsável pelo </w:t>
-      </w:r>
-      <w:r>
-        <w:rPr>
-          <w:rFonts w:ascii="Arial" w:eastAsia="Arial" w:hAnsi="Arial" w:cs="Arial"/>
-          <w:sz w:val="24"/>
-          <w:szCs w:val="24"/>
-        </w:rPr>
-        <w:lastRenderedPageBreak/>
-        <w:t>mapeamento da tabela pessoa existente no banco de dados. Foram configurados os atributos da entidade e suas respectivas anotações do JPA para permitir a comunicação correta entre a aplicação Java e o banco de dados.</w:t>
+        <w:t>JPA para permitir a comunicação correta entre a aplicação Java e o banco de dados.</w:t>
       </w:r>
     </w:p>
     <w:p>
@@ -4309,7 +4669,7 @@
                     <pic:cNvPicPr/>
                   </pic:nvPicPr>
                   <pic:blipFill>
-                    <a:blip r:embed="rId12"/>
+                    <a:blip r:embed="rId13"/>
                     <a:stretch>
                       <a:fillRect/>
                     </a:stretch>
@@ -4337,14 +4697,27 @@
       <w:r>
         <w:t xml:space="preserve">Figura </w:t>
       </w:r>
-      <w:fldSimple w:instr=" SEQ Figura \* ARABIC ">
-        <w:r>
-          <w:rPr>
-            <w:noProof/>
-          </w:rPr>
-          <w:t>5</w:t>
-        </w:r>
-      </w:fldSimple>
+      <w:r>
+        <w:fldChar w:fldCharType="begin"/>
+      </w:r>
+      <w:r>
+        <w:instrText xml:space="preserve"> SEQ Figura \* ARABIC </w:instrText>
+      </w:r>
+      <w:r>
+        <w:fldChar w:fldCharType="separate"/>
+      </w:r>
+      <w:r>
+        <w:rPr>
+          <w:noProof/>
+        </w:rPr>
+        <w:t>6</w:t>
+      </w:r>
+      <w:r>
+        <w:rPr>
+          <w:noProof/>
+        </w:rPr>
+        <w:fldChar w:fldCharType="end"/>
+      </w:r>
       <w:r>
         <w:t xml:space="preserve"> Classe Model Pessoa</w:t>
       </w:r>
@@ -4376,52 +4749,60 @@
           <w:sz w:val="24"/>
           <w:szCs w:val="24"/>
         </w:rPr>
+        <w:t>Em</w:t>
+      </w:r>
+      <w:r>
+        <w:rPr>
+          <w:rFonts w:ascii="Arial" w:eastAsia="Arial" w:hAnsi="Arial" w:cs="Arial"/>
+          <w:sz w:val="24"/>
+          <w:szCs w:val="24"/>
+        </w:rPr>
+        <w:t xml:space="preserve"> seguida, foi desenvolvido o </w:t>
+      </w:r>
+      <w:proofErr w:type="spellStart"/>
+      <w:r>
+        <w:rPr>
+          <w:rFonts w:ascii="Arial" w:eastAsia="Arial" w:hAnsi="Arial" w:cs="Arial"/>
+          <w:sz w:val="24"/>
+          <w:szCs w:val="24"/>
+        </w:rPr>
+        <w:t>PessoaRepository</w:t>
+      </w:r>
+      <w:proofErr w:type="spellEnd"/>
+      <w:r>
+        <w:rPr>
+          <w:rFonts w:ascii="Arial" w:eastAsia="Arial" w:hAnsi="Arial" w:cs="Arial"/>
+          <w:sz w:val="24"/>
+          <w:szCs w:val="24"/>
+        </w:rPr>
+        <w:t xml:space="preserve">, utilizando o </w:t>
+      </w:r>
+      <w:proofErr w:type="spellStart"/>
+      <w:r>
+        <w:rPr>
+          <w:rFonts w:ascii="Arial" w:eastAsia="Arial" w:hAnsi="Arial" w:cs="Arial"/>
+          <w:sz w:val="24"/>
+          <w:szCs w:val="24"/>
+        </w:rPr>
+        <w:t>JpaRepository</w:t>
+      </w:r>
+      <w:proofErr w:type="spellEnd"/>
+      <w:r>
+        <w:rPr>
+          <w:rFonts w:ascii="Arial" w:eastAsia="Arial" w:hAnsi="Arial" w:cs="Arial"/>
+          <w:sz w:val="24"/>
+          <w:szCs w:val="24"/>
+        </w:rPr>
+        <w:t xml:space="preserve"> para disponibilizar as operações de acesso aos registros da tabela pessoa. Também foram realizadas configurações para </w:t>
+      </w:r>
+      <w:r>
+        <w:rPr>
+          <w:rFonts w:ascii="Arial" w:eastAsia="Arial" w:hAnsi="Arial" w:cs="Arial"/>
+          <w:sz w:val="24"/>
+          <w:szCs w:val="24"/>
+        </w:rPr>
         <w:lastRenderedPageBreak/>
-        <w:t>Em</w:t>
-      </w:r>
-      <w:r>
-        <w:rPr>
-          <w:rFonts w:ascii="Arial" w:eastAsia="Arial" w:hAnsi="Arial" w:cs="Arial"/>
-          <w:sz w:val="24"/>
-          <w:szCs w:val="24"/>
-        </w:rPr>
-        <w:t xml:space="preserve"> seguida, foi desenvolvido o </w:t>
-      </w:r>
-      <w:proofErr w:type="spellStart"/>
-      <w:r>
-        <w:rPr>
-          <w:rFonts w:ascii="Arial" w:eastAsia="Arial" w:hAnsi="Arial" w:cs="Arial"/>
-          <w:sz w:val="24"/>
-          <w:szCs w:val="24"/>
-        </w:rPr>
-        <w:t>PessoaRepository</w:t>
-      </w:r>
-      <w:proofErr w:type="spellEnd"/>
-      <w:r>
-        <w:rPr>
-          <w:rFonts w:ascii="Arial" w:eastAsia="Arial" w:hAnsi="Arial" w:cs="Arial"/>
-          <w:sz w:val="24"/>
-          <w:szCs w:val="24"/>
-        </w:rPr>
-        <w:t xml:space="preserve">, utilizando o </w:t>
-      </w:r>
-      <w:proofErr w:type="spellStart"/>
-      <w:r>
-        <w:rPr>
-          <w:rFonts w:ascii="Arial" w:eastAsia="Arial" w:hAnsi="Arial" w:cs="Arial"/>
-          <w:sz w:val="24"/>
-          <w:szCs w:val="24"/>
-        </w:rPr>
-        <w:t>JpaRepository</w:t>
-      </w:r>
-      <w:proofErr w:type="spellEnd"/>
-      <w:r>
-        <w:rPr>
-          <w:rFonts w:ascii="Arial" w:eastAsia="Arial" w:hAnsi="Arial" w:cs="Arial"/>
-          <w:sz w:val="24"/>
-          <w:szCs w:val="24"/>
-        </w:rPr>
-        <w:t xml:space="preserve"> para disponibilizar as operações de acesso aos registros da tabela pessoa. Também foram realizadas configurações para permitir a busca das pessoas de acordo com o seu tipo, possibilitando trabalhar com clientes, funcionários e fornecedores.</w:t>
+        <w:t>permitir a busca das pessoas de acordo com o seu tipo, possibilitando trabalhar com clientes, funcionários e fornecedores.</w:t>
       </w:r>
     </w:p>
     <w:p>
@@ -4455,7 +4836,7 @@
                     <pic:cNvPicPr/>
                   </pic:nvPicPr>
                   <pic:blipFill>
-                    <a:blip r:embed="rId13"/>
+                    <a:blip r:embed="rId14"/>
                     <a:stretch>
                       <a:fillRect/>
                     </a:stretch>
@@ -4488,14 +4869,27 @@
       <w:r>
         <w:t xml:space="preserve">Figura </w:t>
       </w:r>
-      <w:fldSimple w:instr=" SEQ Figura \* ARABIC ">
-        <w:r>
-          <w:rPr>
-            <w:noProof/>
-          </w:rPr>
-          <w:t>6</w:t>
-        </w:r>
-      </w:fldSimple>
+      <w:r>
+        <w:fldChar w:fldCharType="begin"/>
+      </w:r>
+      <w:r>
+        <w:instrText xml:space="preserve"> SEQ Figura \* ARABIC </w:instrText>
+      </w:r>
+      <w:r>
+        <w:fldChar w:fldCharType="separate"/>
+      </w:r>
+      <w:r>
+        <w:rPr>
+          <w:noProof/>
+        </w:rPr>
+        <w:t>7</w:t>
+      </w:r>
+      <w:r>
+        <w:rPr>
+          <w:noProof/>
+        </w:rPr>
+        <w:fldChar w:fldCharType="end"/>
+      </w:r>
       <w:r>
         <w:t xml:space="preserve"> Classe Repository Pessoa</w:t>
       </w:r>
@@ -4600,139 +4994,473 @@
         </w:tabs>
         <w:spacing w:after="200" w:line="360" w:lineRule="auto"/>
         <w:ind w:left="1425"/>
-        <w:rPr>
-          <w:rFonts w:ascii="Arial" w:eastAsia="Arial" w:hAnsi="Arial" w:cs="Arial"/>
-          <w:sz w:val="24"/>
-          <w:szCs w:val="24"/>
-        </w:rPr>
-      </w:pPr>
-    </w:p>
-    <w:p>
-      <w:pPr>
-        <w:widowControl/>
-        <w:pBdr>
-          <w:top w:val="nil"/>
-          <w:left w:val="nil"/>
-          <w:bottom w:val="nil"/>
-          <w:right w:val="nil"/>
-          <w:between w:val="nil"/>
-        </w:pBdr>
+      </w:pPr>
+      <w:r>
+        <w:t>AULA 7 - DESENVOLVIMENTO DO CONTROLLER E SERVICE</w:t>
+      </w:r>
+    </w:p>
+    <w:p>
+      <w:pPr>
+        <w:widowControl/>
         <w:tabs>
           <w:tab w:val="left" w:pos="567"/>
         </w:tabs>
         <w:spacing w:after="200" w:line="360" w:lineRule="auto"/>
         <w:ind w:left="1425"/>
-        <w:rPr>
-          <w:rFonts w:ascii="Arial" w:eastAsia="Arial" w:hAnsi="Arial" w:cs="Arial"/>
-          <w:sz w:val="24"/>
-          <w:szCs w:val="24"/>
-        </w:rPr>
-      </w:pPr>
-    </w:p>
-    <w:p>
-      <w:pPr>
-        <w:widowControl/>
-        <w:pBdr>
-          <w:top w:val="nil"/>
-          <w:left w:val="nil"/>
-          <w:bottom w:val="nil"/>
-          <w:right w:val="nil"/>
-          <w:between w:val="nil"/>
-        </w:pBdr>
-        <w:tabs>
-          <w:tab w:val="left" w:pos="567"/>
-        </w:tabs>
-        <w:spacing w:after="200" w:line="360" w:lineRule="auto"/>
-        <w:rPr>
-          <w:rFonts w:ascii="Arial" w:eastAsia="Arial" w:hAnsi="Arial" w:cs="Arial"/>
-          <w:sz w:val="24"/>
-          <w:szCs w:val="24"/>
-        </w:rPr>
-      </w:pPr>
-    </w:p>
-    <w:p>
-      <w:pPr>
-        <w:widowControl/>
-        <w:pBdr>
-          <w:top w:val="nil"/>
-          <w:left w:val="nil"/>
-          <w:bottom w:val="nil"/>
-          <w:right w:val="nil"/>
-          <w:between w:val="nil"/>
-        </w:pBdr>
-        <w:tabs>
-          <w:tab w:val="left" w:pos="567"/>
-        </w:tabs>
-        <w:spacing w:after="200" w:line="360" w:lineRule="auto"/>
-        <w:rPr>
-          <w:rFonts w:ascii="Arial" w:eastAsia="Arial" w:hAnsi="Arial" w:cs="Arial"/>
-          <w:sz w:val="24"/>
-          <w:szCs w:val="24"/>
-        </w:rPr>
-      </w:pPr>
-    </w:p>
-    <w:p>
-      <w:pPr>
-        <w:widowControl/>
-        <w:pBdr>
-          <w:top w:val="nil"/>
-          <w:left w:val="nil"/>
-          <w:bottom w:val="nil"/>
-          <w:right w:val="nil"/>
-          <w:between w:val="nil"/>
-        </w:pBdr>
-        <w:tabs>
-          <w:tab w:val="left" w:pos="567"/>
-        </w:tabs>
-        <w:spacing w:after="200" w:line="360" w:lineRule="auto"/>
-        <w:rPr>
-          <w:rFonts w:ascii="Arial" w:eastAsia="Arial" w:hAnsi="Arial" w:cs="Arial"/>
-          <w:sz w:val="24"/>
-          <w:szCs w:val="24"/>
-        </w:rPr>
-      </w:pPr>
-    </w:p>
-    <w:p>
-      <w:pPr>
-        <w:widowControl/>
-        <w:pBdr>
-          <w:top w:val="nil"/>
-          <w:left w:val="nil"/>
-          <w:bottom w:val="nil"/>
-          <w:right w:val="nil"/>
-          <w:between w:val="nil"/>
-        </w:pBdr>
-        <w:tabs>
-          <w:tab w:val="left" w:pos="567"/>
-        </w:tabs>
-        <w:spacing w:after="200" w:line="360" w:lineRule="auto"/>
-        <w:rPr>
-          <w:rFonts w:ascii="Arial" w:eastAsia="Arial" w:hAnsi="Arial" w:cs="Arial"/>
-          <w:sz w:val="24"/>
-          <w:szCs w:val="24"/>
-        </w:rPr>
-      </w:pPr>
-    </w:p>
-    <w:p>
-      <w:pPr>
-        <w:widowControl/>
-        <w:pBdr>
-          <w:top w:val="nil"/>
-          <w:left w:val="nil"/>
-          <w:bottom w:val="nil"/>
-          <w:right w:val="nil"/>
-          <w:between w:val="nil"/>
-        </w:pBdr>
-        <w:tabs>
-          <w:tab w:val="left" w:pos="567"/>
-        </w:tabs>
-        <w:spacing w:after="200" w:line="360" w:lineRule="auto"/>
-        <w:rPr>
-          <w:rFonts w:ascii="Arial" w:eastAsia="Arial" w:hAnsi="Arial" w:cs="Arial"/>
-          <w:sz w:val="24"/>
-          <w:szCs w:val="24"/>
-        </w:rPr>
-      </w:pPr>
+      </w:pPr>
+      <w:r>
+        <w:t>Da</w:t>
+      </w:r>
+      <w:r>
+        <w:t>t</w:t>
+      </w:r>
+      <w:r>
+        <w:t>a: 21/08/2026</w:t>
+      </w:r>
+    </w:p>
+    <w:p>
+      <w:pPr>
+        <w:widowControl/>
+        <w:tabs>
+          <w:tab w:val="left" w:pos="567"/>
+        </w:tabs>
+        <w:spacing w:after="200" w:line="360" w:lineRule="auto"/>
+        <w:ind w:left="1425"/>
+      </w:pPr>
+      <w:r>
+        <w:t xml:space="preserve">Tema: Desenvolvimento das classes </w:t>
+      </w:r>
+      <w:proofErr w:type="spellStart"/>
+      <w:r>
+        <w:t>PessoaController</w:t>
+      </w:r>
+      <w:proofErr w:type="spellEnd"/>
+      <w:r>
+        <w:t xml:space="preserve"> e </w:t>
+      </w:r>
+      <w:proofErr w:type="spellStart"/>
+      <w:r>
+        <w:t>PessoaService</w:t>
+      </w:r>
+      <w:proofErr w:type="spellEnd"/>
+      <w:r>
+        <w:t>.</w:t>
+      </w:r>
+    </w:p>
+    <w:p>
+      <w:pPr>
+        <w:widowControl/>
+        <w:tabs>
+          <w:tab w:val="left" w:pos="567"/>
+        </w:tabs>
+        <w:spacing w:after="200" w:line="360" w:lineRule="auto"/>
+        <w:ind w:left="1425"/>
+      </w:pPr>
+      <w:r>
+        <w:t>Objetivo:</w:t>
+      </w:r>
+    </w:p>
+    <w:p>
+      <w:pPr>
+        <w:widowControl/>
+        <w:tabs>
+          <w:tab w:val="left" w:pos="567"/>
+        </w:tabs>
+        <w:spacing w:after="200" w:line="360" w:lineRule="auto"/>
+        <w:ind w:left="1425"/>
+      </w:pPr>
+      <w:r>
+        <w:t xml:space="preserve">Dar continuidade ao desenvolvimento do </w:t>
+      </w:r>
+      <w:proofErr w:type="spellStart"/>
+      <w:r>
+        <w:t>backend</w:t>
+      </w:r>
+      <w:proofErr w:type="spellEnd"/>
+      <w:r>
+        <w:t xml:space="preserve"> da loja de moda, implementando as camadas </w:t>
+      </w:r>
+      <w:proofErr w:type="spellStart"/>
+      <w:r>
+        <w:t>Controller</w:t>
+      </w:r>
+      <w:proofErr w:type="spellEnd"/>
+      <w:r>
+        <w:t xml:space="preserve"> e Service para organizar o gerenciamento de clientes, fornecedores e funcionários.</w:t>
+      </w:r>
+    </w:p>
+    <w:p>
+      <w:pPr>
+        <w:widowControl/>
+        <w:tabs>
+          <w:tab w:val="left" w:pos="567"/>
+        </w:tabs>
+        <w:spacing w:after="200" w:line="360" w:lineRule="auto"/>
+        <w:ind w:left="1425"/>
+      </w:pPr>
+      <w:r>
+        <w:t>Conteúdo Abordado:</w:t>
+      </w:r>
+    </w:p>
+    <w:p>
+      <w:pPr>
+        <w:widowControl/>
+        <w:tabs>
+          <w:tab w:val="left" w:pos="567"/>
+        </w:tabs>
+        <w:spacing w:after="200" w:line="360" w:lineRule="auto"/>
+        <w:ind w:left="1425"/>
+      </w:pPr>
+      <w:proofErr w:type="spellStart"/>
+      <w:r>
+        <w:t>PessoaController</w:t>
+      </w:r>
+      <w:proofErr w:type="spellEnd"/>
+      <w:r>
+        <w:t xml:space="preserve">: desenvolvimento do </w:t>
+      </w:r>
+      <w:proofErr w:type="spellStart"/>
+      <w:r>
+        <w:t>controller</w:t>
+      </w:r>
+      <w:proofErr w:type="spellEnd"/>
+      <w:r>
+        <w:t xml:space="preserve"> responsável por receber as requisições da aplicação e realizar operações de cadastro, consulta, atualização e exclusão de pessoas.</w:t>
+      </w:r>
+    </w:p>
+    <w:p>
+      <w:pPr>
+        <w:widowControl/>
+        <w:tabs>
+          <w:tab w:val="left" w:pos="567"/>
+        </w:tabs>
+        <w:spacing w:after="200" w:line="360" w:lineRule="auto"/>
+        <w:ind w:left="1425"/>
+      </w:pPr>
+      <w:r>
+        <w:lastRenderedPageBreak/>
+        <w:t>Diferenciação dos tipos: implementação da lógica para identificar os tipos Cliente, Fornecedor e Funcionário, permitindo consultar as pessoas de acordo com sua categoria.</w:t>
+      </w:r>
+    </w:p>
+    <w:p>
+      <w:pPr>
+        <w:widowControl/>
+        <w:tabs>
+          <w:tab w:val="left" w:pos="567"/>
+        </w:tabs>
+        <w:spacing w:after="200" w:line="360" w:lineRule="auto"/>
+        <w:ind w:left="1425"/>
+      </w:pPr>
+      <w:proofErr w:type="spellStart"/>
+      <w:r>
+        <w:t>PessoaService</w:t>
+      </w:r>
+      <w:proofErr w:type="spellEnd"/>
+      <w:r>
+        <w:t xml:space="preserve">: criação do pacote </w:t>
+      </w:r>
+      <w:proofErr w:type="spellStart"/>
+      <w:r>
+        <w:t>service</w:t>
+      </w:r>
+      <w:proofErr w:type="spellEnd"/>
+      <w:r>
+        <w:t xml:space="preserve"> e desenvolvimento da classe responsável por organizar as regras de negócio relacionadas às pessoas.</w:t>
+      </w:r>
+    </w:p>
+    <w:p>
+      <w:pPr>
+        <w:widowControl/>
+        <w:tabs>
+          <w:tab w:val="left" w:pos="567"/>
+        </w:tabs>
+        <w:spacing w:after="200" w:line="360" w:lineRule="auto"/>
+        <w:ind w:left="1425"/>
+      </w:pPr>
+      <w:r>
+        <w:t>Validação: implementação da validação dos tipos de pessoa e padronização das informações antes de realizar os cadastros e alterações.</w:t>
+      </w:r>
+    </w:p>
+    <w:p>
+      <w:pPr>
+        <w:widowControl/>
+        <w:tabs>
+          <w:tab w:val="left" w:pos="567"/>
+        </w:tabs>
+        <w:spacing w:after="200" w:line="360" w:lineRule="auto"/>
+        <w:ind w:left="1425"/>
+      </w:pPr>
+      <w:r>
+        <w:t>Atividades Realizadas:</w:t>
+      </w:r>
+    </w:p>
+    <w:p>
+      <w:pPr>
+        <w:widowControl/>
+        <w:tabs>
+          <w:tab w:val="left" w:pos="567"/>
+        </w:tabs>
+        <w:spacing w:after="200" w:line="360" w:lineRule="auto"/>
+        <w:ind w:left="1425"/>
+      </w:pPr>
+      <w:r>
+        <w:t xml:space="preserve">Durante a aula, foi desenvolvido o </w:t>
+      </w:r>
+      <w:proofErr w:type="spellStart"/>
+      <w:r>
+        <w:t>PessoaController</w:t>
+      </w:r>
+      <w:proofErr w:type="spellEnd"/>
+      <w:r>
+        <w:t>, responsável pelo gerenciamento das requisições relacionadas às pessoas cadastradas no sistema. Foram implementadas funcionalidades para listar, consultar, cadastrar, atualizar e excluir registros, além da diferenciação entre clientes, fornecedores e funcionários.</w:t>
+      </w:r>
+    </w:p>
+    <w:p>
+      <w:pPr>
+        <w:widowControl/>
+        <w:tabs>
+          <w:tab w:val="left" w:pos="567"/>
+        </w:tabs>
+        <w:spacing w:after="200" w:line="360" w:lineRule="auto"/>
+        <w:ind w:left="1425"/>
+      </w:pPr>
+    </w:p>
+    <w:p>
+      <w:pPr>
+        <w:widowControl/>
+        <w:tabs>
+          <w:tab w:val="left" w:pos="567"/>
+        </w:tabs>
+        <w:spacing w:after="200" w:line="360" w:lineRule="auto"/>
+        <w:ind w:left="1425"/>
+      </w:pPr>
+    </w:p>
+    <w:p>
+      <w:pPr>
+        <w:keepNext/>
+        <w:widowControl/>
+        <w:tabs>
+          <w:tab w:val="left" w:pos="567"/>
+        </w:tabs>
+        <w:spacing w:after="200" w:line="360" w:lineRule="auto"/>
+        <w:ind w:left="1425"/>
+        <w:jc w:val="center"/>
+      </w:pPr>
+      <w:r>
+        <w:rPr>
+          <w:noProof/>
+        </w:rPr>
+        <w:drawing>
+          <wp:inline distT="0" distB="0" distL="0" distR="0" wp14:anchorId="48E53201" wp14:editId="0C9C4B23">
+            <wp:extent cx="4844673" cy="3694430"/>
+            <wp:effectExtent l="0" t="0" r="0" b="1270"/>
+            <wp:docPr id="1819466490" name="Imagem 1"/>
+            <wp:cNvGraphicFramePr>
+              <a:graphicFrameLocks xmlns:a="http://schemas.openxmlformats.org/drawingml/2006/main" noChangeAspect="1"/>
+            </wp:cNvGraphicFramePr>
+            <a:graphic xmlns:a="http://schemas.openxmlformats.org/drawingml/2006/main">
+              <a:graphicData uri="http://schemas.openxmlformats.org/drawingml/2006/picture">
+                <pic:pic xmlns:pic="http://schemas.openxmlformats.org/drawingml/2006/picture">
+                  <pic:nvPicPr>
+                    <pic:cNvPr id="1819466490" name=""/>
+                    <pic:cNvPicPr/>
+                  </pic:nvPicPr>
+                  <pic:blipFill>
+                    <a:blip r:embed="rId15"/>
+                    <a:stretch>
+                      <a:fillRect/>
+                    </a:stretch>
+                  </pic:blipFill>
+                  <pic:spPr>
+                    <a:xfrm>
+                      <a:off x="0" y="0"/>
+                      <a:ext cx="4848358" cy="3697240"/>
+                    </a:xfrm>
+                    <a:prstGeom prst="rect">
+                      <a:avLst/>
+                    </a:prstGeom>
+                  </pic:spPr>
+                </pic:pic>
+              </a:graphicData>
+            </a:graphic>
+          </wp:inline>
+        </w:drawing>
+      </w:r>
+    </w:p>
+    <w:p>
+      <w:pPr>
+        <w:pStyle w:val="Legenda"/>
+      </w:pPr>
+      <w:r>
+        <w:t xml:space="preserve">Figura </w:t>
+      </w:r>
+      <w:r>
+        <w:fldChar w:fldCharType="begin"/>
+      </w:r>
+      <w:r>
+        <w:instrText xml:space="preserve"> SEQ Figura \* ARABIC </w:instrText>
+      </w:r>
+      <w:r>
+        <w:fldChar w:fldCharType="separate"/>
+      </w:r>
+      <w:r>
+        <w:rPr>
+          <w:noProof/>
+        </w:rPr>
+        <w:t>8</w:t>
+      </w:r>
+      <w:r>
+        <w:fldChar w:fldCharType="end"/>
+      </w:r>
+      <w:r>
+        <w:t xml:space="preserve"> Classe Pessoa </w:t>
+      </w:r>
+      <w:proofErr w:type="spellStart"/>
+      <w:r>
+        <w:t>Controller</w:t>
+      </w:r>
+      <w:proofErr w:type="spellEnd"/>
+    </w:p>
+    <w:p>
+      <w:pPr>
+        <w:widowControl/>
+        <w:tabs>
+          <w:tab w:val="left" w:pos="567"/>
+        </w:tabs>
+        <w:spacing w:after="200" w:line="360" w:lineRule="auto"/>
+        <w:ind w:left="1425"/>
+      </w:pPr>
+      <w:r>
+        <w:lastRenderedPageBreak/>
+        <w:t xml:space="preserve">Em seguida, foi criado o pacote </w:t>
+      </w:r>
+      <w:proofErr w:type="spellStart"/>
+      <w:r>
+        <w:t>service</w:t>
+      </w:r>
+      <w:proofErr w:type="spellEnd"/>
+      <w:r>
+        <w:t xml:space="preserve"> e desenvolvida a classe </w:t>
+      </w:r>
+      <w:proofErr w:type="spellStart"/>
+      <w:r>
+        <w:t>PessoaService</w:t>
+      </w:r>
+      <w:proofErr w:type="spellEnd"/>
+      <w:r>
+        <w:t>. Nessa classe foram organizadas as regras de negócio relacionadas ao gerenciamento das pessoas, incluindo cadastro, consulta, atualização, exclusão, validação e diferenciação dos tipos de pessoa.</w:t>
+      </w:r>
+    </w:p>
+    <w:p>
+      <w:pPr>
+        <w:keepNext/>
+        <w:widowControl/>
+        <w:tabs>
+          <w:tab w:val="left" w:pos="567"/>
+        </w:tabs>
+        <w:spacing w:after="200" w:line="360" w:lineRule="auto"/>
+        <w:ind w:left="1425"/>
+        <w:jc w:val="center"/>
+      </w:pPr>
+      <w:r>
+        <w:rPr>
+          <w:noProof/>
+        </w:rPr>
+        <w:drawing>
+          <wp:inline distT="0" distB="0" distL="0" distR="0" wp14:anchorId="363A4631" wp14:editId="2AA60B6F">
+            <wp:extent cx="4881563" cy="3905250"/>
+            <wp:effectExtent l="0" t="0" r="0" b="0"/>
+            <wp:docPr id="1342890574" name="Imagem 1"/>
+            <wp:cNvGraphicFramePr>
+              <a:graphicFrameLocks xmlns:a="http://schemas.openxmlformats.org/drawingml/2006/main" noChangeAspect="1"/>
+            </wp:cNvGraphicFramePr>
+            <a:graphic xmlns:a="http://schemas.openxmlformats.org/drawingml/2006/main">
+              <a:graphicData uri="http://schemas.openxmlformats.org/drawingml/2006/picture">
+                <pic:pic xmlns:pic="http://schemas.openxmlformats.org/drawingml/2006/picture">
+                  <pic:nvPicPr>
+                    <pic:cNvPr id="1342890574" name=""/>
+                    <pic:cNvPicPr/>
+                  </pic:nvPicPr>
+                  <pic:blipFill>
+                    <a:blip r:embed="rId16"/>
+                    <a:stretch>
+                      <a:fillRect/>
+                    </a:stretch>
+                  </pic:blipFill>
+                  <pic:spPr>
+                    <a:xfrm>
+                      <a:off x="0" y="0"/>
+                      <a:ext cx="4884087" cy="3907269"/>
+                    </a:xfrm>
+                    <a:prstGeom prst="rect">
+                      <a:avLst/>
+                    </a:prstGeom>
+                  </pic:spPr>
+                </pic:pic>
+              </a:graphicData>
+            </a:graphic>
+          </wp:inline>
+        </w:drawing>
+      </w:r>
+    </w:p>
+    <w:p>
+      <w:pPr>
+        <w:pStyle w:val="Legenda"/>
+      </w:pPr>
+      <w:r>
+        <w:t xml:space="preserve">Figura </w:t>
+      </w:r>
+      <w:r>
+        <w:fldChar w:fldCharType="begin"/>
+      </w:r>
+      <w:r>
+        <w:instrText xml:space="preserve"> SEQ Figura \* ARABIC </w:instrText>
+      </w:r>
+      <w:r>
+        <w:fldChar w:fldCharType="separate"/>
+      </w:r>
+      <w:r>
+        <w:rPr>
+          <w:noProof/>
+        </w:rPr>
+        <w:t>9</w:t>
+      </w:r>
+      <w:r>
+        <w:fldChar w:fldCharType="end"/>
+      </w:r>
+      <w:r>
+        <w:t xml:space="preserve"> Classe Pessoa Service</w:t>
+      </w:r>
+    </w:p>
+    <w:p/>
+    <w:p>
+      <w:pPr>
+        <w:widowControl/>
+        <w:tabs>
+          <w:tab w:val="left" w:pos="567"/>
+        </w:tabs>
+        <w:spacing w:after="200" w:line="360" w:lineRule="auto"/>
+        <w:ind w:left="1425"/>
+      </w:pPr>
+      <w:r>
+        <w:t xml:space="preserve">Ao final da atividade, foi possível organizar melhor o </w:t>
+      </w:r>
+      <w:proofErr w:type="spellStart"/>
+      <w:r>
+        <w:t>backend</w:t>
+      </w:r>
+      <w:proofErr w:type="spellEnd"/>
+      <w:r>
+        <w:t xml:space="preserve">, separando as responsabilidades entre </w:t>
+      </w:r>
+      <w:proofErr w:type="spellStart"/>
+      <w:r>
+        <w:t>Controller</w:t>
+      </w:r>
+      <w:proofErr w:type="spellEnd"/>
+      <w:r>
+        <w:t xml:space="preserve"> e Service, tornando o sistema mais estruturado e preparado para o gerenciamento de clientes, fornecedores e funcionários.</w:t>
+      </w:r>
     </w:p>
     <w:p>
       <w:pPr>
@@ -6403,8 +7131,8 @@
       </w:pPr>
     </w:p>
     <w:sectPr>
-      <w:headerReference w:type="default" r:id="rId14"/>
-      <w:footerReference w:type="default" r:id="rId15"/>
+      <w:headerReference w:type="default" r:id="rId17"/>
+      <w:footerReference w:type="default" r:id="rId18"/>
       <w:pgSz w:w="11920" w:h="16860"/>
       <w:pgMar w:top="1701" w:right="1134" w:bottom="1134" w:left="1701" w:header="284" w:footer="624" w:gutter="0"/>
       <w:pgNumType w:start="1"/>
@@ -7285,6 +8013,7 @@
   <w:style w:type="paragraph" w:default="1" w:styleId="Normal">
     <w:name w:val="Normal"/>
     <w:qFormat/>
+    <w:rsid w:val="0056315D"/>
   </w:style>
   <w:style w:type="paragraph" w:styleId="Ttulo1">
     <w:name w:val="heading 1"/>
@@ -7409,7 +8138,6 @@
   <w:style w:type="character" w:default="1" w:styleId="Fontepargpadro">
     <w:name w:val="Default Paragraph Font"/>
     <w:uiPriority w:val="1"/>
-    <w:semiHidden/>
     <w:unhideWhenUsed/>
   </w:style>
   <w:style w:type="table" w:default="1" w:styleId="Tabelanormal">
@@ -7653,13 +8381,13 @@
     <w:uiPriority w:val="35"/>
     <w:unhideWhenUsed/>
     <w:qFormat/>
-    <w:rsid w:val="004213AD"/>
+    <w:rsid w:val="00460F23"/>
     <w:pPr>
       <w:jc w:val="center"/>
     </w:pPr>
     <w:rPr>
-      <w:i/>
-      <w:iCs/>
+      <w:b/>
+      <w:bCs/>
       <w:color w:val="000000" w:themeColor="text1"/>
       <w:sz w:val="16"/>
       <w:szCs w:val="18"/>

</xml_diff>

<commit_message>
Relatorio dia 24/08 (#78)
Co-authored-by: zack-reis <261482095+zack-reis@users.noreply.github.com>
</commit_message>
<xml_diff>
--- a/doc/_RELATORIOS DE ATIV. PRATICAS - GRUPO 04.docx
+++ b/doc/_RELATORIOS DE ATIV. PRATICAS - GRUPO 04.docx
@@ -1,6 +1,6 @@
 
 <file path=word/document.xml><?xml version="1.0" encoding="utf-8"?>
-<w:document xmlns:wpc="http://schemas.microsoft.com/office/word/2010/wordprocessingCanvas" xmlns:cx="http://schemas.microsoft.com/office/drawing/2014/chartex" xmlns:cx1="http://schemas.microsoft.com/office/drawing/2015/9/8/chartex" xmlns:cx2="http://schemas.microsoft.com/office/drawing/2015/10/21/chartex" xmlns:cx3="http://schemas.microsoft.com/office/drawing/2016/5/9/chartex" xmlns:cx4="http://schemas.microsoft.com/office/drawing/2016/5/10/chartex" xmlns:cx5="http://schemas.microsoft.com/office/drawing/2016/5/11/chartex" xmlns:cx6="http://schemas.microsoft.com/office/drawing/2016/5/12/chartex" xmlns:cx7="http://schemas.microsoft.com/office/drawing/2016/5/13/chartex" xmlns:cx8="http://schemas.microsoft.com/office/drawing/2016/5/14/chartex" xmlns:mc="http://schemas.openxmlformats.org/markup-compatibility/2006" xmlns:aink="http://schemas.microsoft.com/office/drawing/2016/ink" xmlns:am3d="http://schemas.microsoft.com/office/drawing/2017/model3d" xmlns:o="urn:schemas-microsoft-com:office:office" xmlns:oel="http://schemas.microsoft.com/office/2019/extlst" xmlns:r="http://schemas.openxmlformats.org/officeDocument/2006/relationships" xmlns:m="http://schemas.openxmlformats.org/officeDocument/2006/math" xmlns:v="urn:schemas-microsoft-com:vml" xmlns:wp14="http://schemas.microsoft.com/office/word/2010/wordprocessingDrawing" xmlns:wp="http://schemas.openxmlformats.org/drawingml/2006/wordprocessingDrawing" xmlns:w10="urn:schemas-microsoft-com:office:word" xmlns:w="http://schemas.openxmlformats.org/wordprocessingml/2006/main" xmlns:w14="http://schemas.microsoft.com/office/word/2010/wordml" xmlns:w15="http://schemas.microsoft.com/office/word/2012/wordml" xmlns:w16cei="http://schemas.microsoft.com/office/word/2026/wordml/cei" xmlns:w16cex="http://schemas.microsoft.com/office/word/2018/wordml/cex" xmlns:w16cid="http://schemas.microsoft.com/office/word/2016/wordml/cid" xmlns:w16="http://schemas.microsoft.com/office/word/2018/wordml" xmlns:w16du="http://schemas.microsoft.com/office/word/2023/wordml/word16du" xmlns:w16sdtdh="http://schemas.microsoft.com/office/word/2020/wordml/sdtdatahash" xmlns:w16sdtfl="http://schemas.microsoft.com/office/word/2024/wordml/sdtformatlock" xmlns:w16se="http://schemas.microsoft.com/office/word/2015/wordml/symex" xmlns:wpg="http://schemas.microsoft.com/office/word/2010/wordprocessingGroup" xmlns:wpi="http://schemas.microsoft.com/office/word/2010/wordprocessingInk" xmlns:wne="http://schemas.microsoft.com/office/word/2006/wordml" xmlns:wps="http://schemas.microsoft.com/office/word/2010/wordprocessingShape" mc:Ignorable="w14 w15 w16se w16cid w16 w16cex w16sdtdh w16sdtfl w16du wp14">
+<w:document xmlns:wpc="http://schemas.microsoft.com/office/word/2010/wordprocessingCanvas" xmlns:cx="http://schemas.microsoft.com/office/drawing/2014/chartex" xmlns:cx1="http://schemas.microsoft.com/office/drawing/2015/9/8/chartex" xmlns:cx2="http://schemas.microsoft.com/office/drawing/2015/10/21/chartex" xmlns:cx3="http://schemas.microsoft.com/office/drawing/2016/5/9/chartex" xmlns:cx4="http://schemas.microsoft.com/office/drawing/2016/5/10/chartex" xmlns:cx5="http://schemas.microsoft.com/office/drawing/2016/5/11/chartex" xmlns:cx6="http://schemas.microsoft.com/office/drawing/2016/5/12/chartex" xmlns:cx7="http://schemas.microsoft.com/office/drawing/2016/5/13/chartex" xmlns:cx8="http://schemas.microsoft.com/office/drawing/2016/5/14/chartex" xmlns:mc="http://schemas.openxmlformats.org/markup-compatibility/2006" xmlns:aink="http://schemas.microsoft.com/office/drawing/2016/ink" xmlns:am3d="http://schemas.microsoft.com/office/drawing/2017/model3d" xmlns:o="urn:schemas-microsoft-com:office:office" xmlns:oel="http://schemas.microsoft.com/office/2019/extlst" xmlns:r="http://schemas.openxmlformats.org/officeDocument/2006/relationships" xmlns:m="http://schemas.openxmlformats.org/officeDocument/2006/math" xmlns:v="urn:schemas-microsoft-com:vml" xmlns:wp14="http://schemas.microsoft.com/office/word/2010/wordprocessingDrawing" xmlns:wp="http://schemas.openxmlformats.org/drawingml/2006/wordprocessingDrawing" xmlns:w10="urn:schemas-microsoft-com:office:word" xmlns:w="http://schemas.openxmlformats.org/wordprocessingml/2006/main" xmlns:w14="http://schemas.microsoft.com/office/word/2010/wordml" xmlns:w15="http://schemas.microsoft.com/office/word/2012/wordml" xmlns:w16cex="http://schemas.microsoft.com/office/word/2018/wordml/cex" xmlns:w16cid="http://schemas.microsoft.com/office/word/2016/wordml/cid" xmlns:w16="http://schemas.microsoft.com/office/word/2018/wordml" xmlns:w16du="http://schemas.microsoft.com/office/word/2023/wordml/word16du" xmlns:w16sdtdh="http://schemas.microsoft.com/office/word/2020/wordml/sdtdatahash" xmlns:w16sdtfl="http://schemas.microsoft.com/office/word/2024/wordml/sdtformatlock" xmlns:w16se="http://schemas.microsoft.com/office/word/2015/wordml/symex" xmlns:wpg="http://schemas.microsoft.com/office/word/2010/wordprocessingGroup" xmlns:wpi="http://schemas.microsoft.com/office/word/2010/wordprocessingInk" xmlns:wne="http://schemas.microsoft.com/office/word/2006/wordml" xmlns:wps="http://schemas.microsoft.com/office/word/2010/wordprocessingShape" mc:Ignorable="w14 w15 w16se w16cid w16 w16cex w16sdtdh w16sdtfl w16du wp14">
   <w:body>
     <w:p>
       <w:pPr>
@@ -1030,79 +1030,7 @@
           <w:sz w:val="24"/>
           <w:szCs w:val="24"/>
         </w:rPr>
-        <w:t xml:space="preserve">Com essa necessidade em mente, a aula prática teve como proposta a criação do Sistema de Controle de Clientes e Pedidos voltado para o comércio de moda. Para tirar o projeto do papel, usamos Java com Spring Boot no desenvolvimento das regras de negócio, junto com </w:t>
-      </w:r>
-      <w:proofErr w:type="spellStart"/>
-      <w:r>
-        <w:rPr>
-          <w:rFonts w:ascii="Arial" w:eastAsia="Arial" w:hAnsi="Arial" w:cs="Arial"/>
-          <w:sz w:val="24"/>
-          <w:szCs w:val="24"/>
-        </w:rPr>
-        <w:t>Thymeleaf</w:t>
-      </w:r>
-      <w:proofErr w:type="spellEnd"/>
-      <w:r>
-        <w:rPr>
-          <w:rFonts w:ascii="Arial" w:eastAsia="Arial" w:hAnsi="Arial" w:cs="Arial"/>
-          <w:sz w:val="24"/>
-          <w:szCs w:val="24"/>
-        </w:rPr>
-        <w:t xml:space="preserve"> e </w:t>
-      </w:r>
-      <w:proofErr w:type="spellStart"/>
-      <w:r>
-        <w:rPr>
-          <w:rFonts w:ascii="Arial" w:eastAsia="Arial" w:hAnsi="Arial" w:cs="Arial"/>
-          <w:sz w:val="24"/>
-          <w:szCs w:val="24"/>
-        </w:rPr>
-        <w:t>Bootstrap</w:t>
-      </w:r>
-      <w:proofErr w:type="spellEnd"/>
-      <w:r>
-        <w:rPr>
-          <w:rFonts w:ascii="Arial" w:eastAsia="Arial" w:hAnsi="Arial" w:cs="Arial"/>
-          <w:sz w:val="24"/>
-          <w:szCs w:val="24"/>
-        </w:rPr>
-        <w:t xml:space="preserve"> para criar telas intuitivas, responsivas e fáceis de navegar. No banco de dados, estruturamos o MySQL para armazenar as informações com segurança, enquanto o </w:t>
-      </w:r>
-      <w:proofErr w:type="spellStart"/>
-      <w:r>
-        <w:rPr>
-          <w:rFonts w:ascii="Arial" w:eastAsia="Arial" w:hAnsi="Arial" w:cs="Arial"/>
-          <w:sz w:val="24"/>
-          <w:szCs w:val="24"/>
-        </w:rPr>
-        <w:t>Git</w:t>
-      </w:r>
-      <w:proofErr w:type="spellEnd"/>
-      <w:r>
-        <w:rPr>
-          <w:rFonts w:ascii="Arial" w:eastAsia="Arial" w:hAnsi="Arial" w:cs="Arial"/>
-          <w:sz w:val="24"/>
-          <w:szCs w:val="24"/>
-        </w:rPr>
-        <w:t xml:space="preserve"> e o GitHub foram usados durante todo o processo para </w:t>
-      </w:r>
-      <w:proofErr w:type="spellStart"/>
-      <w:r>
-        <w:rPr>
-          <w:rFonts w:ascii="Arial" w:eastAsia="Arial" w:hAnsi="Arial" w:cs="Arial"/>
-          <w:sz w:val="24"/>
-          <w:szCs w:val="24"/>
-        </w:rPr>
-        <w:t>versionar</w:t>
-      </w:r>
-      <w:proofErr w:type="spellEnd"/>
-      <w:r>
-        <w:rPr>
-          <w:rFonts w:ascii="Arial" w:eastAsia="Arial" w:hAnsi="Arial" w:cs="Arial"/>
-          <w:sz w:val="24"/>
-          <w:szCs w:val="24"/>
-        </w:rPr>
-        <w:t xml:space="preserve"> o código e registrar a evolução do trabalho.</w:t>
+        <w:t>Com essa necessidade em mente, a aula prática teve como proposta a criação do Sistema de Controle de Clientes e Pedidos voltado para o comércio de moda. Para tirar o projeto do papel, usamos Java com Spring Boot no desenvolvimento das regras de negócio, junto com Thymeleaf e Bootstrap para criar telas intuitivas, responsivas e fáceis de navegar. No banco de dados, estruturamos o MySQL para armazenar as informações com segurança, enquanto o Git e o GitHub foram usados durante todo o processo para versionar o código e registrar a evolução do trabalho.</w:t>
       </w:r>
     </w:p>
     <w:p>
@@ -1388,25 +1316,7 @@
           <w:sz w:val="24"/>
           <w:szCs w:val="24"/>
         </w:rPr>
-        <w:t xml:space="preserve">1. </w:t>
-      </w:r>
-      <w:proofErr w:type="spellStart"/>
-      <w:r>
-        <w:rPr>
-          <w:rFonts w:ascii="Arial" w:eastAsia="Arial" w:hAnsi="Arial" w:cs="Arial"/>
-          <w:sz w:val="24"/>
-          <w:szCs w:val="24"/>
-        </w:rPr>
-        <w:t>IntelliJ</w:t>
-      </w:r>
-      <w:proofErr w:type="spellEnd"/>
-      <w:r>
-        <w:rPr>
-          <w:rFonts w:ascii="Arial" w:eastAsia="Arial" w:hAnsi="Arial" w:cs="Arial"/>
-          <w:sz w:val="24"/>
-          <w:szCs w:val="24"/>
-        </w:rPr>
-        <w:t xml:space="preserve"> IDEA - IDE principal para desenvolvimento em Java</w:t>
+        <w:t>1. IntelliJ IDEA - IDE principal para desenvolvimento em Java</w:t>
       </w:r>
     </w:p>
     <w:p>
@@ -1431,25 +1341,7 @@
           <w:sz w:val="24"/>
           <w:szCs w:val="24"/>
         </w:rPr>
-        <w:t xml:space="preserve">2. </w:t>
-      </w:r>
-      <w:proofErr w:type="spellStart"/>
-      <w:r>
-        <w:rPr>
-          <w:rFonts w:ascii="Arial" w:eastAsia="Arial" w:hAnsi="Arial" w:cs="Arial"/>
-          <w:sz w:val="24"/>
-          <w:szCs w:val="24"/>
-        </w:rPr>
-        <w:t>DBeaver</w:t>
-      </w:r>
-      <w:proofErr w:type="spellEnd"/>
-      <w:r>
-        <w:rPr>
-          <w:rFonts w:ascii="Arial" w:eastAsia="Arial" w:hAnsi="Arial" w:cs="Arial"/>
-          <w:sz w:val="24"/>
-          <w:szCs w:val="24"/>
-        </w:rPr>
-        <w:t xml:space="preserve"> - Ferramenta para gerenciamento visual de bancos de dados</w:t>
+        <w:t>2. DBeaver - Ferramenta para gerenciamento visual de bancos de dados</w:t>
       </w:r>
     </w:p>
     <w:p>
@@ -1499,36 +1391,8 @@
           <w:sz w:val="24"/>
           <w:szCs w:val="24"/>
         </w:rPr>
-        <w:t xml:space="preserve">4. </w:t>
-      </w:r>
-      <w:proofErr w:type="spellStart"/>
-      <w:r>
-        <w:rPr>
-          <w:rFonts w:ascii="Arial" w:eastAsia="Arial" w:hAnsi="Arial" w:cs="Arial"/>
-          <w:sz w:val="24"/>
-          <w:szCs w:val="24"/>
-        </w:rPr>
-        <w:t>Git</w:t>
-      </w:r>
-      <w:proofErr w:type="spellEnd"/>
-      <w:r>
-        <w:rPr>
-          <w:rFonts w:ascii="Arial" w:eastAsia="Arial" w:hAnsi="Arial" w:cs="Arial"/>
-          <w:sz w:val="24"/>
-          <w:szCs w:val="24"/>
-        </w:rPr>
-        <w:t xml:space="preserve"> e GitHub Desktop - Interface gráfica para controle de versão com </w:t>
-      </w:r>
-      <w:proofErr w:type="spellStart"/>
-      <w:r>
-        <w:rPr>
-          <w:rFonts w:ascii="Arial" w:eastAsia="Arial" w:hAnsi="Arial" w:cs="Arial"/>
-          <w:sz w:val="24"/>
-          <w:szCs w:val="24"/>
-        </w:rPr>
-        <w:t>Git</w:t>
-      </w:r>
-      <w:proofErr w:type="spellEnd"/>
+        <w:t>4. Git e GitHub Desktop - Interface gráfica para controle de versão com Git</w:t>
+      </w:r>
     </w:p>
     <w:p>
       <w:pPr>
@@ -1763,51 +1627,15 @@
           <w:sz w:val="24"/>
           <w:szCs w:val="24"/>
         </w:rPr>
-        <w:t xml:space="preserve">Banco de </w:t>
-      </w:r>
-      <w:proofErr w:type="spellStart"/>
-      <w:r>
-        <w:rPr>
-          <w:rFonts w:ascii="Arial" w:eastAsia="Arial" w:hAnsi="Arial" w:cs="Arial"/>
-          <w:sz w:val="24"/>
-          <w:szCs w:val="24"/>
-        </w:rPr>
-        <w:t>dados</w:t>
-      </w:r>
-      <w:r>
-        <w:rPr>
-          <w:rFonts w:ascii="Arial" w:eastAsia="Arial" w:hAnsi="Arial" w:cs="Arial"/>
-          <w:sz w:val="24"/>
-          <w:szCs w:val="24"/>
-        </w:rPr>
-        <w:t>Arquitetura</w:t>
-      </w:r>
-      <w:proofErr w:type="spellEnd"/>
-      <w:r>
-        <w:rPr>
-          <w:rFonts w:ascii="Arial" w:eastAsia="Arial" w:hAnsi="Arial" w:cs="Arial"/>
-          <w:sz w:val="24"/>
-          <w:szCs w:val="24"/>
-        </w:rPr>
-        <w:t xml:space="preserve"> MVC, </w:t>
-      </w:r>
-      <w:proofErr w:type="spellStart"/>
-      <w:r>
-        <w:rPr>
-          <w:rFonts w:ascii="Arial" w:eastAsia="Arial" w:hAnsi="Arial" w:cs="Arial"/>
-          <w:sz w:val="24"/>
-          <w:szCs w:val="24"/>
-        </w:rPr>
-        <w:t>Maven</w:t>
-      </w:r>
-      <w:proofErr w:type="spellEnd"/>
-      <w:r>
-        <w:rPr>
-          <w:rFonts w:ascii="Arial" w:eastAsia="Arial" w:hAnsi="Arial" w:cs="Arial"/>
-          <w:sz w:val="24"/>
-          <w:szCs w:val="24"/>
-        </w:rPr>
-        <w:t>, Spring Boot</w:t>
+        <w:t>Banco de dados</w:t>
+      </w:r>
+      <w:r>
+        <w:rPr>
+          <w:rFonts w:ascii="Arial" w:eastAsia="Arial" w:hAnsi="Arial" w:cs="Arial"/>
+          <w:sz w:val="24"/>
+          <w:szCs w:val="24"/>
+        </w:rPr>
+        <w:t>Arquitetura MVC, Maven, Spring Boot</w:t>
       </w:r>
     </w:p>
     <w:p>
@@ -2050,43 +1878,7 @@
           <w:sz w:val="24"/>
           <w:szCs w:val="24"/>
         </w:rPr>
-        <w:t xml:space="preserve">3. Dependências do "pom.xml": foram apresentadas dependências essenciais para o desenvolvimento, como Spring Web, </w:t>
-      </w:r>
-      <w:proofErr w:type="spellStart"/>
-      <w:r>
-        <w:rPr>
-          <w:rFonts w:ascii="Arial" w:eastAsia="Arial" w:hAnsi="Arial" w:cs="Arial"/>
-          <w:sz w:val="24"/>
-          <w:szCs w:val="24"/>
-        </w:rPr>
-        <w:t>Thymeleaf</w:t>
-      </w:r>
-      <w:proofErr w:type="spellEnd"/>
-      <w:r>
-        <w:rPr>
-          <w:rFonts w:ascii="Arial" w:eastAsia="Arial" w:hAnsi="Arial" w:cs="Arial"/>
-          <w:sz w:val="24"/>
-          <w:szCs w:val="24"/>
-        </w:rPr>
-        <w:t xml:space="preserve">, Spring Data JPA, MySQL Driver e Spring Boot </w:t>
-      </w:r>
-      <w:proofErr w:type="spellStart"/>
-      <w:r>
-        <w:rPr>
-          <w:rFonts w:ascii="Arial" w:eastAsia="Arial" w:hAnsi="Arial" w:cs="Arial"/>
-          <w:sz w:val="24"/>
-          <w:szCs w:val="24"/>
-        </w:rPr>
-        <w:t>DevTools</w:t>
-      </w:r>
-      <w:proofErr w:type="spellEnd"/>
-      <w:r>
-        <w:rPr>
-          <w:rFonts w:ascii="Arial" w:eastAsia="Arial" w:hAnsi="Arial" w:cs="Arial"/>
-          <w:sz w:val="24"/>
-          <w:szCs w:val="24"/>
-        </w:rPr>
-        <w:t>.</w:t>
+        <w:t>3. Dependências do "pom.xml": foram apresentadas dependências essenciais para o desenvolvimento, como Spring Web, Thymeleaf, Spring Data JPA, MySQL Driver e Spring Boot DevTools.</w:t>
       </w:r>
     </w:p>
     <w:p>
@@ -2112,97 +1904,7 @@
           <w:szCs w:val="24"/>
         </w:rPr>
         <w:lastRenderedPageBreak/>
-        <w:t>4. Annotations: foram apresentadas as Annotations utilizadas pelo Spring e pelo JPA, como "@Service", "@</w:t>
-      </w:r>
-      <w:proofErr w:type="spellStart"/>
-      <w:r>
-        <w:rPr>
-          <w:rFonts w:ascii="Arial" w:eastAsia="Arial" w:hAnsi="Arial" w:cs="Arial"/>
-          <w:sz w:val="24"/>
-          <w:szCs w:val="24"/>
-        </w:rPr>
-        <w:t>Controller</w:t>
-      </w:r>
-      <w:proofErr w:type="spellEnd"/>
-      <w:r>
-        <w:rPr>
-          <w:rFonts w:ascii="Arial" w:eastAsia="Arial" w:hAnsi="Arial" w:cs="Arial"/>
-          <w:sz w:val="24"/>
-          <w:szCs w:val="24"/>
-        </w:rPr>
-        <w:t>", "@</w:t>
-      </w:r>
-      <w:proofErr w:type="spellStart"/>
-      <w:r>
-        <w:rPr>
-          <w:rFonts w:ascii="Arial" w:eastAsia="Arial" w:hAnsi="Arial" w:cs="Arial"/>
-          <w:sz w:val="24"/>
-          <w:szCs w:val="24"/>
-        </w:rPr>
-        <w:t>RequestMapping</w:t>
-      </w:r>
-      <w:proofErr w:type="spellEnd"/>
-      <w:r>
-        <w:rPr>
-          <w:rFonts w:ascii="Arial" w:eastAsia="Arial" w:hAnsi="Arial" w:cs="Arial"/>
-          <w:sz w:val="24"/>
-          <w:szCs w:val="24"/>
-        </w:rPr>
-        <w:t>", "@</w:t>
-      </w:r>
-      <w:proofErr w:type="spellStart"/>
-      <w:r>
-        <w:rPr>
-          <w:rFonts w:ascii="Arial" w:eastAsia="Arial" w:hAnsi="Arial" w:cs="Arial"/>
-          <w:sz w:val="24"/>
-          <w:szCs w:val="24"/>
-        </w:rPr>
-        <w:t>GetMapping</w:t>
-      </w:r>
-      <w:proofErr w:type="spellEnd"/>
-      <w:r>
-        <w:rPr>
-          <w:rFonts w:ascii="Arial" w:eastAsia="Arial" w:hAnsi="Arial" w:cs="Arial"/>
-          <w:sz w:val="24"/>
-          <w:szCs w:val="24"/>
-        </w:rPr>
-        <w:t>", "@</w:t>
-      </w:r>
-      <w:proofErr w:type="spellStart"/>
-      <w:r>
-        <w:rPr>
-          <w:rFonts w:ascii="Arial" w:eastAsia="Arial" w:hAnsi="Arial" w:cs="Arial"/>
-          <w:sz w:val="24"/>
-          <w:szCs w:val="24"/>
-        </w:rPr>
-        <w:t>PostMapping</w:t>
-      </w:r>
-      <w:proofErr w:type="spellEnd"/>
-      <w:r>
-        <w:rPr>
-          <w:rFonts w:ascii="Arial" w:eastAsia="Arial" w:hAnsi="Arial" w:cs="Arial"/>
-          <w:sz w:val="24"/>
-          <w:szCs w:val="24"/>
-        </w:rPr>
-        <w:t>", "@</w:t>
-      </w:r>
-      <w:proofErr w:type="spellStart"/>
-      <w:r>
-        <w:rPr>
-          <w:rFonts w:ascii="Arial" w:eastAsia="Arial" w:hAnsi="Arial" w:cs="Arial"/>
-          <w:sz w:val="24"/>
-          <w:szCs w:val="24"/>
-        </w:rPr>
-        <w:t>Autowired</w:t>
-      </w:r>
-      <w:proofErr w:type="spellEnd"/>
-      <w:r>
-        <w:rPr>
-          <w:rFonts w:ascii="Arial" w:eastAsia="Arial" w:hAnsi="Arial" w:cs="Arial"/>
-          <w:sz w:val="24"/>
-          <w:szCs w:val="24"/>
-        </w:rPr>
-        <w:t>", "@Entity" e "@Id".</w:t>
+        <w:t>4. Annotations: foram apresentadas as Annotations utilizadas pelo Spring e pelo JPA, como "@Service", "@Controller", "@RequestMapping", "@GetMapping", "@PostMapping", "@Autowired", "@Entity" e "@Id".</w:t>
       </w:r>
     </w:p>
     <w:p>
@@ -2277,43 +1979,7 @@
           <w:sz w:val="24"/>
           <w:szCs w:val="24"/>
         </w:rPr>
-        <w:t xml:space="preserve">Foi realizada a configuração da estrutura inicial do projeto utilizando Spring Boot e Maven, com foco na inclusão e compreensão das principais dependências no arquivo pom.xml. Foram apresentadas dependências como Spring Web, </w:t>
-      </w:r>
-      <w:proofErr w:type="spellStart"/>
-      <w:r>
-        <w:rPr>
-          <w:rFonts w:ascii="Arial" w:eastAsia="Arial" w:hAnsi="Arial" w:cs="Arial"/>
-          <w:sz w:val="24"/>
-          <w:szCs w:val="24"/>
-        </w:rPr>
-        <w:t>Thymeleaf</w:t>
-      </w:r>
-      <w:proofErr w:type="spellEnd"/>
-      <w:r>
-        <w:rPr>
-          <w:rFonts w:ascii="Arial" w:eastAsia="Arial" w:hAnsi="Arial" w:cs="Arial"/>
-          <w:sz w:val="24"/>
-          <w:szCs w:val="24"/>
-        </w:rPr>
-        <w:t xml:space="preserve">, Spring Data JPA, MySQL Driver e Spring Boot </w:t>
-      </w:r>
-      <w:proofErr w:type="spellStart"/>
-      <w:r>
-        <w:rPr>
-          <w:rFonts w:ascii="Arial" w:eastAsia="Arial" w:hAnsi="Arial" w:cs="Arial"/>
-          <w:sz w:val="24"/>
-          <w:szCs w:val="24"/>
-        </w:rPr>
-        <w:t>DevTools</w:t>
-      </w:r>
-      <w:proofErr w:type="spellEnd"/>
-      <w:r>
-        <w:rPr>
-          <w:rFonts w:ascii="Arial" w:eastAsia="Arial" w:hAnsi="Arial" w:cs="Arial"/>
-          <w:sz w:val="24"/>
-          <w:szCs w:val="24"/>
-        </w:rPr>
-        <w:t>, entendendo a função de cada uma no desenvolvimento da aplicação.</w:t>
+        <w:t>Foi realizada a configuração da estrutura inicial do projeto utilizando Spring Boot e Maven, com foco na inclusão e compreensão das principais dependências no arquivo pom.xml. Foram apresentadas dependências como Spring Web, Thymeleaf, Spring Data JPA, MySQL Driver e Spring Boot DevTools, entendendo a função de cada uma no desenvolvimento da aplicação.</w:t>
       </w:r>
     </w:p>
     <w:p>
@@ -2496,25 +2162,7 @@
           <w:sz w:val="24"/>
           <w:szCs w:val="24"/>
         </w:rPr>
-        <w:t xml:space="preserve">Tema: Controle de Versão com </w:t>
-      </w:r>
-      <w:proofErr w:type="spellStart"/>
-      <w:r>
-        <w:rPr>
-          <w:rFonts w:ascii="Arial" w:eastAsia="Arial" w:hAnsi="Arial" w:cs="Arial"/>
-          <w:sz w:val="24"/>
-          <w:szCs w:val="24"/>
-        </w:rPr>
-        <w:t>Git</w:t>
-      </w:r>
-      <w:proofErr w:type="spellEnd"/>
-      <w:r>
-        <w:rPr>
-          <w:rFonts w:ascii="Arial" w:eastAsia="Arial" w:hAnsi="Arial" w:cs="Arial"/>
-          <w:sz w:val="24"/>
-          <w:szCs w:val="24"/>
-        </w:rPr>
-        <w:t xml:space="preserve"> e GitHub</w:t>
+        <w:t>Tema: Controle de Versão com Git e GitHub</w:t>
       </w:r>
     </w:p>
     <w:p>
@@ -2565,25 +2213,7 @@
           <w:szCs w:val="24"/>
         </w:rPr>
         <w:lastRenderedPageBreak/>
-        <w:t xml:space="preserve">Aprender a utilizar a ferramenta </w:t>
-      </w:r>
-      <w:proofErr w:type="spellStart"/>
-      <w:r>
-        <w:rPr>
-          <w:rFonts w:ascii="Arial" w:eastAsia="Arial" w:hAnsi="Arial" w:cs="Arial"/>
-          <w:sz w:val="24"/>
-          <w:szCs w:val="24"/>
-        </w:rPr>
-        <w:t>Git</w:t>
-      </w:r>
-      <w:proofErr w:type="spellEnd"/>
-      <w:r>
-        <w:rPr>
-          <w:rFonts w:ascii="Arial" w:eastAsia="Arial" w:hAnsi="Arial" w:cs="Arial"/>
-          <w:sz w:val="24"/>
-          <w:szCs w:val="24"/>
-        </w:rPr>
-        <w:t xml:space="preserve"> de forma mais aprofundada, com foco no trabalho em equipe para o projeto final.</w:t>
+        <w:t>Aprender a utilizar a ferramenta Git de forma mais aprofundada, com foco no trabalho em equipe para o projeto final.</w:t>
       </w:r>
     </w:p>
     <w:p>
@@ -2633,79 +2263,7 @@
           <w:sz w:val="24"/>
           <w:szCs w:val="24"/>
         </w:rPr>
-        <w:t xml:space="preserve">1. Conceitos de </w:t>
-      </w:r>
-      <w:proofErr w:type="spellStart"/>
-      <w:r>
-        <w:rPr>
-          <w:rFonts w:ascii="Arial" w:eastAsia="Arial" w:hAnsi="Arial" w:cs="Arial"/>
-          <w:sz w:val="24"/>
-          <w:szCs w:val="24"/>
-        </w:rPr>
-        <w:t>Git</w:t>
-      </w:r>
-      <w:proofErr w:type="spellEnd"/>
-      <w:r>
-        <w:rPr>
-          <w:rFonts w:ascii="Arial" w:eastAsia="Arial" w:hAnsi="Arial" w:cs="Arial"/>
-          <w:sz w:val="24"/>
-          <w:szCs w:val="24"/>
-        </w:rPr>
-        <w:t xml:space="preserve">: </w:t>
-      </w:r>
-      <w:proofErr w:type="spellStart"/>
-      <w:r>
-        <w:rPr>
-          <w:rFonts w:ascii="Arial" w:eastAsia="Arial" w:hAnsi="Arial" w:cs="Arial"/>
-          <w:sz w:val="24"/>
-          <w:szCs w:val="24"/>
-        </w:rPr>
-        <w:t>commit</w:t>
-      </w:r>
-      <w:proofErr w:type="spellEnd"/>
-      <w:r>
-        <w:rPr>
-          <w:rFonts w:ascii="Arial" w:eastAsia="Arial" w:hAnsi="Arial" w:cs="Arial"/>
-          <w:sz w:val="24"/>
-          <w:szCs w:val="24"/>
-        </w:rPr>
-        <w:t xml:space="preserve">, </w:t>
-      </w:r>
-      <w:proofErr w:type="spellStart"/>
-      <w:r>
-        <w:rPr>
-          <w:rFonts w:ascii="Arial" w:eastAsia="Arial" w:hAnsi="Arial" w:cs="Arial"/>
-          <w:sz w:val="24"/>
-          <w:szCs w:val="24"/>
-        </w:rPr>
-        <w:t>push</w:t>
-      </w:r>
-      <w:proofErr w:type="spellEnd"/>
-      <w:r>
-        <w:rPr>
-          <w:rFonts w:ascii="Arial" w:eastAsia="Arial" w:hAnsi="Arial" w:cs="Arial"/>
-          <w:sz w:val="24"/>
-          <w:szCs w:val="24"/>
-        </w:rPr>
-        <w:t xml:space="preserve">, </w:t>
-      </w:r>
-      <w:proofErr w:type="spellStart"/>
-      <w:r>
-        <w:rPr>
-          <w:rFonts w:ascii="Arial" w:eastAsia="Arial" w:hAnsi="Arial" w:cs="Arial"/>
-          <w:sz w:val="24"/>
-          <w:szCs w:val="24"/>
-        </w:rPr>
-        <w:t>pull</w:t>
-      </w:r>
-      <w:proofErr w:type="spellEnd"/>
-      <w:r>
-        <w:rPr>
-          <w:rFonts w:ascii="Arial" w:eastAsia="Arial" w:hAnsi="Arial" w:cs="Arial"/>
-          <w:sz w:val="24"/>
-          <w:szCs w:val="24"/>
-        </w:rPr>
-        <w:t>, clone</w:t>
+        <w:t>1. Conceitos de Git: commit, push, pull, clone</w:t>
       </w:r>
     </w:p>
     <w:p>
@@ -2730,25 +2288,7 @@
           <w:sz w:val="24"/>
           <w:szCs w:val="24"/>
         </w:rPr>
-        <w:t xml:space="preserve">2. Uso do GitHub Desktop: clonar repositórios, criar </w:t>
-      </w:r>
-      <w:proofErr w:type="spellStart"/>
-      <w:r>
-        <w:rPr>
-          <w:rFonts w:ascii="Arial" w:eastAsia="Arial" w:hAnsi="Arial" w:cs="Arial"/>
-          <w:sz w:val="24"/>
-          <w:szCs w:val="24"/>
-        </w:rPr>
-        <w:t>commits</w:t>
-      </w:r>
-      <w:proofErr w:type="spellEnd"/>
-      <w:r>
-        <w:rPr>
-          <w:rFonts w:ascii="Arial" w:eastAsia="Arial" w:hAnsi="Arial" w:cs="Arial"/>
-          <w:sz w:val="24"/>
-          <w:szCs w:val="24"/>
-        </w:rPr>
-        <w:t xml:space="preserve"> e enviar alterações</w:t>
+        <w:t>2. Uso do GitHub Desktop: clonar repositórios, criar commits e enviar alterações</w:t>
       </w:r>
     </w:p>
     <w:p>
@@ -2880,25 +2420,7 @@
           <w:sz w:val="24"/>
           <w:szCs w:val="24"/>
         </w:rPr>
-        <w:t xml:space="preserve">3. Branches: Criação e utilização de </w:t>
-      </w:r>
-      <w:proofErr w:type="spellStart"/>
-      <w:r>
-        <w:rPr>
-          <w:rFonts w:ascii="Arial" w:eastAsia="Arial" w:hAnsi="Arial" w:cs="Arial"/>
-          <w:sz w:val="24"/>
-          <w:szCs w:val="24"/>
-        </w:rPr>
-        <w:t>branches</w:t>
-      </w:r>
-      <w:proofErr w:type="spellEnd"/>
-      <w:r>
-        <w:rPr>
-          <w:rFonts w:ascii="Arial" w:eastAsia="Arial" w:hAnsi="Arial" w:cs="Arial"/>
-          <w:sz w:val="24"/>
-          <w:szCs w:val="24"/>
-        </w:rPr>
-        <w:t xml:space="preserve"> para desenvolvimento paralelo</w:t>
+        <w:t>3. Branches: Criação e utilização de branches para desenvolvimento paralelo</w:t>
       </w:r>
     </w:p>
     <w:p>
@@ -2923,25 +2445,7 @@
           <w:sz w:val="24"/>
           <w:szCs w:val="24"/>
         </w:rPr>
-        <w:t>4. Boas Práticas: Importância de não trabalhar diretamente na `</w:t>
-      </w:r>
-      <w:proofErr w:type="spellStart"/>
-      <w:r>
-        <w:rPr>
-          <w:rFonts w:ascii="Arial" w:eastAsia="Arial" w:hAnsi="Arial" w:cs="Arial"/>
-          <w:sz w:val="24"/>
-          <w:szCs w:val="24"/>
-        </w:rPr>
-        <w:t>main</w:t>
-      </w:r>
-      <w:proofErr w:type="spellEnd"/>
-      <w:r>
-        <w:rPr>
-          <w:rFonts w:ascii="Arial" w:eastAsia="Arial" w:hAnsi="Arial" w:cs="Arial"/>
-          <w:sz w:val="24"/>
-          <w:szCs w:val="24"/>
-        </w:rPr>
-        <w:t>` para evitar conflitos e quebrar o projeto principal</w:t>
+        <w:t>4. Boas Práticas: Importância de não trabalhar diretamente na `main` para evitar conflitos e quebrar o projeto principal</w:t>
       </w:r>
     </w:p>
     <w:p>
@@ -2991,43 +2495,7 @@
           <w:sz w:val="24"/>
           <w:szCs w:val="24"/>
         </w:rPr>
-        <w:t xml:space="preserve">Aula prática focada em criar </w:t>
-      </w:r>
-      <w:proofErr w:type="spellStart"/>
-      <w:r>
-        <w:rPr>
-          <w:rFonts w:ascii="Arial" w:eastAsia="Arial" w:hAnsi="Arial" w:cs="Arial"/>
-          <w:sz w:val="24"/>
-          <w:szCs w:val="24"/>
-        </w:rPr>
-        <w:t>branches</w:t>
-      </w:r>
-      <w:proofErr w:type="spellEnd"/>
-      <w:r>
-        <w:rPr>
-          <w:rFonts w:ascii="Arial" w:eastAsia="Arial" w:hAnsi="Arial" w:cs="Arial"/>
-          <w:sz w:val="24"/>
-          <w:szCs w:val="24"/>
-        </w:rPr>
-        <w:t xml:space="preserve">, fazer alterações em uma </w:t>
-      </w:r>
-      <w:proofErr w:type="spellStart"/>
-      <w:r>
-        <w:rPr>
-          <w:rFonts w:ascii="Arial" w:eastAsia="Arial" w:hAnsi="Arial" w:cs="Arial"/>
-          <w:sz w:val="24"/>
-          <w:szCs w:val="24"/>
-        </w:rPr>
-        <w:t>branch</w:t>
-      </w:r>
-      <w:proofErr w:type="spellEnd"/>
-      <w:r>
-        <w:rPr>
-          <w:rFonts w:ascii="Arial" w:eastAsia="Arial" w:hAnsi="Arial" w:cs="Arial"/>
-          <w:sz w:val="24"/>
-          <w:szCs w:val="24"/>
-        </w:rPr>
-        <w:t xml:space="preserve"> separada e depois fazer o merge. O objetivo foi treinar o fluxo de trabalho em equipe.</w:t>
+        <w:t>Aula prática focada em criar branches, fazer alterações em uma branch separada e depois fazer o merge. O objetivo foi treinar o fluxo de trabalho em equipe.</w:t>
       </w:r>
     </w:p>
     <w:p>
@@ -3288,25 +2756,7 @@
           <w:sz w:val="24"/>
           <w:szCs w:val="24"/>
         </w:rPr>
-        <w:t xml:space="preserve">AULA 4 - Criação e Modelagem do Banco de Dados (DER e Script </w:t>
-      </w:r>
-      <w:proofErr w:type="gramStart"/>
-      <w:r>
-        <w:rPr>
-          <w:rFonts w:ascii="Arial" w:eastAsia="Arial" w:hAnsi="Arial" w:cs="Arial"/>
-          <w:sz w:val="24"/>
-          <w:szCs w:val="24"/>
-        </w:rPr>
-        <w:t>SQL)  e</w:t>
-      </w:r>
-      <w:proofErr w:type="gramEnd"/>
-      <w:r>
-        <w:rPr>
-          <w:rFonts w:ascii="Arial" w:eastAsia="Arial" w:hAnsi="Arial" w:cs="Arial"/>
-          <w:sz w:val="24"/>
-          <w:szCs w:val="24"/>
-        </w:rPr>
-        <w:t xml:space="preserve"> Compreender a aplicação prática do padrão arquitetural MVC</w:t>
+        <w:t>AULA 4 - Criação e Modelagem do Banco de Dados (DER e Script SQL)  e Compreender a aplicação prática do padrão arquitetural MVC</w:t>
       </w:r>
     </w:p>
     <w:p>
@@ -3733,38 +3183,8 @@
           <w:sz w:val="24"/>
           <w:szCs w:val="24"/>
         </w:rPr>
-        <w:t xml:space="preserve">Tema: Criação </w:t>
-      </w:r>
-      <w:proofErr w:type="spellStart"/>
-      <w:proofErr w:type="gramStart"/>
-      <w:r>
-        <w:rPr>
-          <w:rFonts w:ascii="Arial" w:eastAsia="Arial" w:hAnsi="Arial" w:cs="Arial"/>
-          <w:sz w:val="24"/>
-          <w:szCs w:val="24"/>
-        </w:rPr>
-        <w:t>Cliente.java,ClienteRepository</w:t>
-      </w:r>
-      <w:proofErr w:type="spellEnd"/>
-      <w:proofErr w:type="gramEnd"/>
-      <w:r>
-        <w:rPr>
-          <w:rFonts w:ascii="Arial" w:eastAsia="Arial" w:hAnsi="Arial" w:cs="Arial"/>
-          <w:sz w:val="24"/>
-          <w:szCs w:val="24"/>
-        </w:rPr>
-        <w:t xml:space="preserve"> e </w:t>
-      </w:r>
-      <w:proofErr w:type="spellStart"/>
-      <w:r>
-        <w:rPr>
-          <w:rFonts w:ascii="Arial" w:eastAsia="Arial" w:hAnsi="Arial" w:cs="Arial"/>
-          <w:sz w:val="24"/>
-          <w:szCs w:val="24"/>
-        </w:rPr>
-        <w:t>ClienteController</w:t>
-      </w:r>
-      <w:proofErr w:type="spellEnd"/>
+        <w:t>Tema: Criação Cliente.java,ClienteRepository e ClienteController</w:t>
+      </w:r>
     </w:p>
     <w:p>
       <w:pPr>
@@ -3878,25 +3298,7 @@
           <w:sz w:val="24"/>
           <w:szCs w:val="24"/>
         </w:rPr>
-        <w:t xml:space="preserve">Atributos e Chaves: definição dos atributos id, nome, </w:t>
-      </w:r>
-      <w:proofErr w:type="spellStart"/>
-      <w:r>
-        <w:rPr>
-          <w:rFonts w:ascii="Arial" w:eastAsia="Arial" w:hAnsi="Arial" w:cs="Arial"/>
-          <w:sz w:val="24"/>
-          <w:szCs w:val="24"/>
-        </w:rPr>
-        <w:t>email</w:t>
-      </w:r>
-      <w:proofErr w:type="spellEnd"/>
-      <w:r>
-        <w:rPr>
-          <w:rFonts w:ascii="Arial" w:eastAsia="Arial" w:hAnsi="Arial" w:cs="Arial"/>
-          <w:sz w:val="24"/>
-          <w:szCs w:val="24"/>
-        </w:rPr>
-        <w:t xml:space="preserve"> e telefone, utilizando @Id e @GeneratedValue para configuração da chave primária.</w:t>
+        <w:t>Atributos e Chaves: definição dos atributos id, nome, email e telefone, utilizando @Id e @GeneratedValue para configuração da chave primária.</w:t>
       </w:r>
     </w:p>
     <w:p>
@@ -3913,41 +3315,13 @@
           <w:szCs w:val="24"/>
         </w:rPr>
       </w:pPr>
-      <w:proofErr w:type="spellStart"/>
-      <w:r>
-        <w:rPr>
-          <w:rFonts w:ascii="Arial" w:eastAsia="Arial" w:hAnsi="Arial" w:cs="Arial"/>
-          <w:sz w:val="24"/>
-          <w:szCs w:val="24"/>
-        </w:rPr>
-        <w:t>ClienteRepository</w:t>
-      </w:r>
-      <w:proofErr w:type="spellEnd"/>
-      <w:r>
-        <w:rPr>
-          <w:rFonts w:ascii="Arial" w:eastAsia="Arial" w:hAnsi="Arial" w:cs="Arial"/>
-          <w:sz w:val="24"/>
-          <w:szCs w:val="24"/>
-        </w:rPr>
-        <w:t xml:space="preserve">: criação do repositório utilizando </w:t>
-      </w:r>
-      <w:proofErr w:type="spellStart"/>
-      <w:r>
-        <w:rPr>
-          <w:rFonts w:ascii="Arial" w:eastAsia="Arial" w:hAnsi="Arial" w:cs="Arial"/>
-          <w:sz w:val="24"/>
-          <w:szCs w:val="24"/>
-        </w:rPr>
-        <w:t>JpaRepository</w:t>
-      </w:r>
-      <w:proofErr w:type="spellEnd"/>
-      <w:r>
-        <w:rPr>
-          <w:rFonts w:ascii="Arial" w:eastAsia="Arial" w:hAnsi="Arial" w:cs="Arial"/>
-          <w:sz w:val="24"/>
-          <w:szCs w:val="24"/>
-        </w:rPr>
-        <w:t>, permitindo realizar operações como salvar, consultar e excluir clientes no banco de dados.</w:t>
+      <w:r>
+        <w:rPr>
+          <w:rFonts w:ascii="Arial" w:eastAsia="Arial" w:hAnsi="Arial" w:cs="Arial"/>
+          <w:sz w:val="24"/>
+          <w:szCs w:val="24"/>
+        </w:rPr>
+        <w:t>ClienteRepository: criação do repositório utilizando JpaRepository, permitindo realizar operações como salvar, consultar e excluir clientes no banco de dados.</w:t>
       </w:r>
     </w:p>
     <w:p>
@@ -3964,7 +3338,6 @@
           <w:szCs w:val="24"/>
         </w:rPr>
       </w:pPr>
-      <w:proofErr w:type="spellStart"/>
       <w:r>
         <w:rPr>
           <w:rFonts w:ascii="Arial" w:eastAsia="Arial" w:hAnsi="Arial" w:cs="Arial"/>
@@ -3972,34 +3345,7 @@
           <w:szCs w:val="24"/>
         </w:rPr>
         <w:lastRenderedPageBreak/>
-        <w:t>ClienteController</w:t>
-      </w:r>
-      <w:proofErr w:type="spellEnd"/>
-      <w:r>
-        <w:rPr>
-          <w:rFonts w:ascii="Arial" w:eastAsia="Arial" w:hAnsi="Arial" w:cs="Arial"/>
-          <w:sz w:val="24"/>
-          <w:szCs w:val="24"/>
-        </w:rPr>
-        <w:t xml:space="preserve">: atualização do </w:t>
-      </w:r>
-      <w:proofErr w:type="spellStart"/>
-      <w:r>
-        <w:rPr>
-          <w:rFonts w:ascii="Arial" w:eastAsia="Arial" w:hAnsi="Arial" w:cs="Arial"/>
-          <w:sz w:val="24"/>
-          <w:szCs w:val="24"/>
-        </w:rPr>
-        <w:t>Controller</w:t>
-      </w:r>
-      <w:proofErr w:type="spellEnd"/>
-      <w:r>
-        <w:rPr>
-          <w:rFonts w:ascii="Arial" w:eastAsia="Arial" w:hAnsi="Arial" w:cs="Arial"/>
-          <w:sz w:val="24"/>
-          <w:szCs w:val="24"/>
-        </w:rPr>
-        <w:t xml:space="preserve"> para receber requisições da aplicação e realizar operações de cadastro, consulta, exclusão e paginação dos clientes.</w:t>
+        <w:t>ClienteController: atualização do Controller para receber requisições da aplicação e realizar operações de cadastro, consulta, exclusão e paginação dos clientes.</w:t>
       </w:r>
     </w:p>
     <w:p>
@@ -4083,43 +3429,7 @@
           <w:sz w:val="24"/>
           <w:szCs w:val="24"/>
         </w:rPr>
-        <w:t xml:space="preserve">Foi realizada uma reunião com o docente para organizar as ideias e acompanhar o andamento do projeto. Durante a aula, foram esclarecidas dúvidas e recebidas orientações sobre as próximas etapas do desenvolvimento. Em seguida, a equipe iniciou a implementação da funcionalidade de clientes, realizando atualizações no arquivo </w:t>
-      </w:r>
-      <w:proofErr w:type="spellStart"/>
-      <w:r>
-        <w:rPr>
-          <w:rFonts w:ascii="Arial" w:eastAsia="Arial" w:hAnsi="Arial" w:cs="Arial"/>
-          <w:sz w:val="24"/>
-          <w:szCs w:val="24"/>
-        </w:rPr>
-        <w:t>ClienteController</w:t>
-      </w:r>
-      <w:proofErr w:type="spellEnd"/>
-      <w:r>
-        <w:rPr>
-          <w:rFonts w:ascii="Arial" w:eastAsia="Arial" w:hAnsi="Arial" w:cs="Arial"/>
-          <w:sz w:val="24"/>
-          <w:szCs w:val="24"/>
-        </w:rPr>
-        <w:t xml:space="preserve">, criando o </w:t>
-      </w:r>
-      <w:proofErr w:type="spellStart"/>
-      <w:r>
-        <w:rPr>
-          <w:rFonts w:ascii="Arial" w:eastAsia="Arial" w:hAnsi="Arial" w:cs="Arial"/>
-          <w:sz w:val="24"/>
-          <w:szCs w:val="24"/>
-        </w:rPr>
-        <w:t>ClienteRepository</w:t>
-      </w:r>
-      <w:proofErr w:type="spellEnd"/>
-      <w:r>
-        <w:rPr>
-          <w:rFonts w:ascii="Arial" w:eastAsia="Arial" w:hAnsi="Arial" w:cs="Arial"/>
-          <w:sz w:val="24"/>
-          <w:szCs w:val="24"/>
-        </w:rPr>
-        <w:t xml:space="preserve"> e desenvolvendo a classe Cliente. Também foi trabalhada a integração entre essas classes, preparando a aplicação para realizar o cadastro, consulta, paginação e exclusão de clientes.</w:t>
+        <w:t>Foi realizada uma reunião com o docente para organizar as ideias e acompanhar o andamento do projeto. Durante a aula, foram esclarecidas dúvidas e recebidas orientações sobre as próximas etapas do desenvolvimento. Em seguida, a equipe iniciou a implementação da funcionalidade de clientes, realizando atualizações no arquivo ClienteController, criando o ClienteRepository e desenvolvendo a classe Cliente. Também foi trabalhada a integração entre essas classes, preparando a aplicação para realizar o cadastro, consulta, paginação e exclusão de clientes.</w:t>
       </w:r>
     </w:p>
     <w:p>
@@ -4356,25 +3666,7 @@
           <w:sz w:val="24"/>
           <w:szCs w:val="24"/>
         </w:rPr>
-        <w:t xml:space="preserve">Dar continuidade ao desenvolvimento do sistema de controle para a loja de moda, implementando a estrutura do </w:t>
-      </w:r>
-      <w:proofErr w:type="spellStart"/>
-      <w:r>
-        <w:rPr>
-          <w:rFonts w:ascii="Arial" w:eastAsia="Arial" w:hAnsi="Arial" w:cs="Arial"/>
-          <w:sz w:val="24"/>
-          <w:szCs w:val="24"/>
-        </w:rPr>
-        <w:t>backend</w:t>
-      </w:r>
-      <w:proofErr w:type="spellEnd"/>
-      <w:r>
-        <w:rPr>
-          <w:rFonts w:ascii="Arial" w:eastAsia="Arial" w:hAnsi="Arial" w:cs="Arial"/>
-          <w:sz w:val="24"/>
-          <w:szCs w:val="24"/>
-        </w:rPr>
-        <w:t xml:space="preserve"> responsável pelo gerenciamento de pessoas, clientes, funcionários, fornecedores e categorias</w:t>
+        <w:t>Dar continuidade ao desenvolvimento do sistema de controle para a loja de moda, implementando a estrutura do backend responsável pelo gerenciamento de pessoas, clientes, funcionários, fornecedores e categorias</w:t>
       </w:r>
       <w:r>
         <w:rPr>
@@ -4453,59 +3745,13 @@
           <w:szCs w:val="24"/>
         </w:rPr>
       </w:pPr>
-      <w:proofErr w:type="spellStart"/>
-      <w:r>
-        <w:rPr>
-          <w:rFonts w:ascii="Arial" w:eastAsia="Arial" w:hAnsi="Arial" w:cs="Arial"/>
-          <w:sz w:val="24"/>
-          <w:szCs w:val="24"/>
-        </w:rPr>
-        <w:t>PessoaRepository</w:t>
-      </w:r>
-      <w:proofErr w:type="spellEnd"/>
-      <w:r>
-        <w:rPr>
-          <w:rFonts w:ascii="Arial" w:eastAsia="Arial" w:hAnsi="Arial" w:cs="Arial"/>
-          <w:sz w:val="24"/>
-          <w:szCs w:val="24"/>
-        </w:rPr>
-        <w:t xml:space="preserve">: criação e configuração do </w:t>
-      </w:r>
-      <w:proofErr w:type="spellStart"/>
-      <w:r>
-        <w:rPr>
-          <w:rFonts w:ascii="Arial" w:eastAsia="Arial" w:hAnsi="Arial" w:cs="Arial"/>
-          <w:sz w:val="24"/>
-          <w:szCs w:val="24"/>
-        </w:rPr>
-        <w:t>PessoaRepository</w:t>
-      </w:r>
-      <w:proofErr w:type="spellEnd"/>
-      <w:r>
-        <w:rPr>
-          <w:rFonts w:ascii="Arial" w:eastAsia="Arial" w:hAnsi="Arial" w:cs="Arial"/>
-          <w:sz w:val="24"/>
-          <w:szCs w:val="24"/>
-        </w:rPr>
-        <w:t xml:space="preserve">, utilizando </w:t>
-      </w:r>
-      <w:proofErr w:type="spellStart"/>
-      <w:r>
-        <w:rPr>
-          <w:rFonts w:ascii="Arial" w:eastAsia="Arial" w:hAnsi="Arial" w:cs="Arial"/>
-          <w:sz w:val="24"/>
-          <w:szCs w:val="24"/>
-        </w:rPr>
-        <w:t>JpaRepository</w:t>
-      </w:r>
-      <w:proofErr w:type="spellEnd"/>
-      <w:r>
-        <w:rPr>
-          <w:rFonts w:ascii="Arial" w:eastAsia="Arial" w:hAnsi="Arial" w:cs="Arial"/>
-          <w:sz w:val="24"/>
-          <w:szCs w:val="24"/>
-        </w:rPr>
-        <w:t>, possibilitando realizar operações de persistência, consulta, alteração e exclusão dos registros da tabela pessoa.</w:t>
+      <w:r>
+        <w:rPr>
+          <w:rFonts w:ascii="Arial" w:eastAsia="Arial" w:hAnsi="Arial" w:cs="Arial"/>
+          <w:sz w:val="24"/>
+          <w:szCs w:val="24"/>
+        </w:rPr>
+        <w:t>PessoaRepository: criação e configuração do PessoaRepository, utilizando JpaRepository, possibilitando realizar operações de persistência, consulta, alteração e exclusão dos registros da tabela pessoa.</w:t>
       </w:r>
     </w:p>
     <w:p>
@@ -4544,25 +3790,7 @@
           <w:sz w:val="24"/>
           <w:szCs w:val="24"/>
         </w:rPr>
-        <w:t xml:space="preserve"> Repository permitindo que as informações recebidas pela aplicação sejam processadas pelo </w:t>
-      </w:r>
-      <w:proofErr w:type="spellStart"/>
-      <w:r>
-        <w:rPr>
-          <w:rFonts w:ascii="Arial" w:eastAsia="Arial" w:hAnsi="Arial" w:cs="Arial"/>
-          <w:sz w:val="24"/>
-          <w:szCs w:val="24"/>
-        </w:rPr>
-        <w:t>backend</w:t>
-      </w:r>
-      <w:proofErr w:type="spellEnd"/>
-      <w:r>
-        <w:rPr>
-          <w:rFonts w:ascii="Arial" w:eastAsia="Arial" w:hAnsi="Arial" w:cs="Arial"/>
-          <w:sz w:val="24"/>
-          <w:szCs w:val="24"/>
-        </w:rPr>
-        <w:t xml:space="preserve"> e posteriormente armazenadas ou consultadas no banco de dados.</w:t>
+        <w:t xml:space="preserve"> Repository permitindo que as informações recebidas pela aplicação sejam processadas pelo backend e posteriormente armazenadas ou consultadas no banco de dados.</w:t>
       </w:r>
     </w:p>
     <w:p>
@@ -4608,25 +3836,7 @@
           <w:sz w:val="24"/>
           <w:szCs w:val="24"/>
         </w:rPr>
-        <w:t xml:space="preserve">Durante a aula, foi dada continuidade ao desenvolvimento do </w:t>
-      </w:r>
-      <w:proofErr w:type="spellStart"/>
-      <w:r>
-        <w:rPr>
-          <w:rFonts w:ascii="Arial" w:eastAsia="Arial" w:hAnsi="Arial" w:cs="Arial"/>
-          <w:sz w:val="24"/>
-          <w:szCs w:val="24"/>
-        </w:rPr>
-        <w:t>backend</w:t>
-      </w:r>
-      <w:proofErr w:type="spellEnd"/>
-      <w:r>
-        <w:rPr>
-          <w:rFonts w:ascii="Arial" w:eastAsia="Arial" w:hAnsi="Arial" w:cs="Arial"/>
-          <w:sz w:val="24"/>
-          <w:szCs w:val="24"/>
-        </w:rPr>
-        <w:t xml:space="preserve"> do sistema da loja de moda. Inicialmente, foi realizada a implementação e configuração da classe Pessoa, responsável pelo mapeamento da tabela pessoa existente no banco de dados. Foram configurados os atributos da entidade e suas respectivas anotações do </w:t>
+        <w:t xml:space="preserve">Durante a aula, foi dada continuidade ao desenvolvimento do backend do sistema da loja de moda. Inicialmente, foi realizada a implementação e configuração da classe Pessoa, responsável pelo mapeamento da tabela pessoa existente no banco de dados. Foram configurados os atributos da entidade e suas respectivas anotações do </w:t>
       </w:r>
       <w:r>
         <w:rPr>
@@ -4757,43 +3967,7 @@
           <w:sz w:val="24"/>
           <w:szCs w:val="24"/>
         </w:rPr>
-        <w:t xml:space="preserve"> seguida, foi desenvolvido o </w:t>
-      </w:r>
-      <w:proofErr w:type="spellStart"/>
-      <w:r>
-        <w:rPr>
-          <w:rFonts w:ascii="Arial" w:eastAsia="Arial" w:hAnsi="Arial" w:cs="Arial"/>
-          <w:sz w:val="24"/>
-          <w:szCs w:val="24"/>
-        </w:rPr>
-        <w:t>PessoaRepository</w:t>
-      </w:r>
-      <w:proofErr w:type="spellEnd"/>
-      <w:r>
-        <w:rPr>
-          <w:rFonts w:ascii="Arial" w:eastAsia="Arial" w:hAnsi="Arial" w:cs="Arial"/>
-          <w:sz w:val="24"/>
-          <w:szCs w:val="24"/>
-        </w:rPr>
-        <w:t xml:space="preserve">, utilizando o </w:t>
-      </w:r>
-      <w:proofErr w:type="spellStart"/>
-      <w:r>
-        <w:rPr>
-          <w:rFonts w:ascii="Arial" w:eastAsia="Arial" w:hAnsi="Arial" w:cs="Arial"/>
-          <w:sz w:val="24"/>
-          <w:szCs w:val="24"/>
-        </w:rPr>
-        <w:t>JpaRepository</w:t>
-      </w:r>
-      <w:proofErr w:type="spellEnd"/>
-      <w:r>
-        <w:rPr>
-          <w:rFonts w:ascii="Arial" w:eastAsia="Arial" w:hAnsi="Arial" w:cs="Arial"/>
-          <w:sz w:val="24"/>
-          <w:szCs w:val="24"/>
-        </w:rPr>
-        <w:t xml:space="preserve"> para disponibilizar as operações de acesso aos registros da tabela pessoa. Também foram realizadas configurações para </w:t>
+        <w:t xml:space="preserve"> seguida, foi desenvolvido o PessoaRepository, utilizando o JpaRepository para disponibilizar as operações de acesso aos registros da tabela pessoa. Também foram realizadas configurações para </w:t>
       </w:r>
       <w:r>
         <w:rPr>
@@ -4929,61 +4103,7 @@
           <w:sz w:val="24"/>
           <w:szCs w:val="24"/>
         </w:rPr>
-        <w:t xml:space="preserve">Ao final da atividade, foi possível avançar na construção do </w:t>
-      </w:r>
-      <w:proofErr w:type="spellStart"/>
-      <w:r>
-        <w:rPr>
-          <w:rFonts w:ascii="Arial" w:eastAsia="Arial" w:hAnsi="Arial" w:cs="Arial"/>
-          <w:sz w:val="24"/>
-          <w:szCs w:val="24"/>
-        </w:rPr>
-        <w:t>backend</w:t>
-      </w:r>
-      <w:proofErr w:type="spellEnd"/>
-      <w:r>
-        <w:rPr>
-          <w:rFonts w:ascii="Arial" w:eastAsia="Arial" w:hAnsi="Arial" w:cs="Arial"/>
-          <w:sz w:val="24"/>
-          <w:szCs w:val="24"/>
-        </w:rPr>
-        <w:t xml:space="preserve"> e compreender de forma prática como as entidades, </w:t>
-      </w:r>
-      <w:proofErr w:type="spellStart"/>
-      <w:r>
-        <w:rPr>
-          <w:rFonts w:ascii="Arial" w:eastAsia="Arial" w:hAnsi="Arial" w:cs="Arial"/>
-          <w:sz w:val="24"/>
-          <w:szCs w:val="24"/>
-        </w:rPr>
-        <w:t>repositories</w:t>
-      </w:r>
-      <w:proofErr w:type="spellEnd"/>
-      <w:r>
-        <w:rPr>
-          <w:rFonts w:ascii="Arial" w:eastAsia="Arial" w:hAnsi="Arial" w:cs="Arial"/>
-          <w:sz w:val="24"/>
-          <w:szCs w:val="24"/>
-        </w:rPr>
-        <w:t xml:space="preserve"> e </w:t>
-      </w:r>
-      <w:proofErr w:type="spellStart"/>
-      <w:r>
-        <w:rPr>
-          <w:rFonts w:ascii="Arial" w:eastAsia="Arial" w:hAnsi="Arial" w:cs="Arial"/>
-          <w:sz w:val="24"/>
-          <w:szCs w:val="24"/>
-        </w:rPr>
-        <w:t>controllers</w:t>
-      </w:r>
-      <w:proofErr w:type="spellEnd"/>
-      <w:r>
-        <w:rPr>
-          <w:rFonts w:ascii="Arial" w:eastAsia="Arial" w:hAnsi="Arial" w:cs="Arial"/>
-          <w:sz w:val="24"/>
-          <w:szCs w:val="24"/>
-        </w:rPr>
-        <w:t xml:space="preserve"> trabalham em conjunto para realizar o gerenciamento dos dados da aplicação.</w:t>
+        <w:t>Ao final da atividade, foi possível avançar na construção do backend e compreender de forma prática como as entidades, repositories e controllers trabalham em conjunto para realizar o gerenciamento dos dados da aplicação.</w:t>
       </w:r>
     </w:p>
     <w:p>
@@ -5009,13 +4129,7 @@
         <w:ind w:left="1425"/>
       </w:pPr>
       <w:r>
-        <w:t>Da</w:t>
-      </w:r>
-      <w:r>
-        <w:t>t</w:t>
-      </w:r>
-      <w:r>
-        <w:t>a: 21/08/2026</w:t>
+        <w:t>Data: 21/08/2026</w:t>
       </w:r>
     </w:p>
     <w:p>
@@ -5028,23 +4142,7 @@
         <w:ind w:left="1425"/>
       </w:pPr>
       <w:r>
-        <w:t xml:space="preserve">Tema: Desenvolvimento das classes </w:t>
-      </w:r>
-      <w:proofErr w:type="spellStart"/>
-      <w:r>
-        <w:t>PessoaController</w:t>
-      </w:r>
-      <w:proofErr w:type="spellEnd"/>
-      <w:r>
-        <w:t xml:space="preserve"> e </w:t>
-      </w:r>
-      <w:proofErr w:type="spellStart"/>
-      <w:r>
-        <w:t>PessoaService</w:t>
-      </w:r>
-      <w:proofErr w:type="spellEnd"/>
-      <w:r>
-        <w:t>.</w:t>
+        <w:t>Tema: Desenvolvimento das classes PessoaController e PessoaService.</w:t>
       </w:r>
     </w:p>
     <w:p>
@@ -5070,23 +4168,7 @@
         <w:ind w:left="1425"/>
       </w:pPr>
       <w:r>
-        <w:t xml:space="preserve">Dar continuidade ao desenvolvimento do </w:t>
-      </w:r>
-      <w:proofErr w:type="spellStart"/>
-      <w:r>
-        <w:t>backend</w:t>
-      </w:r>
-      <w:proofErr w:type="spellEnd"/>
-      <w:r>
-        <w:t xml:space="preserve"> da loja de moda, implementando as camadas </w:t>
-      </w:r>
-      <w:proofErr w:type="spellStart"/>
-      <w:r>
-        <w:t>Controller</w:t>
-      </w:r>
-      <w:proofErr w:type="spellEnd"/>
-      <w:r>
-        <w:t xml:space="preserve"> e Service para organizar o gerenciamento de clientes, fornecedores e funcionários.</w:t>
+        <w:t>Dar continuidade ao desenvolvimento do backend da loja de moda, implementando as camadas Controller e Service para organizar o gerenciamento de clientes, fornecedores e funcionários.</w:t>
       </w:r>
     </w:p>
     <w:p>
@@ -5111,21 +4193,8 @@
         <w:spacing w:after="200" w:line="360" w:lineRule="auto"/>
         <w:ind w:left="1425"/>
       </w:pPr>
-      <w:proofErr w:type="spellStart"/>
-      <w:r>
-        <w:t>PessoaController</w:t>
-      </w:r>
-      <w:proofErr w:type="spellEnd"/>
-      <w:r>
-        <w:t xml:space="preserve">: desenvolvimento do </w:t>
-      </w:r>
-      <w:proofErr w:type="spellStart"/>
-      <w:r>
-        <w:t>controller</w:t>
-      </w:r>
-      <w:proofErr w:type="spellEnd"/>
-      <w:r>
-        <w:t xml:space="preserve"> responsável por receber as requisições da aplicação e realizar operações de cadastro, consulta, atualização e exclusão de pessoas.</w:t>
+      <w:r>
+        <w:t>PessoaController: desenvolvimento do controller responsável por receber as requisições da aplicação e realizar operações de cadastro, consulta, atualização e exclusão de pessoas.</w:t>
       </w:r>
     </w:p>
     <w:p>
@@ -5151,21 +4220,8 @@
         <w:spacing w:after="200" w:line="360" w:lineRule="auto"/>
         <w:ind w:left="1425"/>
       </w:pPr>
-      <w:proofErr w:type="spellStart"/>
-      <w:r>
-        <w:t>PessoaService</w:t>
-      </w:r>
-      <w:proofErr w:type="spellEnd"/>
-      <w:r>
-        <w:t xml:space="preserve">: criação do pacote </w:t>
-      </w:r>
-      <w:proofErr w:type="spellStart"/>
-      <w:r>
-        <w:t>service</w:t>
-      </w:r>
-      <w:proofErr w:type="spellEnd"/>
-      <w:r>
-        <w:t xml:space="preserve"> e desenvolvimento da classe responsável por organizar as regras de negócio relacionadas às pessoas.</w:t>
+      <w:r>
+        <w:t>PessoaService: criação do pacote service e desenvolvimento da classe responsável por organizar as regras de negócio relacionadas às pessoas.</w:t>
       </w:r>
     </w:p>
     <w:p>
@@ -5204,15 +4260,7 @@
         <w:ind w:left="1425"/>
       </w:pPr>
       <w:r>
-        <w:t xml:space="preserve">Durante a aula, foi desenvolvido o </w:t>
-      </w:r>
-      <w:proofErr w:type="spellStart"/>
-      <w:r>
-        <w:t>PessoaController</w:t>
-      </w:r>
-      <w:proofErr w:type="spellEnd"/>
-      <w:r>
-        <w:t>, responsável pelo gerenciamento das requisições relacionadas às pessoas cadastradas no sistema. Foram implementadas funcionalidades para listar, consultar, cadastrar, atualizar e excluir registros, além da diferenciação entre clientes, fornecedores e funcionários.</w:t>
+        <w:t>Durante a aula, foi desenvolvido o PessoaController, responsável pelo gerenciamento das requisições relacionadas às pessoas cadastradas no sistema. Foram implementadas funcionalidades para listar, consultar, cadastrar, atualizar e excluir registros, além da diferenciação entre clientes, fornecedores e funcionários.</w:t>
       </w:r>
     </w:p>
     <w:p>
@@ -5313,13 +4361,8 @@
         <w:fldChar w:fldCharType="end"/>
       </w:r>
       <w:r>
-        <w:t xml:space="preserve"> Classe Pessoa </w:t>
-      </w:r>
-      <w:proofErr w:type="spellStart"/>
-      <w:r>
-        <w:t>Controller</w:t>
-      </w:r>
-      <w:proofErr w:type="spellEnd"/>
+        <w:t xml:space="preserve"> Classe Pessoa Controller</w:t>
+      </w:r>
     </w:p>
     <w:p>
       <w:pPr>
@@ -5332,23 +4375,7 @@
       </w:pPr>
       <w:r>
         <w:lastRenderedPageBreak/>
-        <w:t xml:space="preserve">Em seguida, foi criado o pacote </w:t>
-      </w:r>
-      <w:proofErr w:type="spellStart"/>
-      <w:r>
-        <w:t>service</w:t>
-      </w:r>
-      <w:proofErr w:type="spellEnd"/>
-      <w:r>
-        <w:t xml:space="preserve"> e desenvolvida a classe </w:t>
-      </w:r>
-      <w:proofErr w:type="spellStart"/>
-      <w:r>
-        <w:t>PessoaService</w:t>
-      </w:r>
-      <w:proofErr w:type="spellEnd"/>
-      <w:r>
-        <w:t>. Nessa classe foram organizadas as regras de negócio relacionadas ao gerenciamento das pessoas, incluindo cadastro, consulta, atualização, exclusão, validação e diferenciação dos tipos de pessoa.</w:t>
+        <w:t>Em seguida, foi criado o pacote service e desenvolvida a classe PessoaService. Nessa classe foram organizadas as regras de negócio relacionadas ao gerenciamento das pessoas, incluindo cadastro, consulta, atualização, exclusão, validação e diferenciação dos tipos de pessoa.</w:t>
       </w:r>
     </w:p>
     <w:p>
@@ -5443,87 +4470,608 @@
         <w:ind w:left="1425"/>
       </w:pPr>
       <w:r>
-        <w:t xml:space="preserve">Ao final da atividade, foi possível organizar melhor o </w:t>
-      </w:r>
-      <w:proofErr w:type="spellStart"/>
-      <w:r>
-        <w:t>backend</w:t>
-      </w:r>
-      <w:proofErr w:type="spellEnd"/>
-      <w:r>
-        <w:t xml:space="preserve">, separando as responsabilidades entre </w:t>
-      </w:r>
-      <w:proofErr w:type="spellStart"/>
-      <w:r>
-        <w:t>Controller</w:t>
-      </w:r>
-      <w:proofErr w:type="spellEnd"/>
-      <w:r>
-        <w:t xml:space="preserve"> e Service, tornando o sistema mais estruturado e preparado para o gerenciamento de clientes, fornecedores e funcionários.</w:t>
-      </w:r>
-    </w:p>
-    <w:p>
-      <w:pPr>
-        <w:widowControl/>
-        <w:pBdr>
-          <w:top w:val="nil"/>
-          <w:left w:val="nil"/>
-          <w:bottom w:val="nil"/>
-          <w:right w:val="nil"/>
-          <w:between w:val="nil"/>
-        </w:pBdr>
-        <w:tabs>
-          <w:tab w:val="left" w:pos="567"/>
-        </w:tabs>
-        <w:spacing w:after="200" w:line="360" w:lineRule="auto"/>
-        <w:rPr>
-          <w:rFonts w:ascii="Arial" w:eastAsia="Arial" w:hAnsi="Arial" w:cs="Arial"/>
-          <w:sz w:val="24"/>
-          <w:szCs w:val="24"/>
-        </w:rPr>
-      </w:pPr>
-    </w:p>
-    <w:p>
-      <w:pPr>
-        <w:widowControl/>
-        <w:pBdr>
-          <w:top w:val="nil"/>
-          <w:left w:val="nil"/>
-          <w:bottom w:val="nil"/>
-          <w:right w:val="nil"/>
-          <w:between w:val="nil"/>
-        </w:pBdr>
-        <w:tabs>
-          <w:tab w:val="left" w:pos="567"/>
-        </w:tabs>
-        <w:spacing w:after="200" w:line="360" w:lineRule="auto"/>
-        <w:rPr>
-          <w:rFonts w:ascii="Arial" w:eastAsia="Arial" w:hAnsi="Arial" w:cs="Arial"/>
-          <w:sz w:val="24"/>
-          <w:szCs w:val="24"/>
-        </w:rPr>
-      </w:pPr>
-    </w:p>
-    <w:p>
-      <w:pPr>
-        <w:widowControl/>
-        <w:pBdr>
-          <w:top w:val="nil"/>
-          <w:left w:val="nil"/>
-          <w:bottom w:val="nil"/>
-          <w:right w:val="nil"/>
-          <w:between w:val="nil"/>
-        </w:pBdr>
-        <w:tabs>
-          <w:tab w:val="left" w:pos="567"/>
-        </w:tabs>
-        <w:spacing w:after="200" w:line="360" w:lineRule="auto"/>
-        <w:rPr>
-          <w:rFonts w:ascii="Arial" w:eastAsia="Arial" w:hAnsi="Arial" w:cs="Arial"/>
-          <w:sz w:val="24"/>
-          <w:szCs w:val="24"/>
-        </w:rPr>
-      </w:pPr>
+        <w:t>Ao final da atividade, foi possível organizar melhor o backend, separando as responsabilidades entre Controller e Service, tornando o sistema mais estruturado e preparado para o gerenciamento de clientes, fornecedores e funcionários.</w:t>
+      </w:r>
+    </w:p>
+    <w:p>
+      <w:pPr>
+        <w:widowControl/>
+        <w:pBdr>
+          <w:top w:val="nil"/>
+          <w:left w:val="nil"/>
+          <w:bottom w:val="nil"/>
+          <w:right w:val="nil"/>
+          <w:between w:val="nil"/>
+        </w:pBdr>
+        <w:tabs>
+          <w:tab w:val="left" w:pos="567"/>
+        </w:tabs>
+        <w:spacing w:after="200" w:line="360" w:lineRule="auto"/>
+        <w:rPr>
+          <w:rFonts w:ascii="Arial" w:eastAsia="Arial" w:hAnsi="Arial" w:cs="Arial"/>
+          <w:sz w:val="24"/>
+          <w:szCs w:val="24"/>
+        </w:rPr>
+      </w:pPr>
+    </w:p>
+    <w:p>
+      <w:pPr>
+        <w:widowControl/>
+        <w:pBdr>
+          <w:top w:val="nil"/>
+          <w:left w:val="nil"/>
+          <w:bottom w:val="nil"/>
+          <w:right w:val="nil"/>
+          <w:between w:val="nil"/>
+        </w:pBdr>
+        <w:tabs>
+          <w:tab w:val="left" w:pos="567"/>
+        </w:tabs>
+        <w:spacing w:after="200" w:line="360" w:lineRule="auto"/>
+        <w:rPr>
+          <w:rFonts w:ascii="Arial" w:eastAsia="Arial" w:hAnsi="Arial" w:cs="Arial"/>
+          <w:sz w:val="24"/>
+          <w:szCs w:val="24"/>
+        </w:rPr>
+      </w:pPr>
+    </w:p>
+    <w:p>
+      <w:pPr>
+        <w:widowControl/>
+        <w:pBdr>
+          <w:top w:val="nil"/>
+          <w:left w:val="nil"/>
+          <w:bottom w:val="nil"/>
+          <w:right w:val="nil"/>
+          <w:between w:val="nil"/>
+        </w:pBdr>
+        <w:tabs>
+          <w:tab w:val="left" w:pos="567"/>
+        </w:tabs>
+        <w:spacing w:after="200" w:line="360" w:lineRule="auto"/>
+        <w:rPr>
+          <w:rFonts w:ascii="Arial" w:eastAsia="Arial" w:hAnsi="Arial" w:cs="Arial"/>
+          <w:sz w:val="24"/>
+          <w:szCs w:val="24"/>
+        </w:rPr>
+      </w:pPr>
+    </w:p>
+    <w:p>
+      <w:pPr>
+        <w:widowControl/>
+        <w:pBdr>
+          <w:top w:val="nil"/>
+          <w:left w:val="nil"/>
+          <w:bottom w:val="nil"/>
+          <w:right w:val="nil"/>
+          <w:between w:val="nil"/>
+        </w:pBdr>
+        <w:tabs>
+          <w:tab w:val="left" w:pos="567"/>
+        </w:tabs>
+        <w:spacing w:after="200" w:line="360" w:lineRule="auto"/>
+        <w:rPr>
+          <w:rFonts w:ascii="Arial" w:eastAsia="Arial" w:hAnsi="Arial" w:cs="Arial"/>
+          <w:sz w:val="24"/>
+          <w:szCs w:val="24"/>
+        </w:rPr>
+      </w:pPr>
+    </w:p>
+    <w:p>
+      <w:pPr>
+        <w:widowControl/>
+        <w:pBdr>
+          <w:top w:val="nil"/>
+          <w:left w:val="nil"/>
+          <w:bottom w:val="nil"/>
+          <w:right w:val="nil"/>
+          <w:between w:val="nil"/>
+        </w:pBdr>
+        <w:tabs>
+          <w:tab w:val="left" w:pos="567"/>
+        </w:tabs>
+        <w:spacing w:after="200" w:line="360" w:lineRule="auto"/>
+        <w:rPr>
+          <w:rFonts w:ascii="Arial" w:eastAsia="Arial" w:hAnsi="Arial" w:cs="Arial"/>
+          <w:sz w:val="24"/>
+          <w:szCs w:val="24"/>
+        </w:rPr>
+      </w:pPr>
+    </w:p>
+    <w:p>
+      <w:pPr>
+        <w:widowControl/>
+        <w:pBdr>
+          <w:top w:val="nil"/>
+          <w:left w:val="nil"/>
+          <w:bottom w:val="nil"/>
+          <w:right w:val="nil"/>
+          <w:between w:val="nil"/>
+        </w:pBdr>
+        <w:tabs>
+          <w:tab w:val="left" w:pos="567"/>
+        </w:tabs>
+        <w:spacing w:after="200" w:line="360" w:lineRule="auto"/>
+        <w:rPr>
+          <w:rFonts w:ascii="Arial" w:eastAsia="Arial" w:hAnsi="Arial" w:cs="Arial"/>
+          <w:sz w:val="24"/>
+          <w:szCs w:val="24"/>
+        </w:rPr>
+      </w:pPr>
+      <w:r>
+        <w:rPr>
+          <w:rFonts w:ascii="Arial" w:eastAsia="Arial" w:hAnsi="Arial" w:cs="Arial"/>
+          <w:sz w:val="24"/>
+          <w:szCs w:val="24"/>
+        </w:rPr>
+        <w:lastRenderedPageBreak/>
+        <w:t>AULA 8 – CORREÇÃO DE ERROS E PADRONIZAÇÃO DO PROJETO</w:t>
+      </w:r>
+    </w:p>
+    <w:p>
+      <w:pPr>
+        <w:widowControl/>
+        <w:pBdr>
+          <w:top w:val="nil"/>
+          <w:left w:val="nil"/>
+          <w:bottom w:val="nil"/>
+          <w:right w:val="nil"/>
+          <w:between w:val="nil"/>
+        </w:pBdr>
+        <w:tabs>
+          <w:tab w:val="left" w:pos="567"/>
+        </w:tabs>
+        <w:spacing w:after="200" w:line="360" w:lineRule="auto"/>
+        <w:rPr>
+          <w:rFonts w:ascii="Arial" w:eastAsia="Arial" w:hAnsi="Arial" w:cs="Arial"/>
+          <w:sz w:val="24"/>
+          <w:szCs w:val="24"/>
+        </w:rPr>
+      </w:pPr>
+      <w:r>
+        <w:rPr>
+          <w:rFonts w:ascii="Arial" w:eastAsia="Arial" w:hAnsi="Arial" w:cs="Arial"/>
+          <w:sz w:val="24"/>
+          <w:szCs w:val="24"/>
+        </w:rPr>
+        <w:t>Data: 24/08/2026</w:t>
+      </w:r>
+    </w:p>
+    <w:p>
+      <w:pPr>
+        <w:widowControl/>
+        <w:pBdr>
+          <w:top w:val="nil"/>
+          <w:left w:val="nil"/>
+          <w:bottom w:val="nil"/>
+          <w:right w:val="nil"/>
+          <w:between w:val="nil"/>
+        </w:pBdr>
+        <w:tabs>
+          <w:tab w:val="left" w:pos="567"/>
+        </w:tabs>
+        <w:spacing w:after="200" w:line="360" w:lineRule="auto"/>
+        <w:rPr>
+          <w:rFonts w:ascii="Arial" w:eastAsia="Arial" w:hAnsi="Arial" w:cs="Arial"/>
+          <w:sz w:val="24"/>
+          <w:szCs w:val="24"/>
+        </w:rPr>
+      </w:pPr>
+      <w:r>
+        <w:rPr>
+          <w:rFonts w:ascii="Arial" w:eastAsia="Arial" w:hAnsi="Arial" w:cs="Arial"/>
+          <w:sz w:val="24"/>
+          <w:szCs w:val="24"/>
+        </w:rPr>
+        <w:t>Tema: Correção de erros, imports e padronização dos pacotes do projeto.</w:t>
+      </w:r>
+    </w:p>
+    <w:p>
+      <w:pPr>
+        <w:widowControl/>
+        <w:pBdr>
+          <w:top w:val="nil"/>
+          <w:left w:val="nil"/>
+          <w:bottom w:val="nil"/>
+          <w:right w:val="nil"/>
+          <w:between w:val="nil"/>
+        </w:pBdr>
+        <w:tabs>
+          <w:tab w:val="left" w:pos="567"/>
+        </w:tabs>
+        <w:spacing w:after="200" w:line="360" w:lineRule="auto"/>
+        <w:rPr>
+          <w:rFonts w:ascii="Arial" w:eastAsia="Arial" w:hAnsi="Arial" w:cs="Arial"/>
+          <w:sz w:val="24"/>
+          <w:szCs w:val="24"/>
+        </w:rPr>
+      </w:pPr>
+      <w:r>
+        <w:rPr>
+          <w:rFonts w:ascii="Arial" w:eastAsia="Arial" w:hAnsi="Arial" w:cs="Arial"/>
+          <w:sz w:val="24"/>
+          <w:szCs w:val="24"/>
+        </w:rPr>
+        <w:t>Objetivo:</w:t>
+      </w:r>
+    </w:p>
+    <w:p>
+      <w:pPr>
+        <w:widowControl/>
+        <w:pBdr>
+          <w:top w:val="nil"/>
+          <w:left w:val="nil"/>
+          <w:bottom w:val="nil"/>
+          <w:right w:val="nil"/>
+          <w:between w:val="nil"/>
+        </w:pBdr>
+        <w:tabs>
+          <w:tab w:val="left" w:pos="567"/>
+        </w:tabs>
+        <w:spacing w:after="200" w:line="360" w:lineRule="auto"/>
+        <w:rPr>
+          <w:rFonts w:ascii="Arial" w:eastAsia="Arial" w:hAnsi="Arial" w:cs="Arial"/>
+          <w:sz w:val="24"/>
+          <w:szCs w:val="24"/>
+        </w:rPr>
+      </w:pPr>
+      <w:r>
+        <w:rPr>
+          <w:rFonts w:ascii="Arial" w:eastAsia="Arial" w:hAnsi="Arial" w:cs="Arial"/>
+          <w:sz w:val="24"/>
+          <w:szCs w:val="24"/>
+        </w:rPr>
+        <w:t>Identificar e corrigir os erros apresentados no projeto, principalmente problemas relacionados aos imports, referências entre arquivos e organização dos pacotes, garantindo que os arquivos e classes seguissem um padrão de nomenclatura adequado.</w:t>
+      </w:r>
+    </w:p>
+    <w:p>
+      <w:pPr>
+        <w:widowControl/>
+        <w:pBdr>
+          <w:top w:val="nil"/>
+          <w:left w:val="nil"/>
+          <w:bottom w:val="nil"/>
+          <w:right w:val="nil"/>
+          <w:between w:val="nil"/>
+        </w:pBdr>
+        <w:tabs>
+          <w:tab w:val="left" w:pos="567"/>
+        </w:tabs>
+        <w:spacing w:after="200" w:line="360" w:lineRule="auto"/>
+        <w:rPr>
+          <w:rFonts w:ascii="Arial" w:eastAsia="Arial" w:hAnsi="Arial" w:cs="Arial"/>
+          <w:sz w:val="24"/>
+          <w:szCs w:val="24"/>
+        </w:rPr>
+      </w:pPr>
+      <w:r>
+        <w:rPr>
+          <w:rFonts w:ascii="Arial" w:eastAsia="Arial" w:hAnsi="Arial" w:cs="Arial"/>
+          <w:sz w:val="24"/>
+          <w:szCs w:val="24"/>
+        </w:rPr>
+        <w:t>Conteúdo Abordado:</w:t>
+      </w:r>
+    </w:p>
+    <w:p>
+      <w:pPr>
+        <w:widowControl/>
+        <w:pBdr>
+          <w:top w:val="nil"/>
+          <w:left w:val="nil"/>
+          <w:bottom w:val="nil"/>
+          <w:right w:val="nil"/>
+          <w:between w:val="nil"/>
+        </w:pBdr>
+        <w:tabs>
+          <w:tab w:val="left" w:pos="567"/>
+        </w:tabs>
+        <w:spacing w:after="200" w:line="360" w:lineRule="auto"/>
+        <w:rPr>
+          <w:rFonts w:ascii="Arial" w:eastAsia="Arial" w:hAnsi="Arial" w:cs="Arial"/>
+          <w:sz w:val="24"/>
+          <w:szCs w:val="24"/>
+        </w:rPr>
+      </w:pPr>
+      <w:r>
+        <w:rPr>
+          <w:rFonts w:ascii="Arial" w:eastAsia="Arial" w:hAnsi="Arial" w:cs="Arial"/>
+          <w:sz w:val="24"/>
+          <w:szCs w:val="24"/>
+        </w:rPr>
+        <w:t>Identificação de erros de importação entre as classes do projeto;</w:t>
+      </w:r>
+    </w:p>
+    <w:p>
+      <w:pPr>
+        <w:widowControl/>
+        <w:pBdr>
+          <w:top w:val="nil"/>
+          <w:left w:val="nil"/>
+          <w:bottom w:val="nil"/>
+          <w:right w:val="nil"/>
+          <w:between w:val="nil"/>
+        </w:pBdr>
+        <w:tabs>
+          <w:tab w:val="left" w:pos="567"/>
+        </w:tabs>
+        <w:spacing w:after="200" w:line="360" w:lineRule="auto"/>
+        <w:rPr>
+          <w:rFonts w:ascii="Arial" w:eastAsia="Arial" w:hAnsi="Arial" w:cs="Arial"/>
+          <w:sz w:val="24"/>
+          <w:szCs w:val="24"/>
+        </w:rPr>
+      </w:pPr>
+      <w:r>
+        <w:rPr>
+          <w:rFonts w:ascii="Arial" w:eastAsia="Arial" w:hAnsi="Arial" w:cs="Arial"/>
+          <w:sz w:val="24"/>
+          <w:szCs w:val="24"/>
+        </w:rPr>
+        <w:t>Correção de referências entre diferentes arquivos;</w:t>
+      </w:r>
+    </w:p>
+    <w:p>
+      <w:pPr>
+        <w:widowControl/>
+        <w:pBdr>
+          <w:top w:val="nil"/>
+          <w:left w:val="nil"/>
+          <w:bottom w:val="nil"/>
+          <w:right w:val="nil"/>
+          <w:between w:val="nil"/>
+        </w:pBdr>
+        <w:tabs>
+          <w:tab w:val="left" w:pos="567"/>
+        </w:tabs>
+        <w:spacing w:after="200" w:line="360" w:lineRule="auto"/>
+        <w:rPr>
+          <w:rFonts w:ascii="Arial" w:eastAsia="Arial" w:hAnsi="Arial" w:cs="Arial"/>
+          <w:sz w:val="24"/>
+          <w:szCs w:val="24"/>
+        </w:rPr>
+      </w:pPr>
+      <w:r>
+        <w:rPr>
+          <w:rFonts w:ascii="Arial" w:eastAsia="Arial" w:hAnsi="Arial" w:cs="Arial"/>
+          <w:sz w:val="24"/>
+          <w:szCs w:val="24"/>
+        </w:rPr>
+        <w:t>Verificação da comunicação entre as classes e pacotes;</w:t>
+      </w:r>
+    </w:p>
+    <w:p>
+      <w:pPr>
+        <w:widowControl/>
+        <w:pBdr>
+          <w:top w:val="nil"/>
+          <w:left w:val="nil"/>
+          <w:bottom w:val="nil"/>
+          <w:right w:val="nil"/>
+          <w:between w:val="nil"/>
+        </w:pBdr>
+        <w:tabs>
+          <w:tab w:val="left" w:pos="567"/>
+        </w:tabs>
+        <w:spacing w:after="200" w:line="360" w:lineRule="auto"/>
+        <w:rPr>
+          <w:rFonts w:ascii="Arial" w:eastAsia="Arial" w:hAnsi="Arial" w:cs="Arial"/>
+          <w:sz w:val="24"/>
+          <w:szCs w:val="24"/>
+        </w:rPr>
+      </w:pPr>
+      <w:r>
+        <w:rPr>
+          <w:rFonts w:ascii="Arial" w:eastAsia="Arial" w:hAnsi="Arial" w:cs="Arial"/>
+          <w:sz w:val="24"/>
+          <w:szCs w:val="24"/>
+        </w:rPr>
+        <w:t>Padronização dos nomes dos pacotes e diretórios;</w:t>
+      </w:r>
+    </w:p>
+    <w:p>
+      <w:pPr>
+        <w:widowControl/>
+        <w:pBdr>
+          <w:top w:val="nil"/>
+          <w:left w:val="nil"/>
+          <w:bottom w:val="nil"/>
+          <w:right w:val="nil"/>
+          <w:between w:val="nil"/>
+        </w:pBdr>
+        <w:tabs>
+          <w:tab w:val="left" w:pos="567"/>
+        </w:tabs>
+        <w:spacing w:after="200" w:line="360" w:lineRule="auto"/>
+        <w:rPr>
+          <w:rFonts w:ascii="Arial" w:eastAsia="Arial" w:hAnsi="Arial" w:cs="Arial"/>
+          <w:sz w:val="24"/>
+          <w:szCs w:val="24"/>
+        </w:rPr>
+      </w:pPr>
+      <w:r>
+        <w:rPr>
+          <w:rFonts w:ascii="Arial" w:eastAsia="Arial" w:hAnsi="Arial" w:cs="Arial"/>
+          <w:sz w:val="24"/>
+          <w:szCs w:val="24"/>
+        </w:rPr>
+        <w:t>Correção da inconsistência entre o pacote servicos e as classes que utilizavam o nome servico;</w:t>
+      </w:r>
+    </w:p>
+    <w:p>
+      <w:pPr>
+        <w:widowControl/>
+        <w:pBdr>
+          <w:top w:val="nil"/>
+          <w:left w:val="nil"/>
+          <w:bottom w:val="nil"/>
+          <w:right w:val="nil"/>
+          <w:between w:val="nil"/>
+        </w:pBdr>
+        <w:tabs>
+          <w:tab w:val="left" w:pos="567"/>
+        </w:tabs>
+        <w:spacing w:after="200" w:line="360" w:lineRule="auto"/>
+        <w:rPr>
+          <w:rFonts w:ascii="Arial" w:eastAsia="Arial" w:hAnsi="Arial" w:cs="Arial"/>
+          <w:sz w:val="24"/>
+          <w:szCs w:val="24"/>
+        </w:rPr>
+      </w:pPr>
+      <w:r>
+        <w:rPr>
+          <w:rFonts w:ascii="Arial" w:eastAsia="Arial" w:hAnsi="Arial" w:cs="Arial"/>
+          <w:sz w:val="24"/>
+          <w:szCs w:val="24"/>
+        </w:rPr>
+        <w:t>Renomeação das pastas e adequação das classes para manter um único padrão;</w:t>
+      </w:r>
+    </w:p>
+    <w:p>
+      <w:pPr>
+        <w:widowControl/>
+        <w:pBdr>
+          <w:top w:val="nil"/>
+          <w:left w:val="nil"/>
+          <w:bottom w:val="nil"/>
+          <w:right w:val="nil"/>
+          <w:between w:val="nil"/>
+        </w:pBdr>
+        <w:tabs>
+          <w:tab w:val="left" w:pos="567"/>
+        </w:tabs>
+        <w:spacing w:after="200" w:line="360" w:lineRule="auto"/>
+        <w:rPr>
+          <w:rFonts w:ascii="Arial" w:eastAsia="Arial" w:hAnsi="Arial" w:cs="Arial"/>
+          <w:sz w:val="24"/>
+          <w:szCs w:val="24"/>
+        </w:rPr>
+      </w:pPr>
+      <w:r>
+        <w:rPr>
+          <w:rFonts w:ascii="Arial" w:eastAsia="Arial" w:hAnsi="Arial" w:cs="Arial"/>
+          <w:sz w:val="24"/>
+          <w:szCs w:val="24"/>
+        </w:rPr>
+        <w:t>Verificação das funcionalidades após as correções.</w:t>
+      </w:r>
+    </w:p>
+    <w:p>
+      <w:pPr>
+        <w:widowControl/>
+        <w:pBdr>
+          <w:top w:val="nil"/>
+          <w:left w:val="nil"/>
+          <w:bottom w:val="nil"/>
+          <w:right w:val="nil"/>
+          <w:between w:val="nil"/>
+        </w:pBdr>
+        <w:tabs>
+          <w:tab w:val="left" w:pos="567"/>
+        </w:tabs>
+        <w:spacing w:after="200" w:line="360" w:lineRule="auto"/>
+        <w:rPr>
+          <w:rFonts w:ascii="Arial" w:eastAsia="Arial" w:hAnsi="Arial" w:cs="Arial"/>
+          <w:sz w:val="24"/>
+          <w:szCs w:val="24"/>
+        </w:rPr>
+      </w:pPr>
+      <w:r>
+        <w:rPr>
+          <w:rFonts w:ascii="Arial" w:eastAsia="Arial" w:hAnsi="Arial" w:cs="Arial"/>
+          <w:sz w:val="24"/>
+          <w:szCs w:val="24"/>
+        </w:rPr>
+        <w:t>Atividades Realizadas:</w:t>
+      </w:r>
+    </w:p>
+    <w:p>
+      <w:pPr>
+        <w:widowControl/>
+        <w:pBdr>
+          <w:top w:val="nil"/>
+          <w:left w:val="nil"/>
+          <w:bottom w:val="nil"/>
+          <w:right w:val="nil"/>
+          <w:between w:val="nil"/>
+        </w:pBdr>
+        <w:tabs>
+          <w:tab w:val="left" w:pos="567"/>
+        </w:tabs>
+        <w:spacing w:after="200" w:line="360" w:lineRule="auto"/>
+        <w:rPr>
+          <w:rFonts w:ascii="Arial" w:eastAsia="Arial" w:hAnsi="Arial" w:cs="Arial"/>
+          <w:sz w:val="24"/>
+          <w:szCs w:val="24"/>
+        </w:rPr>
+      </w:pPr>
+      <w:r>
+        <w:rPr>
+          <w:rFonts w:ascii="Arial" w:eastAsia="Arial" w:hAnsi="Arial" w:cs="Arial"/>
+          <w:sz w:val="24"/>
+          <w:szCs w:val="24"/>
+        </w:rPr>
+        <w:t>Durante a aula, o grupo concentrou seus esforços na identificação e correção dos erros que estavam impedindo o funcionamento adequado do projeto. Foram encontrados problemas relacionados aos imports e às referências entre diferentes arquivos, fazendo com que algumas classes e funções não fossem reconhecidas corretamente.</w:t>
+      </w:r>
+    </w:p>
+    <w:p>
+      <w:pPr>
+        <w:widowControl/>
+        <w:pBdr>
+          <w:top w:val="nil"/>
+          <w:left w:val="nil"/>
+          <w:bottom w:val="nil"/>
+          <w:right w:val="nil"/>
+          <w:between w:val="nil"/>
+        </w:pBdr>
+        <w:tabs>
+          <w:tab w:val="left" w:pos="567"/>
+        </w:tabs>
+        <w:spacing w:after="200" w:line="360" w:lineRule="auto"/>
+        <w:rPr>
+          <w:rFonts w:ascii="Arial" w:eastAsia="Arial" w:hAnsi="Arial" w:cs="Arial"/>
+          <w:sz w:val="24"/>
+          <w:szCs w:val="24"/>
+        </w:rPr>
+      </w:pPr>
+      <w:r>
+        <w:rPr>
+          <w:rFonts w:ascii="Arial" w:eastAsia="Arial" w:hAnsi="Arial" w:cs="Arial"/>
+          <w:sz w:val="24"/>
+          <w:szCs w:val="24"/>
+        </w:rPr>
+        <w:lastRenderedPageBreak/>
+        <w:t>Também foi identificada uma inconsistência na nomenclatura dos pacotes de serviços. A pasta estava nomeada como servicos, enquanto algumas classes utilizavam servico, causando conflitos e erros de referência. Para solucionar o problema, foram renomeadas as pastas e ajustadas as referências necessárias, buscando manter um padrão único de nomenclatura em todo o projeto.</w:t>
+      </w:r>
+    </w:p>
+    <w:p>
+      <w:pPr>
+        <w:widowControl/>
+        <w:pBdr>
+          <w:top w:val="nil"/>
+          <w:left w:val="nil"/>
+          <w:bottom w:val="nil"/>
+          <w:right w:val="nil"/>
+          <w:between w:val="nil"/>
+        </w:pBdr>
+        <w:tabs>
+          <w:tab w:val="left" w:pos="567"/>
+        </w:tabs>
+        <w:spacing w:after="200" w:line="360" w:lineRule="auto"/>
+        <w:rPr>
+          <w:rFonts w:ascii="Arial" w:eastAsia="Arial" w:hAnsi="Arial" w:cs="Arial"/>
+          <w:sz w:val="24"/>
+          <w:szCs w:val="24"/>
+        </w:rPr>
+      </w:pPr>
+      <w:r>
+        <w:rPr>
+          <w:rFonts w:ascii="Arial" w:eastAsia="Arial" w:hAnsi="Arial" w:cs="Arial"/>
+          <w:sz w:val="24"/>
+          <w:szCs w:val="24"/>
+        </w:rPr>
+        <w:t>Após as alterações, o grupo realizou novas verificações para identificar outros erros e garantir que as classes e funcionalidades voltassem a se comunicar corretamente.</w:t>
+      </w:r>
     </w:p>
     <w:p>
       <w:pPr>
@@ -6824,6 +6372,7 @@
           <w:sz w:val="24"/>
           <w:szCs w:val="24"/>
         </w:rPr>
+        <w:lastRenderedPageBreak/>
         <w:t>Utilizar a ABNT como norma.</w:t>
       </w:r>
     </w:p>
@@ -7143,7 +6692,7 @@
 </file>
 
 <file path=word/endnotes.xml><?xml version="1.0" encoding="utf-8"?>
-<w:endnotes xmlns:wpc="http://schemas.microsoft.com/office/word/2010/wordprocessingCanvas" xmlns:cx="http://schemas.microsoft.com/office/drawing/2014/chartex" xmlns:cx1="http://schemas.microsoft.com/office/drawing/2015/9/8/chartex" xmlns:cx2="http://schemas.microsoft.com/office/drawing/2015/10/21/chartex" xmlns:cx3="http://schemas.microsoft.com/office/drawing/2016/5/9/chartex" xmlns:cx4="http://schemas.microsoft.com/office/drawing/2016/5/10/chartex" xmlns:cx5="http://schemas.microsoft.com/office/drawing/2016/5/11/chartex" xmlns:cx6="http://schemas.microsoft.com/office/drawing/2016/5/12/chartex" xmlns:cx7="http://schemas.microsoft.com/office/drawing/2016/5/13/chartex" xmlns:cx8="http://schemas.microsoft.com/office/drawing/2016/5/14/chartex" xmlns:mc="http://schemas.openxmlformats.org/markup-compatibility/2006" xmlns:aink="http://schemas.microsoft.com/office/drawing/2016/ink" xmlns:am3d="http://schemas.microsoft.com/office/drawing/2017/model3d" xmlns:o="urn:schemas-microsoft-com:office:office" xmlns:oel="http://schemas.microsoft.com/office/2019/extlst" xmlns:r="http://schemas.openxmlformats.org/officeDocument/2006/relationships" xmlns:m="http://schemas.openxmlformats.org/officeDocument/2006/math" xmlns:v="urn:schemas-microsoft-com:vml" xmlns:wp14="http://schemas.microsoft.com/office/word/2010/wordprocessingDrawing" xmlns:wp="http://schemas.openxmlformats.org/drawingml/2006/wordprocessingDrawing" xmlns:w10="urn:schemas-microsoft-com:office:word" xmlns:w="http://schemas.openxmlformats.org/wordprocessingml/2006/main" xmlns:w14="http://schemas.microsoft.com/office/word/2010/wordml" xmlns:w15="http://schemas.microsoft.com/office/word/2012/wordml" xmlns:w16cei="http://schemas.microsoft.com/office/word/2026/wordml/cei" xmlns:w16cex="http://schemas.microsoft.com/office/word/2018/wordml/cex" xmlns:w16cid="http://schemas.microsoft.com/office/word/2016/wordml/cid" xmlns:w16="http://schemas.microsoft.com/office/word/2018/wordml" xmlns:w16du="http://schemas.microsoft.com/office/word/2023/wordml/word16du" xmlns:w16sdtdh="http://schemas.microsoft.com/office/word/2020/wordml/sdtdatahash" xmlns:w16sdtfl="http://schemas.microsoft.com/office/word/2024/wordml/sdtformatlock" xmlns:w16se="http://schemas.microsoft.com/office/word/2015/wordml/symex" xmlns:wpg="http://schemas.microsoft.com/office/word/2010/wordprocessingGroup" xmlns:wpi="http://schemas.microsoft.com/office/word/2010/wordprocessingInk" xmlns:wne="http://schemas.microsoft.com/office/word/2006/wordml" xmlns:wps="http://schemas.microsoft.com/office/word/2010/wordprocessingShape" mc:Ignorable="w14 w15 w16se w16cid w16 w16cex w16sdtdh w16sdtfl w16du wp14">
+<w:endnotes xmlns:wpc="http://schemas.microsoft.com/office/word/2010/wordprocessingCanvas" xmlns:cx="http://schemas.microsoft.com/office/drawing/2014/chartex" xmlns:cx1="http://schemas.microsoft.com/office/drawing/2015/9/8/chartex" xmlns:cx2="http://schemas.microsoft.com/office/drawing/2015/10/21/chartex" xmlns:cx3="http://schemas.microsoft.com/office/drawing/2016/5/9/chartex" xmlns:cx4="http://schemas.microsoft.com/office/drawing/2016/5/10/chartex" xmlns:cx5="http://schemas.microsoft.com/office/drawing/2016/5/11/chartex" xmlns:cx6="http://schemas.microsoft.com/office/drawing/2016/5/12/chartex" xmlns:cx7="http://schemas.microsoft.com/office/drawing/2016/5/13/chartex" xmlns:cx8="http://schemas.microsoft.com/office/drawing/2016/5/14/chartex" xmlns:mc="http://schemas.openxmlformats.org/markup-compatibility/2006" xmlns:aink="http://schemas.microsoft.com/office/drawing/2016/ink" xmlns:am3d="http://schemas.microsoft.com/office/drawing/2017/model3d" xmlns:o="urn:schemas-microsoft-com:office:office" xmlns:oel="http://schemas.microsoft.com/office/2019/extlst" xmlns:r="http://schemas.openxmlformats.org/officeDocument/2006/relationships" xmlns:m="http://schemas.openxmlformats.org/officeDocument/2006/math" xmlns:v="urn:schemas-microsoft-com:vml" xmlns:wp14="http://schemas.microsoft.com/office/word/2010/wordprocessingDrawing" xmlns:wp="http://schemas.openxmlformats.org/drawingml/2006/wordprocessingDrawing" xmlns:w10="urn:schemas-microsoft-com:office:word" xmlns:w="http://schemas.openxmlformats.org/wordprocessingml/2006/main" xmlns:w14="http://schemas.microsoft.com/office/word/2010/wordml" xmlns:w15="http://schemas.microsoft.com/office/word/2012/wordml" xmlns:w16cex="http://schemas.microsoft.com/office/word/2018/wordml/cex" xmlns:w16cid="http://schemas.microsoft.com/office/word/2016/wordml/cid" xmlns:w16="http://schemas.microsoft.com/office/word/2018/wordml" xmlns:w16du="http://schemas.microsoft.com/office/word/2023/wordml/word16du" xmlns:w16sdtdh="http://schemas.microsoft.com/office/word/2020/wordml/sdtdatahash" xmlns:w16sdtfl="http://schemas.microsoft.com/office/word/2024/wordml/sdtformatlock" xmlns:w16se="http://schemas.microsoft.com/office/word/2015/wordml/symex" xmlns:wpg="http://schemas.microsoft.com/office/word/2010/wordprocessingGroup" xmlns:wpi="http://schemas.microsoft.com/office/word/2010/wordprocessingInk" xmlns:wne="http://schemas.microsoft.com/office/word/2006/wordml" xmlns:wps="http://schemas.microsoft.com/office/word/2010/wordprocessingShape" mc:Ignorable="w14 w15 w16se w16cid w16 w16cex w16sdtdh w16sdtfl w16du wp14">
   <w:endnote w:type="separator" w:id="-1">
     <w:p>
       <w:r>
@@ -7162,7 +6711,7 @@
 </file>
 
 <file path=word/footer1.xml><?xml version="1.0" encoding="utf-8"?>
-<w:ftr xmlns:wpc="http://schemas.microsoft.com/office/word/2010/wordprocessingCanvas" xmlns:cx="http://schemas.microsoft.com/office/drawing/2014/chartex" xmlns:cx1="http://schemas.microsoft.com/office/drawing/2015/9/8/chartex" xmlns:cx2="http://schemas.microsoft.com/office/drawing/2015/10/21/chartex" xmlns:cx3="http://schemas.microsoft.com/office/drawing/2016/5/9/chartex" xmlns:cx4="http://schemas.microsoft.com/office/drawing/2016/5/10/chartex" xmlns:cx5="http://schemas.microsoft.com/office/drawing/2016/5/11/chartex" xmlns:cx6="http://schemas.microsoft.com/office/drawing/2016/5/12/chartex" xmlns:cx7="http://schemas.microsoft.com/office/drawing/2016/5/13/chartex" xmlns:cx8="http://schemas.microsoft.com/office/drawing/2016/5/14/chartex" xmlns:mc="http://schemas.openxmlformats.org/markup-compatibility/2006" xmlns:aink="http://schemas.microsoft.com/office/drawing/2016/ink" xmlns:am3d="http://schemas.microsoft.com/office/drawing/2017/model3d" xmlns:o="urn:schemas-microsoft-com:office:office" xmlns:oel="http://schemas.microsoft.com/office/2019/extlst" xmlns:r="http://schemas.openxmlformats.org/officeDocument/2006/relationships" xmlns:m="http://schemas.openxmlformats.org/officeDocument/2006/math" xmlns:v="urn:schemas-microsoft-com:vml" xmlns:wp14="http://schemas.microsoft.com/office/word/2010/wordprocessingDrawing" xmlns:wp="http://schemas.openxmlformats.org/drawingml/2006/wordprocessingDrawing" xmlns:w10="urn:schemas-microsoft-com:office:word" xmlns:w="http://schemas.openxmlformats.org/wordprocessingml/2006/main" xmlns:w14="http://schemas.microsoft.com/office/word/2010/wordml" xmlns:w15="http://schemas.microsoft.com/office/word/2012/wordml" xmlns:w16cei="http://schemas.microsoft.com/office/word/2026/wordml/cei" xmlns:w16cex="http://schemas.microsoft.com/office/word/2018/wordml/cex" xmlns:w16cid="http://schemas.microsoft.com/office/word/2016/wordml/cid" xmlns:w16="http://schemas.microsoft.com/office/word/2018/wordml" xmlns:w16du="http://schemas.microsoft.com/office/word/2023/wordml/word16du" xmlns:w16sdtdh="http://schemas.microsoft.com/office/word/2020/wordml/sdtdatahash" xmlns:w16sdtfl="http://schemas.microsoft.com/office/word/2024/wordml/sdtformatlock" xmlns:w16se="http://schemas.microsoft.com/office/word/2015/wordml/symex" xmlns:wpg="http://schemas.microsoft.com/office/word/2010/wordprocessingGroup" xmlns:wpi="http://schemas.microsoft.com/office/word/2010/wordprocessingInk" xmlns:wne="http://schemas.microsoft.com/office/word/2006/wordml" xmlns:wps="http://schemas.microsoft.com/office/word/2010/wordprocessingShape" mc:Ignorable="w14 w15 w16se w16cid w16 w16cex w16sdtdh w16sdtfl w16du wp14">
+<w:ftr xmlns:wpc="http://schemas.microsoft.com/office/word/2010/wordprocessingCanvas" xmlns:cx="http://schemas.microsoft.com/office/drawing/2014/chartex" xmlns:cx1="http://schemas.microsoft.com/office/drawing/2015/9/8/chartex" xmlns:cx2="http://schemas.microsoft.com/office/drawing/2015/10/21/chartex" xmlns:cx3="http://schemas.microsoft.com/office/drawing/2016/5/9/chartex" xmlns:cx4="http://schemas.microsoft.com/office/drawing/2016/5/10/chartex" xmlns:cx5="http://schemas.microsoft.com/office/drawing/2016/5/11/chartex" xmlns:cx6="http://schemas.microsoft.com/office/drawing/2016/5/12/chartex" xmlns:cx7="http://schemas.microsoft.com/office/drawing/2016/5/13/chartex" xmlns:cx8="http://schemas.microsoft.com/office/drawing/2016/5/14/chartex" xmlns:mc="http://schemas.openxmlformats.org/markup-compatibility/2006" xmlns:aink="http://schemas.microsoft.com/office/drawing/2016/ink" xmlns:am3d="http://schemas.microsoft.com/office/drawing/2017/model3d" xmlns:o="urn:schemas-microsoft-com:office:office" xmlns:oel="http://schemas.microsoft.com/office/2019/extlst" xmlns:r="http://schemas.openxmlformats.org/officeDocument/2006/relationships" xmlns:m="http://schemas.openxmlformats.org/officeDocument/2006/math" xmlns:v="urn:schemas-microsoft-com:vml" xmlns:wp14="http://schemas.microsoft.com/office/word/2010/wordprocessingDrawing" xmlns:wp="http://schemas.openxmlformats.org/drawingml/2006/wordprocessingDrawing" xmlns:w10="urn:schemas-microsoft-com:office:word" xmlns:w="http://schemas.openxmlformats.org/wordprocessingml/2006/main" xmlns:w14="http://schemas.microsoft.com/office/word/2010/wordml" xmlns:w15="http://schemas.microsoft.com/office/word/2012/wordml" xmlns:w16cex="http://schemas.microsoft.com/office/word/2018/wordml/cex" xmlns:w16cid="http://schemas.microsoft.com/office/word/2016/wordml/cid" xmlns:w16="http://schemas.microsoft.com/office/word/2018/wordml" xmlns:w16du="http://schemas.microsoft.com/office/word/2023/wordml/word16du" xmlns:w16sdtdh="http://schemas.microsoft.com/office/word/2020/wordml/sdtdatahash" xmlns:w16sdtfl="http://schemas.microsoft.com/office/word/2024/wordml/sdtformatlock" xmlns:w16se="http://schemas.microsoft.com/office/word/2015/wordml/symex" xmlns:wpg="http://schemas.microsoft.com/office/word/2010/wordprocessingGroup" xmlns:wpi="http://schemas.microsoft.com/office/word/2010/wordprocessingInk" xmlns:wne="http://schemas.microsoft.com/office/word/2006/wordml" xmlns:wps="http://schemas.microsoft.com/office/word/2010/wordprocessingShape" mc:Ignorable="w14 w15 w16se w16cid w16 w16cex w16sdtdh w16sdtfl w16du wp14">
   <w:p>
     <w:pPr>
       <w:pBdr>
@@ -7204,7 +6753,7 @@
 </file>
 
 <file path=word/footnotes.xml><?xml version="1.0" encoding="utf-8"?>
-<w:footnotes xmlns:wpc="http://schemas.microsoft.com/office/word/2010/wordprocessingCanvas" xmlns:cx="http://schemas.microsoft.com/office/drawing/2014/chartex" xmlns:cx1="http://schemas.microsoft.com/office/drawing/2015/9/8/chartex" xmlns:cx2="http://schemas.microsoft.com/office/drawing/2015/10/21/chartex" xmlns:cx3="http://schemas.microsoft.com/office/drawing/2016/5/9/chartex" xmlns:cx4="http://schemas.microsoft.com/office/drawing/2016/5/10/chartex" xmlns:cx5="http://schemas.microsoft.com/office/drawing/2016/5/11/chartex" xmlns:cx6="http://schemas.microsoft.com/office/drawing/2016/5/12/chartex" xmlns:cx7="http://schemas.microsoft.com/office/drawing/2016/5/13/chartex" xmlns:cx8="http://schemas.microsoft.com/office/drawing/2016/5/14/chartex" xmlns:mc="http://schemas.openxmlformats.org/markup-compatibility/2006" xmlns:aink="http://schemas.microsoft.com/office/drawing/2016/ink" xmlns:am3d="http://schemas.microsoft.com/office/drawing/2017/model3d" xmlns:o="urn:schemas-microsoft-com:office:office" xmlns:oel="http://schemas.microsoft.com/office/2019/extlst" xmlns:r="http://schemas.openxmlformats.org/officeDocument/2006/relationships" xmlns:m="http://schemas.openxmlformats.org/officeDocument/2006/math" xmlns:v="urn:schemas-microsoft-com:vml" xmlns:wp14="http://schemas.microsoft.com/office/word/2010/wordprocessingDrawing" xmlns:wp="http://schemas.openxmlformats.org/drawingml/2006/wordprocessingDrawing" xmlns:w10="urn:schemas-microsoft-com:office:word" xmlns:w="http://schemas.openxmlformats.org/wordprocessingml/2006/main" xmlns:w14="http://schemas.microsoft.com/office/word/2010/wordml" xmlns:w15="http://schemas.microsoft.com/office/word/2012/wordml" xmlns:w16cei="http://schemas.microsoft.com/office/word/2026/wordml/cei" xmlns:w16cex="http://schemas.microsoft.com/office/word/2018/wordml/cex" xmlns:w16cid="http://schemas.microsoft.com/office/word/2016/wordml/cid" xmlns:w16="http://schemas.microsoft.com/office/word/2018/wordml" xmlns:w16du="http://schemas.microsoft.com/office/word/2023/wordml/word16du" xmlns:w16sdtdh="http://schemas.microsoft.com/office/word/2020/wordml/sdtdatahash" xmlns:w16sdtfl="http://schemas.microsoft.com/office/word/2024/wordml/sdtformatlock" xmlns:w16se="http://schemas.microsoft.com/office/word/2015/wordml/symex" xmlns:wpg="http://schemas.microsoft.com/office/word/2010/wordprocessingGroup" xmlns:wpi="http://schemas.microsoft.com/office/word/2010/wordprocessingInk" xmlns:wne="http://schemas.microsoft.com/office/word/2006/wordml" xmlns:wps="http://schemas.microsoft.com/office/word/2010/wordprocessingShape" mc:Ignorable="w14 w15 w16se w16cid w16 w16cex w16sdtdh w16sdtfl w16du wp14">
+<w:footnotes xmlns:wpc="http://schemas.microsoft.com/office/word/2010/wordprocessingCanvas" xmlns:cx="http://schemas.microsoft.com/office/drawing/2014/chartex" xmlns:cx1="http://schemas.microsoft.com/office/drawing/2015/9/8/chartex" xmlns:cx2="http://schemas.microsoft.com/office/drawing/2015/10/21/chartex" xmlns:cx3="http://schemas.microsoft.com/office/drawing/2016/5/9/chartex" xmlns:cx4="http://schemas.microsoft.com/office/drawing/2016/5/10/chartex" xmlns:cx5="http://schemas.microsoft.com/office/drawing/2016/5/11/chartex" xmlns:cx6="http://schemas.microsoft.com/office/drawing/2016/5/12/chartex" xmlns:cx7="http://schemas.microsoft.com/office/drawing/2016/5/13/chartex" xmlns:cx8="http://schemas.microsoft.com/office/drawing/2016/5/14/chartex" xmlns:mc="http://schemas.openxmlformats.org/markup-compatibility/2006" xmlns:aink="http://schemas.microsoft.com/office/drawing/2016/ink" xmlns:am3d="http://schemas.microsoft.com/office/drawing/2017/model3d" xmlns:o="urn:schemas-microsoft-com:office:office" xmlns:oel="http://schemas.microsoft.com/office/2019/extlst" xmlns:r="http://schemas.openxmlformats.org/officeDocument/2006/relationships" xmlns:m="http://schemas.openxmlformats.org/officeDocument/2006/math" xmlns:v="urn:schemas-microsoft-com:vml" xmlns:wp14="http://schemas.microsoft.com/office/word/2010/wordprocessingDrawing" xmlns:wp="http://schemas.openxmlformats.org/drawingml/2006/wordprocessingDrawing" xmlns:w10="urn:schemas-microsoft-com:office:word" xmlns:w="http://schemas.openxmlformats.org/wordprocessingml/2006/main" xmlns:w14="http://schemas.microsoft.com/office/word/2010/wordml" xmlns:w15="http://schemas.microsoft.com/office/word/2012/wordml" xmlns:w16cex="http://schemas.microsoft.com/office/word/2018/wordml/cex" xmlns:w16cid="http://schemas.microsoft.com/office/word/2016/wordml/cid" xmlns:w16="http://schemas.microsoft.com/office/word/2018/wordml" xmlns:w16du="http://schemas.microsoft.com/office/word/2023/wordml/word16du" xmlns:w16sdtdh="http://schemas.microsoft.com/office/word/2020/wordml/sdtdatahash" xmlns:w16sdtfl="http://schemas.microsoft.com/office/word/2024/wordml/sdtformatlock" xmlns:w16se="http://schemas.microsoft.com/office/word/2015/wordml/symex" xmlns:wpg="http://schemas.microsoft.com/office/word/2010/wordprocessingGroup" xmlns:wpi="http://schemas.microsoft.com/office/word/2010/wordprocessingInk" xmlns:wne="http://schemas.microsoft.com/office/word/2006/wordml" xmlns:wps="http://schemas.microsoft.com/office/word/2010/wordprocessingShape" mc:Ignorable="w14 w15 w16se w16cid w16 w16cex w16sdtdh w16sdtfl w16du wp14">
   <w:footnote w:type="separator" w:id="-1">
     <w:p>
       <w:r>
@@ -7223,7 +6772,7 @@
 </file>
 
 <file path=word/header1.xml><?xml version="1.0" encoding="utf-8"?>
-<w:hdr xmlns:wpc="http://schemas.microsoft.com/office/word/2010/wordprocessingCanvas" xmlns:cx="http://schemas.microsoft.com/office/drawing/2014/chartex" xmlns:cx1="http://schemas.microsoft.com/office/drawing/2015/9/8/chartex" xmlns:cx2="http://schemas.microsoft.com/office/drawing/2015/10/21/chartex" xmlns:cx3="http://schemas.microsoft.com/office/drawing/2016/5/9/chartex" xmlns:cx4="http://schemas.microsoft.com/office/drawing/2016/5/10/chartex" xmlns:cx5="http://schemas.microsoft.com/office/drawing/2016/5/11/chartex" xmlns:cx6="http://schemas.microsoft.com/office/drawing/2016/5/12/chartex" xmlns:cx7="http://schemas.microsoft.com/office/drawing/2016/5/13/chartex" xmlns:cx8="http://schemas.microsoft.com/office/drawing/2016/5/14/chartex" xmlns:mc="http://schemas.openxmlformats.org/markup-compatibility/2006" xmlns:aink="http://schemas.microsoft.com/office/drawing/2016/ink" xmlns:am3d="http://schemas.microsoft.com/office/drawing/2017/model3d" xmlns:o="urn:schemas-microsoft-com:office:office" xmlns:oel="http://schemas.microsoft.com/office/2019/extlst" xmlns:r="http://schemas.openxmlformats.org/officeDocument/2006/relationships" xmlns:m="http://schemas.openxmlformats.org/officeDocument/2006/math" xmlns:v="urn:schemas-microsoft-com:vml" xmlns:wp14="http://schemas.microsoft.com/office/word/2010/wordprocessingDrawing" xmlns:wp="http://schemas.openxmlformats.org/drawingml/2006/wordprocessingDrawing" xmlns:w10="urn:schemas-microsoft-com:office:word" xmlns:w="http://schemas.openxmlformats.org/wordprocessingml/2006/main" xmlns:w14="http://schemas.microsoft.com/office/word/2010/wordml" xmlns:w15="http://schemas.microsoft.com/office/word/2012/wordml" xmlns:w16cei="http://schemas.microsoft.com/office/word/2026/wordml/cei" xmlns:w16cex="http://schemas.microsoft.com/office/word/2018/wordml/cex" xmlns:w16cid="http://schemas.microsoft.com/office/word/2016/wordml/cid" xmlns:w16="http://schemas.microsoft.com/office/word/2018/wordml" xmlns:w16du="http://schemas.microsoft.com/office/word/2023/wordml/word16du" xmlns:w16sdtdh="http://schemas.microsoft.com/office/word/2020/wordml/sdtdatahash" xmlns:w16sdtfl="http://schemas.microsoft.com/office/word/2024/wordml/sdtformatlock" xmlns:w16se="http://schemas.microsoft.com/office/word/2015/wordml/symex" xmlns:wpg="http://schemas.microsoft.com/office/word/2010/wordprocessingGroup" xmlns:wpi="http://schemas.microsoft.com/office/word/2010/wordprocessingInk" xmlns:wne="http://schemas.microsoft.com/office/word/2006/wordml" xmlns:wps="http://schemas.microsoft.com/office/word/2010/wordprocessingShape" mc:Ignorable="w14 w15 w16se w16cid w16 w16cex w16sdtdh w16sdtfl w16du wp14">
+<w:hdr xmlns:wpc="http://schemas.microsoft.com/office/word/2010/wordprocessingCanvas" xmlns:cx="http://schemas.microsoft.com/office/drawing/2014/chartex" xmlns:cx1="http://schemas.microsoft.com/office/drawing/2015/9/8/chartex" xmlns:cx2="http://schemas.microsoft.com/office/drawing/2015/10/21/chartex" xmlns:cx3="http://schemas.microsoft.com/office/drawing/2016/5/9/chartex" xmlns:cx4="http://schemas.microsoft.com/office/drawing/2016/5/10/chartex" xmlns:cx5="http://schemas.microsoft.com/office/drawing/2016/5/11/chartex" xmlns:cx6="http://schemas.microsoft.com/office/drawing/2016/5/12/chartex" xmlns:cx7="http://schemas.microsoft.com/office/drawing/2016/5/13/chartex" xmlns:cx8="http://schemas.microsoft.com/office/drawing/2016/5/14/chartex" xmlns:mc="http://schemas.openxmlformats.org/markup-compatibility/2006" xmlns:aink="http://schemas.microsoft.com/office/drawing/2016/ink" xmlns:am3d="http://schemas.microsoft.com/office/drawing/2017/model3d" xmlns:o="urn:schemas-microsoft-com:office:office" xmlns:oel="http://schemas.microsoft.com/office/2019/extlst" xmlns:r="http://schemas.openxmlformats.org/officeDocument/2006/relationships" xmlns:m="http://schemas.openxmlformats.org/officeDocument/2006/math" xmlns:v="urn:schemas-microsoft-com:vml" xmlns:wp14="http://schemas.microsoft.com/office/word/2010/wordprocessingDrawing" xmlns:wp="http://schemas.openxmlformats.org/drawingml/2006/wordprocessingDrawing" xmlns:w10="urn:schemas-microsoft-com:office:word" xmlns:w="http://schemas.openxmlformats.org/wordprocessingml/2006/main" xmlns:w14="http://schemas.microsoft.com/office/word/2010/wordml" xmlns:w15="http://schemas.microsoft.com/office/word/2012/wordml" xmlns:w16cex="http://schemas.microsoft.com/office/word/2018/wordml/cex" xmlns:w16cid="http://schemas.microsoft.com/office/word/2016/wordml/cid" xmlns:w16="http://schemas.microsoft.com/office/word/2018/wordml" xmlns:w16du="http://schemas.microsoft.com/office/word/2023/wordml/word16du" xmlns:w16sdtdh="http://schemas.microsoft.com/office/word/2020/wordml/sdtdatahash" xmlns:w16sdtfl="http://schemas.microsoft.com/office/word/2024/wordml/sdtformatlock" xmlns:w16se="http://schemas.microsoft.com/office/word/2015/wordml/symex" xmlns:wpg="http://schemas.microsoft.com/office/word/2010/wordprocessingGroup" xmlns:wpi="http://schemas.microsoft.com/office/word/2010/wordprocessingInk" xmlns:wne="http://schemas.microsoft.com/office/word/2006/wordml" xmlns:wps="http://schemas.microsoft.com/office/word/2010/wordprocessingShape" mc:Ignorable="w14 w15 w16se w16cid w16 w16cex w16sdtdh w16sdtfl w16du wp14">
   <w:p>
     <w:pPr>
       <w:pBdr>
@@ -7314,7 +6863,7 @@
 </file>
 
 <file path=word/numbering.xml><?xml version="1.0" encoding="utf-8"?>
-<w:numbering xmlns:wpc="http://schemas.microsoft.com/office/word/2010/wordprocessingCanvas" xmlns:cx="http://schemas.microsoft.com/office/drawing/2014/chartex" xmlns:cx1="http://schemas.microsoft.com/office/drawing/2015/9/8/chartex" xmlns:cx2="http://schemas.microsoft.com/office/drawing/2015/10/21/chartex" xmlns:cx3="http://schemas.microsoft.com/office/drawing/2016/5/9/chartex" xmlns:cx4="http://schemas.microsoft.com/office/drawing/2016/5/10/chartex" xmlns:cx5="http://schemas.microsoft.com/office/drawing/2016/5/11/chartex" xmlns:cx6="http://schemas.microsoft.com/office/drawing/2016/5/12/chartex" xmlns:cx7="http://schemas.microsoft.com/office/drawing/2016/5/13/chartex" xmlns:cx8="http://schemas.microsoft.com/office/drawing/2016/5/14/chartex" xmlns:mc="http://schemas.openxmlformats.org/markup-compatibility/2006" xmlns:aink="http://schemas.microsoft.com/office/drawing/2016/ink" xmlns:am3d="http://schemas.microsoft.com/office/drawing/2017/model3d" xmlns:o="urn:schemas-microsoft-com:office:office" xmlns:oel="http://schemas.microsoft.com/office/2019/extlst" xmlns:r="http://schemas.openxmlformats.org/officeDocument/2006/relationships" xmlns:m="http://schemas.openxmlformats.org/officeDocument/2006/math" xmlns:v="urn:schemas-microsoft-com:vml" xmlns:wp14="http://schemas.microsoft.com/office/word/2010/wordprocessingDrawing" xmlns:wp="http://schemas.openxmlformats.org/drawingml/2006/wordprocessingDrawing" xmlns:w10="urn:schemas-microsoft-com:office:word" xmlns:w="http://schemas.openxmlformats.org/wordprocessingml/2006/main" xmlns:w14="http://schemas.microsoft.com/office/word/2010/wordml" xmlns:w15="http://schemas.microsoft.com/office/word/2012/wordml" xmlns:w16cei="http://schemas.microsoft.com/office/word/2026/wordml/cei" xmlns:w16cex="http://schemas.microsoft.com/office/word/2018/wordml/cex" xmlns:w16cid="http://schemas.microsoft.com/office/word/2016/wordml/cid" xmlns:w16="http://schemas.microsoft.com/office/word/2018/wordml" xmlns:w16du="http://schemas.microsoft.com/office/word/2023/wordml/word16du" xmlns:w16sdtdh="http://schemas.microsoft.com/office/word/2020/wordml/sdtdatahash" xmlns:w16sdtfl="http://schemas.microsoft.com/office/word/2024/wordml/sdtformatlock" xmlns:w16se="http://schemas.microsoft.com/office/word/2015/wordml/symex" xmlns:wpg="http://schemas.microsoft.com/office/word/2010/wordprocessingGroup" xmlns:wpi="http://schemas.microsoft.com/office/word/2010/wordprocessingInk" xmlns:wne="http://schemas.microsoft.com/office/word/2006/wordml" xmlns:wps="http://schemas.microsoft.com/office/word/2010/wordprocessingShape" mc:Ignorable="w14 w15 w16se w16cid w16 w16cex w16sdtdh w16sdtfl w16du wp14">
+<w:numbering xmlns:wpc="http://schemas.microsoft.com/office/word/2010/wordprocessingCanvas" xmlns:cx="http://schemas.microsoft.com/office/drawing/2014/chartex" xmlns:cx1="http://schemas.microsoft.com/office/drawing/2015/9/8/chartex" xmlns:cx2="http://schemas.microsoft.com/office/drawing/2015/10/21/chartex" xmlns:cx3="http://schemas.microsoft.com/office/drawing/2016/5/9/chartex" xmlns:cx4="http://schemas.microsoft.com/office/drawing/2016/5/10/chartex" xmlns:cx5="http://schemas.microsoft.com/office/drawing/2016/5/11/chartex" xmlns:cx6="http://schemas.microsoft.com/office/drawing/2016/5/12/chartex" xmlns:cx7="http://schemas.microsoft.com/office/drawing/2016/5/13/chartex" xmlns:cx8="http://schemas.microsoft.com/office/drawing/2016/5/14/chartex" xmlns:mc="http://schemas.openxmlformats.org/markup-compatibility/2006" xmlns:aink="http://schemas.microsoft.com/office/drawing/2016/ink" xmlns:am3d="http://schemas.microsoft.com/office/drawing/2017/model3d" xmlns:o="urn:schemas-microsoft-com:office:office" xmlns:oel="http://schemas.microsoft.com/office/2019/extlst" xmlns:r="http://schemas.openxmlformats.org/officeDocument/2006/relationships" xmlns:m="http://schemas.openxmlformats.org/officeDocument/2006/math" xmlns:v="urn:schemas-microsoft-com:vml" xmlns:wp14="http://schemas.microsoft.com/office/word/2010/wordprocessingDrawing" xmlns:wp="http://schemas.openxmlformats.org/drawingml/2006/wordprocessingDrawing" xmlns:w10="urn:schemas-microsoft-com:office:word" xmlns:w="http://schemas.openxmlformats.org/wordprocessingml/2006/main" xmlns:w14="http://schemas.microsoft.com/office/word/2010/wordml" xmlns:w15="http://schemas.microsoft.com/office/word/2012/wordml" xmlns:w16cex="http://schemas.microsoft.com/office/word/2018/wordml/cex" xmlns:w16cid="http://schemas.microsoft.com/office/word/2016/wordml/cid" xmlns:w16="http://schemas.microsoft.com/office/word/2018/wordml" xmlns:w16du="http://schemas.microsoft.com/office/word/2023/wordml/word16du" xmlns:w16sdtdh="http://schemas.microsoft.com/office/word/2020/wordml/sdtdatahash" xmlns:w16sdtfl="http://schemas.microsoft.com/office/word/2024/wordml/sdtformatlock" xmlns:w16se="http://schemas.microsoft.com/office/word/2015/wordml/symex" xmlns:wpg="http://schemas.microsoft.com/office/word/2010/wordprocessingGroup" xmlns:wpi="http://schemas.microsoft.com/office/word/2010/wordprocessingInk" xmlns:wne="http://schemas.microsoft.com/office/word/2006/wordml" xmlns:wps="http://schemas.microsoft.com/office/word/2010/wordprocessingShape" mc:Ignorable="w14 w15 w16se w16cid w16 w16cex w16sdtdh w16sdtfl w16du wp14">
   <w:abstractNum w:abstractNumId="0" w15:restartNumberingAfterBreak="0">
     <w:nsid w:val="33E05FF8"/>
     <w:multiLevelType w:val="multilevel"/>
@@ -8138,6 +7687,7 @@
   <w:style w:type="character" w:default="1" w:styleId="Fontepargpadro">
     <w:name w:val="Default Paragraph Font"/>
     <w:uiPriority w:val="1"/>
+    <w:semiHidden/>
     <w:unhideWhenUsed/>
   </w:style>
   <w:style w:type="table" w:default="1" w:styleId="Tabelanormal">

</xml_diff>

<commit_message>
comentários de ajuste no RAP 25-08-26
</commit_message>
<xml_diff>
--- a/doc/_RELATORIOS DE ATIV. PRATICAS - GRUPO 04.docx
+++ b/doc/_RELATORIOS DE ATIV. PRATICAS - GRUPO 04.docx
@@ -69,6 +69,7 @@
           <w:szCs w:val="28"/>
         </w:rPr>
       </w:pPr>
+      <w:commentRangeStart w:id="0"/>
       <w:r>
         <w:rPr>
           <w:rFonts w:ascii="Arial" w:eastAsia="Arial" w:hAnsi="Arial" w:cs="Arial"/>
@@ -103,42 +104,18 @@
         </w:rPr>
         <w:t>CETAM</w:t>
       </w:r>
-    </w:p>
-    <w:p>
-      <w:pPr>
-        <w:widowControl/>
-        <w:spacing w:after="200" w:line="276" w:lineRule="auto"/>
-        <w:jc w:val="center"/>
-        <w:rPr>
+      <w:commentRangeEnd w:id="0"/>
+      <w:r>
+        <w:rPr>
+          <w:rStyle w:val="Refdecomentrio"/>
           <w:rFonts w:ascii="Arial" w:eastAsia="Arial" w:hAnsi="Arial" w:cs="Arial"/>
           <w:b/>
           <w:bCs/>
           <w:color w:val="C55911"/>
-          <w:sz w:val="24"/>
-          <w:szCs w:val="24"/>
-        </w:rPr>
-      </w:pPr>
-    </w:p>
-    <w:p>
-      <w:pPr>
-        <w:widowControl/>
-        <w:spacing w:after="200" w:line="276" w:lineRule="auto"/>
-        <w:jc w:val="center"/>
-        <w:rPr>
-          <w:rFonts w:ascii="Arial" w:eastAsia="Arial" w:hAnsi="Arial" w:cs="Arial"/>
-          <w:color w:val="434343"/>
-          <w:sz w:val="24"/>
-          <w:szCs w:val="24"/>
-        </w:rPr>
-      </w:pPr>
-      <w:r>
-        <w:rPr>
-          <w:rFonts w:ascii="Arial" w:eastAsia="Arial" w:hAnsi="Arial" w:cs="Arial"/>
-          <w:color w:val="434343"/>
-          <w:sz w:val="24"/>
-          <w:szCs w:val="24"/>
-        </w:rPr>
-        <w:t>Instituto Benjamin Constant - IBC/CETAM</w:t>
+          <w:sz w:val="28"/>
+          <w:szCs w:val="28"/>
+        </w:rPr>
+        <w:commentReference w:id="0"/>
       </w:r>
     </w:p>
     <w:p>
@@ -163,6 +140,28 @@
         <w:jc w:val="center"/>
         <w:rPr>
           <w:rFonts w:ascii="Arial" w:eastAsia="Arial" w:hAnsi="Arial" w:cs="Arial"/>
+          <w:color w:val="434343"/>
+          <w:sz w:val="24"/>
+          <w:szCs w:val="24"/>
+        </w:rPr>
+      </w:pPr>
+      <w:r>
+        <w:rPr>
+          <w:rFonts w:ascii="Arial" w:eastAsia="Arial" w:hAnsi="Arial" w:cs="Arial"/>
+          <w:color w:val="434343"/>
+          <w:sz w:val="24"/>
+          <w:szCs w:val="24"/>
+        </w:rPr>
+        <w:t>Instituto Benjamin Constant - IBC/CETAM</w:t>
+      </w:r>
+    </w:p>
+    <w:p>
+      <w:pPr>
+        <w:widowControl/>
+        <w:spacing w:after="200" w:line="276" w:lineRule="auto"/>
+        <w:jc w:val="center"/>
+        <w:rPr>
+          <w:rFonts w:ascii="Arial" w:eastAsia="Arial" w:hAnsi="Arial" w:cs="Arial"/>
           <w:b/>
           <w:bCs/>
           <w:color w:val="C55911"/>
@@ -174,6 +173,21 @@
     <w:p>
       <w:pPr>
         <w:widowControl/>
+        <w:spacing w:after="200" w:line="276" w:lineRule="auto"/>
+        <w:jc w:val="center"/>
+        <w:rPr>
+          <w:rFonts w:ascii="Arial" w:eastAsia="Arial" w:hAnsi="Arial" w:cs="Arial"/>
+          <w:b/>
+          <w:bCs/>
+          <w:color w:val="C55911"/>
+          <w:sz w:val="24"/>
+          <w:szCs w:val="24"/>
+        </w:rPr>
+      </w:pPr>
+    </w:p>
+    <w:p>
+      <w:pPr>
+        <w:widowControl/>
         <w:spacing w:after="120"/>
         <w:jc w:val="center"/>
         <w:rPr>
@@ -344,6 +358,7 @@
           <w:szCs w:val="24"/>
         </w:rPr>
       </w:pPr>
+      <w:commentRangeStart w:id="1"/>
       <w:r>
         <w:rPr>
           <w:rFonts w:ascii="Arial" w:eastAsia="Arial" w:hAnsi="Arial" w:cs="Arial"/>
@@ -449,6 +464,18 @@
           <w:szCs w:val="24"/>
         </w:rPr>
         <w:t>SOPHIA ROQUE MARTINS</w:t>
+      </w:r>
+      <w:commentRangeEnd w:id="1"/>
+      <w:r>
+        <w:rPr>
+          <w:rStyle w:val="Refdecomentrio"/>
+          <w:rFonts w:ascii="Arial" w:eastAsia="Arial" w:hAnsi="Arial" w:cs="Arial"/>
+          <w:b/>
+          <w:bCs/>
+          <w:sz w:val="24"/>
+          <w:szCs w:val="24"/>
+        </w:rPr>
+        <w:commentReference w:id="1"/>
       </w:r>
     </w:p>
     <w:p>
@@ -1777,7 +1804,7 @@
                     <pic:cNvPicPr/>
                   </pic:nvPicPr>
                   <pic:blipFill>
-                    <a:blip r:embed="rId8"/>
+                    <a:blip r:embed="rId12"/>
                     <a:stretch>
                       <a:fillRect/>
                     </a:stretch>
@@ -1805,27 +1832,14 @@
       <w:r>
         <w:t xml:space="preserve">Figura </w:t>
       </w:r>
-      <w:r>
-        <w:fldChar w:fldCharType="begin"/>
-      </w:r>
-      <w:r>
-        <w:instrText xml:space="preserve"> SEQ Figura \* ARABIC </w:instrText>
-      </w:r>
-      <w:r>
-        <w:fldChar w:fldCharType="separate"/>
-      </w:r>
-      <w:r>
-        <w:rPr>
-          <w:noProof/>
-        </w:rPr>
-        <w:t>1</w:t>
-      </w:r>
-      <w:r>
-        <w:rPr>
-          <w:noProof/>
-        </w:rPr>
-        <w:fldChar w:fldCharType="end"/>
-      </w:r>
+      <w:fldSimple w:instr=" SEQ Figura \* ARABIC ">
+        <w:r>
+          <w:rPr>
+            <w:noProof/>
+          </w:rPr>
+          <w:t>1</w:t>
+        </w:r>
+      </w:fldSimple>
       <w:r>
         <w:t xml:space="preserve"> 1Estrutura do Projeto em Camadas (MVC)</w:t>
       </w:r>
@@ -2039,7 +2053,7 @@
                     <pic:cNvPicPr/>
                   </pic:nvPicPr>
                   <pic:blipFill>
-                    <a:blip r:embed="rId9"/>
+                    <a:blip r:embed="rId13"/>
                     <a:stretch>
                       <a:fillRect/>
                     </a:stretch>
@@ -2067,24 +2081,14 @@
       <w:r>
         <w:t xml:space="preserve">Figura </w:t>
       </w:r>
-      <w:r>
-        <w:fldChar w:fldCharType="begin"/>
-      </w:r>
-      <w:r>
-        <w:instrText xml:space="preserve"> SEQ Figura \* ARABIC </w:instrText>
-      </w:r>
-      <w:r>
-        <w:fldChar w:fldCharType="separate"/>
-      </w:r>
-      <w:r>
-        <w:rPr>
-          <w:noProof/>
-        </w:rPr>
-        <w:t>2</w:t>
-      </w:r>
-      <w:r>
-        <w:fldChar w:fldCharType="end"/>
-      </w:r>
+      <w:fldSimple w:instr=" SEQ Figura \* ARABIC ">
+        <w:r>
+          <w:rPr>
+            <w:noProof/>
+          </w:rPr>
+          <w:t>2</w:t>
+        </w:r>
+      </w:fldSimple>
       <w:r>
         <w:t xml:space="preserve"> Banco de Dados da Loja Virtual de Roupa</w:t>
       </w:r>
@@ -2323,7 +2327,7 @@
                     <pic:cNvPicPr/>
                   </pic:nvPicPr>
                   <pic:blipFill>
-                    <a:blip r:embed="rId10"/>
+                    <a:blip r:embed="rId14"/>
                     <a:stretch>
                       <a:fillRect/>
                     </a:stretch>
@@ -2356,27 +2360,14 @@
       <w:r>
         <w:t xml:space="preserve">Figura </w:t>
       </w:r>
-      <w:r>
-        <w:fldChar w:fldCharType="begin"/>
-      </w:r>
-      <w:r>
-        <w:instrText xml:space="preserve"> SEQ Figura \* ARABIC </w:instrText>
-      </w:r>
-      <w:r>
-        <w:fldChar w:fldCharType="separate"/>
-      </w:r>
-      <w:r>
-        <w:rPr>
-          <w:noProof/>
-        </w:rPr>
-        <w:t>3</w:t>
-      </w:r>
-      <w:r>
-        <w:rPr>
-          <w:noProof/>
-        </w:rPr>
-        <w:fldChar w:fldCharType="end"/>
-      </w:r>
+      <w:fldSimple w:instr=" SEQ Figura \* ARABIC ">
+        <w:r>
+          <w:rPr>
+            <w:noProof/>
+          </w:rPr>
+          <w:t>3</w:t>
+        </w:r>
+      </w:fldSimple>
       <w:r>
         <w:t xml:space="preserve"> Clonagem do Projeto do Grupo 4</w:t>
       </w:r>
@@ -2531,7 +2522,7 @@
                     <pic:cNvPicPr/>
                   </pic:nvPicPr>
                   <pic:blipFill>
-                    <a:blip r:embed="rId11"/>
+                    <a:blip r:embed="rId15"/>
                     <a:stretch>
                       <a:fillRect/>
                     </a:stretch>
@@ -2564,27 +2555,14 @@
       <w:r>
         <w:t xml:space="preserve">Figura </w:t>
       </w:r>
-      <w:r>
-        <w:fldChar w:fldCharType="begin"/>
-      </w:r>
-      <w:r>
-        <w:instrText xml:space="preserve"> SEQ Figura \* ARABIC </w:instrText>
-      </w:r>
-      <w:r>
-        <w:fldChar w:fldCharType="separate"/>
-      </w:r>
-      <w:r>
-        <w:rPr>
-          <w:noProof/>
-        </w:rPr>
-        <w:t>4</w:t>
-      </w:r>
-      <w:r>
-        <w:rPr>
-          <w:noProof/>
-        </w:rPr>
-        <w:fldChar w:fldCharType="end"/>
-      </w:r>
+      <w:fldSimple w:instr=" SEQ Figura \* ARABIC ">
+        <w:r>
+          <w:rPr>
+            <w:noProof/>
+          </w:rPr>
+          <w:t>4</w:t>
+        </w:r>
+      </w:fldSimple>
       <w:r>
         <w:t xml:space="preserve"> Criação das Branches</w:t>
       </w:r>
@@ -2974,7 +2952,7 @@
                     <pic:cNvPicPr/>
                   </pic:nvPicPr>
                   <pic:blipFill>
-                    <a:blip r:embed="rId12">
+                    <a:blip r:embed="rId16">
                       <a:extLst>
                         <a:ext uri="{28A0092B-C50C-407E-A947-70E740481C1C}">
                           <a14:useLocalDpi xmlns:a14="http://schemas.microsoft.com/office/drawing/2010/main" val="0"/>
@@ -3008,27 +2986,14 @@
       <w:r>
         <w:t xml:space="preserve">Figura </w:t>
       </w:r>
-      <w:r>
-        <w:fldChar w:fldCharType="begin"/>
-      </w:r>
-      <w:r>
-        <w:instrText xml:space="preserve"> SEQ Figura \* ARABIC </w:instrText>
-      </w:r>
-      <w:r>
-        <w:fldChar w:fldCharType="separate"/>
-      </w:r>
-      <w:r>
-        <w:rPr>
-          <w:noProof/>
-        </w:rPr>
-        <w:t>5</w:t>
-      </w:r>
-      <w:r>
-        <w:rPr>
-          <w:noProof/>
-        </w:rPr>
-        <w:fldChar w:fldCharType="end"/>
-      </w:r>
+      <w:fldSimple w:instr=" SEQ Figura \* ARABIC ">
+        <w:r>
+          <w:rPr>
+            <w:noProof/>
+          </w:rPr>
+          <w:t>5</w:t>
+        </w:r>
+      </w:fldSimple>
       <w:r>
         <w:t xml:space="preserve"> Diagrama Entidade-Relacionamento (DER)</w:t>
       </w:r>
@@ -3879,7 +3844,7 @@
                     <pic:cNvPicPr/>
                   </pic:nvPicPr>
                   <pic:blipFill>
-                    <a:blip r:embed="rId13"/>
+                    <a:blip r:embed="rId17"/>
                     <a:stretch>
                       <a:fillRect/>
                     </a:stretch>
@@ -3907,27 +3872,14 @@
       <w:r>
         <w:t xml:space="preserve">Figura </w:t>
       </w:r>
-      <w:r>
-        <w:fldChar w:fldCharType="begin"/>
-      </w:r>
-      <w:r>
-        <w:instrText xml:space="preserve"> SEQ Figura \* ARABIC </w:instrText>
-      </w:r>
-      <w:r>
-        <w:fldChar w:fldCharType="separate"/>
-      </w:r>
-      <w:r>
-        <w:rPr>
-          <w:noProof/>
-        </w:rPr>
-        <w:t>6</w:t>
-      </w:r>
-      <w:r>
-        <w:rPr>
-          <w:noProof/>
-        </w:rPr>
-        <w:fldChar w:fldCharType="end"/>
-      </w:r>
+      <w:fldSimple w:instr=" SEQ Figura \* ARABIC ">
+        <w:r>
+          <w:rPr>
+            <w:noProof/>
+          </w:rPr>
+          <w:t>6</w:t>
+        </w:r>
+      </w:fldSimple>
       <w:r>
         <w:t xml:space="preserve"> Classe Model Pessoa</w:t>
       </w:r>
@@ -4010,7 +3962,7 @@
                     <pic:cNvPicPr/>
                   </pic:nvPicPr>
                   <pic:blipFill>
-                    <a:blip r:embed="rId14"/>
+                    <a:blip r:embed="rId18"/>
                     <a:stretch>
                       <a:fillRect/>
                     </a:stretch>
@@ -4043,27 +3995,14 @@
       <w:r>
         <w:t xml:space="preserve">Figura </w:t>
       </w:r>
-      <w:r>
-        <w:fldChar w:fldCharType="begin"/>
-      </w:r>
-      <w:r>
-        <w:instrText xml:space="preserve"> SEQ Figura \* ARABIC </w:instrText>
-      </w:r>
-      <w:r>
-        <w:fldChar w:fldCharType="separate"/>
-      </w:r>
-      <w:r>
-        <w:rPr>
-          <w:noProof/>
-        </w:rPr>
-        <w:t>7</w:t>
-      </w:r>
-      <w:r>
-        <w:rPr>
-          <w:noProof/>
-        </w:rPr>
-        <w:fldChar w:fldCharType="end"/>
-      </w:r>
+      <w:fldSimple w:instr=" SEQ Figura \* ARABIC ">
+        <w:r>
+          <w:rPr>
+            <w:noProof/>
+          </w:rPr>
+          <w:t>7</w:t>
+        </w:r>
+      </w:fldSimple>
       <w:r>
         <w:t xml:space="preserve"> Classe Repository Pessoa</w:t>
       </w:r>
@@ -4314,7 +4253,7 @@
                     <pic:cNvPicPr/>
                   </pic:nvPicPr>
                   <pic:blipFill>
-                    <a:blip r:embed="rId15"/>
+                    <a:blip r:embed="rId19"/>
                     <a:stretch>
                       <a:fillRect/>
                     </a:stretch>
@@ -4342,24 +4281,14 @@
       <w:r>
         <w:t xml:space="preserve">Figura </w:t>
       </w:r>
-      <w:r>
-        <w:fldChar w:fldCharType="begin"/>
-      </w:r>
-      <w:r>
-        <w:instrText xml:space="preserve"> SEQ Figura \* ARABIC </w:instrText>
-      </w:r>
-      <w:r>
-        <w:fldChar w:fldCharType="separate"/>
-      </w:r>
-      <w:r>
-        <w:rPr>
-          <w:noProof/>
-        </w:rPr>
-        <w:t>8</w:t>
-      </w:r>
-      <w:r>
-        <w:fldChar w:fldCharType="end"/>
-      </w:r>
+      <w:fldSimple w:instr=" SEQ Figura \* ARABIC ">
+        <w:r>
+          <w:rPr>
+            <w:noProof/>
+          </w:rPr>
+          <w:t>8</w:t>
+        </w:r>
+      </w:fldSimple>
       <w:r>
         <w:t xml:space="preserve"> Classe Pessoa Controller</w:t>
       </w:r>
@@ -4409,7 +4338,7 @@
                     <pic:cNvPicPr/>
                   </pic:nvPicPr>
                   <pic:blipFill>
-                    <a:blip r:embed="rId16"/>
+                    <a:blip r:embed="rId20"/>
                     <a:stretch>
                       <a:fillRect/>
                     </a:stretch>
@@ -4437,24 +4366,14 @@
       <w:r>
         <w:t xml:space="preserve">Figura </w:t>
       </w:r>
-      <w:r>
-        <w:fldChar w:fldCharType="begin"/>
-      </w:r>
-      <w:r>
-        <w:instrText xml:space="preserve"> SEQ Figura \* ARABIC </w:instrText>
-      </w:r>
-      <w:r>
-        <w:fldChar w:fldCharType="separate"/>
-      </w:r>
-      <w:r>
-        <w:rPr>
-          <w:noProof/>
-        </w:rPr>
-        <w:t>9</w:t>
-      </w:r>
-      <w:r>
-        <w:fldChar w:fldCharType="end"/>
-      </w:r>
+      <w:fldSimple w:instr=" SEQ Figura \* ARABIC ">
+        <w:r>
+          <w:rPr>
+            <w:noProof/>
+          </w:rPr>
+          <w:t>9</w:t>
+        </w:r>
+      </w:fldSimple>
       <w:r>
         <w:t xml:space="preserve"> Classe Pessoa Service</w:t>
       </w:r>
@@ -6256,6 +6175,7 @@
           <w:szCs w:val="24"/>
         </w:rPr>
       </w:pPr>
+      <w:commentRangeStart w:id="2"/>
       <w:r>
         <w:rPr>
           <w:rFonts w:ascii="Arial" w:eastAsia="Arial" w:hAnsi="Arial" w:cs="Arial"/>
@@ -6266,6 +6186,19 @@
           <w:szCs w:val="24"/>
         </w:rPr>
         <w:t>CONCLUSÃO</w:t>
+      </w:r>
+      <w:commentRangeEnd w:id="2"/>
+      <w:r>
+        <w:rPr>
+          <w:rStyle w:val="Refdecomentrio"/>
+          <w:rFonts w:ascii="Arial" w:eastAsia="Arial" w:hAnsi="Arial" w:cs="Arial"/>
+          <w:b/>
+          <w:bCs/>
+          <w:color w:val="000000"/>
+          <w:sz w:val="24"/>
+          <w:szCs w:val="24"/>
+        </w:rPr>
+        <w:commentReference w:id="2"/>
       </w:r>
     </w:p>
     <w:p>
@@ -6317,6 +6250,7 @@
           <w:szCs w:val="24"/>
         </w:rPr>
       </w:pPr>
+      <w:commentRangeStart w:id="3"/>
       <w:r>
         <w:rPr>
           <w:rFonts w:ascii="Arial" w:eastAsia="Arial" w:hAnsi="Arial" w:cs="Arial"/>
@@ -6328,6 +6262,17 @@
         </w:rPr>
         <w:t>REFERÊNCIAS</w:t>
       </w:r>
+      <w:commentRangeEnd w:id="3"/>
+      <w:r>
+        <w:rPr>
+          <w:rStyle w:val="Refdecomentrio"/>
+          <w:rFonts w:ascii="Arial" w:eastAsia="Arial" w:hAnsi="Arial" w:cs="Arial"/>
+          <w:color w:val="000000"/>
+          <w:sz w:val="24"/>
+          <w:szCs w:val="24"/>
+        </w:rPr>
+        <w:commentReference w:id="3"/>
+      </w:r>
     </w:p>
     <w:p>
       <w:pPr>
@@ -6680,8 +6625,8 @@
       </w:pPr>
     </w:p>
     <w:sectPr>
-      <w:headerReference w:type="default" r:id="rId17"/>
-      <w:footerReference w:type="default" r:id="rId18"/>
+      <w:headerReference w:type="default" r:id="rId21"/>
+      <w:footerReference w:type="default" r:id="rId22"/>
       <w:pgSz w:w="11920" w:h="16860"/>
       <w:pgMar w:top="1701" w:right="1134" w:bottom="1134" w:left="1701" w:header="284" w:footer="624" w:gutter="0"/>
       <w:pgNumType w:start="1"/>
@@ -6689,6 +6634,166 @@
     </w:sectPr>
   </w:body>
 </w:document>
+</file>
+
+<file path=word/comments.xml><?xml version="1.0" encoding="utf-8"?>
+<w:comments xmlns:wpc="http://schemas.microsoft.com/office/word/2010/wordprocessingCanvas" xmlns:cx="http://schemas.microsoft.com/office/drawing/2014/chartex" xmlns:cx1="http://schemas.microsoft.com/office/drawing/2015/9/8/chartex" xmlns:cx2="http://schemas.microsoft.com/office/drawing/2015/10/21/chartex" xmlns:cx3="http://schemas.microsoft.com/office/drawing/2016/5/9/chartex" xmlns:cx4="http://schemas.microsoft.com/office/drawing/2016/5/10/chartex" xmlns:cx5="http://schemas.microsoft.com/office/drawing/2016/5/11/chartex" xmlns:cx6="http://schemas.microsoft.com/office/drawing/2016/5/12/chartex" xmlns:cx7="http://schemas.microsoft.com/office/drawing/2016/5/13/chartex" xmlns:cx8="http://schemas.microsoft.com/office/drawing/2016/5/14/chartex" xmlns:mc="http://schemas.openxmlformats.org/markup-compatibility/2006" xmlns:aink="http://schemas.microsoft.com/office/drawing/2016/ink" xmlns:am3d="http://schemas.microsoft.com/office/drawing/2017/model3d" xmlns:o="urn:schemas-microsoft-com:office:office" xmlns:oel="http://schemas.microsoft.com/office/2019/extlst" xmlns:r="http://schemas.openxmlformats.org/officeDocument/2006/relationships" xmlns:m="http://schemas.openxmlformats.org/officeDocument/2006/math" xmlns:v="urn:schemas-microsoft-com:vml" xmlns:wp14="http://schemas.microsoft.com/office/word/2010/wordprocessingDrawing" xmlns:wp="http://schemas.openxmlformats.org/drawingml/2006/wordprocessingDrawing" xmlns:w10="urn:schemas-microsoft-com:office:word" xmlns:w="http://schemas.openxmlformats.org/wordprocessingml/2006/main" xmlns:w14="http://schemas.microsoft.com/office/word/2010/wordml" xmlns:w15="http://schemas.microsoft.com/office/word/2012/wordml" xmlns:w16cex="http://schemas.microsoft.com/office/word/2018/wordml/cex" xmlns:w16cid="http://schemas.microsoft.com/office/word/2016/wordml/cid" xmlns:w16="http://schemas.microsoft.com/office/word/2018/wordml" xmlns:w16du="http://schemas.microsoft.com/office/word/2023/wordml/word16du" xmlns:w16sdtdh="http://schemas.microsoft.com/office/word/2020/wordml/sdtdatahash" xmlns:w16sdtfl="http://schemas.microsoft.com/office/word/2024/wordml/sdtformatlock" xmlns:w16se="http://schemas.microsoft.com/office/word/2015/wordml/symex" xmlns:wpg="http://schemas.microsoft.com/office/word/2010/wordprocessingGroup" xmlns:wpi="http://schemas.microsoft.com/office/word/2010/wordprocessingInk" xmlns:wne="http://schemas.microsoft.com/office/word/2006/wordml" xmlns:wps="http://schemas.microsoft.com/office/word/2010/wordprocessingShape" mc:Ignorable="w14 w15 w16se w16cid w16 w16cex w16sdtdh w16sdtfl w16du wp14">
+  <w:comment w:id="0" w:author="Cleverson S. Sobrinho" w:date="2026-08-25T15:34:00Z" w:initials="CS">
+    <w:p>
+      <w:pPr>
+        <w:pStyle w:val="Textodecomentrio"/>
+      </w:pPr>
+      <w:r>
+        <w:rPr>
+          <w:rStyle w:val="Refdecomentrio"/>
+        </w:rPr>
+        <w:annotationRef/>
+      </w:r>
+      <w:r>
+        <w:t>Ajustar no documento os trechos que estão fora do padrão conforme modelo enviado pelo CETAM:</w:t>
+      </w:r>
+    </w:p>
+    <w:p>
+      <w:pPr>
+        <w:pStyle w:val="Textodecomentrio"/>
+      </w:pPr>
+      <w:r>
+        <w:t>1. Fonte, tamanho e cor:</w:t>
+      </w:r>
+    </w:p>
+    <w:p>
+      <w:pPr>
+        <w:pStyle w:val="Textodecomentrio"/>
+      </w:pPr>
+      <w:r>
+        <w:t>1.1. Fonte: Arial ou times New Roman;</w:t>
+      </w:r>
+    </w:p>
+    <w:p>
+      <w:pPr>
+        <w:pStyle w:val="Textodecomentrio"/>
+      </w:pPr>
+      <w:r>
+        <w:t xml:space="preserve">1.2. Tamanho: 12 para texto, 10 para citações com mais de três linhas; </w:t>
+      </w:r>
+    </w:p>
+    <w:p>
+      <w:pPr>
+        <w:pStyle w:val="Textodecomentrio"/>
+      </w:pPr>
+      <w:r>
+        <w:t>1.3. Cor: preta.</w:t>
+      </w:r>
+    </w:p>
+    <w:p>
+      <w:pPr>
+        <w:pStyle w:val="Textodecomentrio"/>
+      </w:pPr>
+      <w:r>
+        <w:t>2. Margens:</w:t>
+      </w:r>
+    </w:p>
+    <w:p>
+      <w:pPr>
+        <w:pStyle w:val="Textodecomentrio"/>
+      </w:pPr>
+      <w:r>
+        <w:t>2.1. Superior e esquerda – 3,0 cm</w:t>
+      </w:r>
+    </w:p>
+    <w:p>
+      <w:pPr>
+        <w:pStyle w:val="Textodecomentrio"/>
+      </w:pPr>
+      <w:r>
+        <w:t>2.2. Inferior e direita – 2,0 cm</w:t>
+      </w:r>
+    </w:p>
+    <w:p>
+      <w:pPr>
+        <w:pStyle w:val="Textodecomentrio"/>
+      </w:pPr>
+      <w:r>
+        <w:t>2. Paginação – superior e à direita</w:t>
+      </w:r>
+    </w:p>
+  </w:comment>
+  <w:comment w:id="1" w:author="Cleverson S. Sobrinho" w:date="2026-08-25T15:26:00Z" w:initials="CS">
+    <w:p>
+      <w:pPr>
+        <w:pStyle w:val="Textodecomentrio"/>
+      </w:pPr>
+      <w:r>
+        <w:rPr>
+          <w:rStyle w:val="Refdecomentrio"/>
+        </w:rPr>
+        <w:annotationRef/>
+      </w:r>
+      <w:r>
+        <w:t>Ajustar nomes dos alunos para o nome completo de cada.</w:t>
+      </w:r>
+    </w:p>
+  </w:comment>
+  <w:comment w:id="2" w:author="Cleverson S. Sobrinho" w:date="2026-08-25T15:35:00Z" w:initials="CS">
+    <w:p>
+      <w:pPr>
+        <w:pStyle w:val="Textodecomentrio"/>
+      </w:pPr>
+      <w:r>
+        <w:rPr>
+          <w:rStyle w:val="Refdecomentrio"/>
+        </w:rPr>
+        <w:annotationRef/>
+      </w:r>
+      <w:r>
+        <w:t>Ajustar a Conclusão em uma página exclusivamente para conclusão.</w:t>
+      </w:r>
+    </w:p>
+  </w:comment>
+  <w:comment w:id="3" w:author="Cleverson S. Sobrinho" w:date="2026-08-25T15:35:00Z" w:initials="CS">
+    <w:p>
+      <w:pPr>
+        <w:pStyle w:val="Textodecomentrio"/>
+      </w:pPr>
+      <w:r>
+        <w:rPr>
+          <w:rStyle w:val="Refdecomentrio"/>
+        </w:rPr>
+        <w:annotationRef/>
+      </w:r>
+      <w:r>
+        <w:t>Ajustar a Bibliografia em uma página exclusivamente para bibliografia.</w:t>
+      </w:r>
+    </w:p>
+  </w:comment>
+</w:comments>
+</file>
+
+<file path=word/commentsExtended.xml><?xml version="1.0" encoding="utf-8"?>
+<w15:commentsEx xmlns:wpc="http://schemas.microsoft.com/office/word/2010/wordprocessingCanvas" xmlns:cx="http://schemas.microsoft.com/office/drawing/2014/chartex" xmlns:cx1="http://schemas.microsoft.com/office/drawing/2015/9/8/chartex" xmlns:cx2="http://schemas.microsoft.com/office/drawing/2015/10/21/chartex" xmlns:cx3="http://schemas.microsoft.com/office/drawing/2016/5/9/chartex" xmlns:cx4="http://schemas.microsoft.com/office/drawing/2016/5/10/chartex" xmlns:cx5="http://schemas.microsoft.com/office/drawing/2016/5/11/chartex" xmlns:cx6="http://schemas.microsoft.com/office/drawing/2016/5/12/chartex" xmlns:cx7="http://schemas.microsoft.com/office/drawing/2016/5/13/chartex" xmlns:cx8="http://schemas.microsoft.com/office/drawing/2016/5/14/chartex" xmlns:mc="http://schemas.openxmlformats.org/markup-compatibility/2006" xmlns:aink="http://schemas.microsoft.com/office/drawing/2016/ink" xmlns:am3d="http://schemas.microsoft.com/office/drawing/2017/model3d" xmlns:o="urn:schemas-microsoft-com:office:office" xmlns:oel="http://schemas.microsoft.com/office/2019/extlst" xmlns:r="http://schemas.openxmlformats.org/officeDocument/2006/relationships" xmlns:m="http://schemas.openxmlformats.org/officeDocument/2006/math" xmlns:v="urn:schemas-microsoft-com:vml" xmlns:wp14="http://schemas.microsoft.com/office/word/2010/wordprocessingDrawing" xmlns:wp="http://schemas.openxmlformats.org/drawingml/2006/wordprocessingDrawing" xmlns:w10="urn:schemas-microsoft-com:office:word" xmlns:w="http://schemas.openxmlformats.org/wordprocessingml/2006/main" xmlns:w14="http://schemas.microsoft.com/office/word/2010/wordml" xmlns:w15="http://schemas.microsoft.com/office/word/2012/wordml" xmlns:w16cex="http://schemas.microsoft.com/office/word/2018/wordml/cex" xmlns:w16cid="http://schemas.microsoft.com/office/word/2016/wordml/cid" xmlns:w16="http://schemas.microsoft.com/office/word/2018/wordml" xmlns:w16du="http://schemas.microsoft.com/office/word/2023/wordml/word16du" xmlns:w16sdtdh="http://schemas.microsoft.com/office/word/2020/wordml/sdtdatahash" xmlns:w16sdtfl="http://schemas.microsoft.com/office/word/2024/wordml/sdtformatlock" xmlns:w16se="http://schemas.microsoft.com/office/word/2015/wordml/symex" xmlns:wpg="http://schemas.microsoft.com/office/word/2010/wordprocessingGroup" xmlns:wpi="http://schemas.microsoft.com/office/word/2010/wordprocessingInk" xmlns:wne="http://schemas.microsoft.com/office/word/2006/wordml" xmlns:wps="http://schemas.microsoft.com/office/word/2010/wordprocessingShape" mc:Ignorable="w14 w15 w16se w16cid w16 w16cex w16sdtdh w16sdtfl w16du wp14">
+  <w15:commentEx w15:paraId="592B9A8A" w15:done="0"/>
+  <w15:commentEx w15:paraId="4D255365" w15:done="0"/>
+  <w15:commentEx w15:paraId="612C4526" w15:done="0"/>
+  <w15:commentEx w15:paraId="58B815D1" w15:done="0"/>
+</w15:commentsEx>
+</file>
+
+<file path=word/commentsExtensible.xml><?xml version="1.0" encoding="utf-8"?>
+<w16cex:commentsExtensible xmlns:wpc="http://schemas.microsoft.com/office/word/2010/wordprocessingCanvas" xmlns:cx="http://schemas.microsoft.com/office/drawing/2014/chartex" xmlns:cx1="http://schemas.microsoft.com/office/drawing/2015/9/8/chartex" xmlns:cx2="http://schemas.microsoft.com/office/drawing/2015/10/21/chartex" xmlns:cx3="http://schemas.microsoft.com/office/drawing/2016/5/9/chartex" xmlns:cx4="http://schemas.microsoft.com/office/drawing/2016/5/10/chartex" xmlns:cx5="http://schemas.microsoft.com/office/drawing/2016/5/11/chartex" xmlns:cx6="http://schemas.microsoft.com/office/drawing/2016/5/12/chartex" xmlns:cx7="http://schemas.microsoft.com/office/drawing/2016/5/13/chartex" xmlns:cx8="http://schemas.microsoft.com/office/drawing/2016/5/14/chartex" xmlns:cr="http://schemas.microsoft.com/office/comments/2020/reactions" xmlns:mc="http://schemas.openxmlformats.org/markup-compatibility/2006" xmlns:aink="http://schemas.microsoft.com/office/drawing/2016/ink" xmlns:am3d="http://schemas.microsoft.com/office/drawing/2017/model3d" xmlns:o="urn:schemas-microsoft-com:office:office" xmlns:oel="http://schemas.microsoft.com/office/2019/extlst" xmlns:r="http://schemas.openxmlformats.org/officeDocument/2006/relationships" xmlns:m="http://schemas.openxmlformats.org/officeDocument/2006/math" xmlns:v="urn:schemas-microsoft-com:vml" xmlns:wp14="http://schemas.microsoft.com/office/word/2010/wordprocessingDrawing" xmlns:wp="http://schemas.openxmlformats.org/drawingml/2006/wordprocessingDrawing" xmlns:w10="urn:schemas-microsoft-com:office:word" xmlns:w="http://schemas.openxmlformats.org/wordprocessingml/2006/main" xmlns:w14="http://schemas.microsoft.com/office/word/2010/wordml" xmlns:w15="http://schemas.microsoft.com/office/word/2012/wordml" xmlns:w16cex="http://schemas.microsoft.com/office/word/2018/wordml/cex" xmlns:w16cid="http://schemas.microsoft.com/office/word/2016/wordml/cid" xmlns:w16="http://schemas.microsoft.com/office/word/2018/wordml" xmlns:w16du="http://schemas.microsoft.com/office/word/2023/wordml/word16du" xmlns:w16sdtdh="http://schemas.microsoft.com/office/word/2020/wordml/sdtdatahash" xmlns:w16sdtfl="http://schemas.microsoft.com/office/word/2024/wordml/sdtformatlock" xmlns:w16se="http://schemas.microsoft.com/office/word/2015/wordml/symex" xmlns:wpg="http://schemas.microsoft.com/office/word/2010/wordprocessingGroup" xmlns:wpi="http://schemas.microsoft.com/office/word/2010/wordprocessingInk" xmlns:wne="http://schemas.microsoft.com/office/word/2006/wordml" xmlns:wps="http://schemas.microsoft.com/office/word/2010/wordprocessingShape" mc:Ignorable="w14 w15 w16se w16cid w16 w16cex w16sdtdh w16sdtfl cr w16du wp14">
+  <w16cex:commentExtensible w16cex:durableId="14969B87" w16cex:dateUtc="2026-08-25T19:34:00Z"/>
+  <w16cex:commentExtensible w16cex:durableId="2C4B0949" w16cex:dateUtc="2026-08-25T19:26:00Z"/>
+  <w16cex:commentExtensible w16cex:durableId="6435CBFC" w16cex:dateUtc="2026-08-25T19:35:00Z"/>
+  <w16cex:commentExtensible w16cex:durableId="6E64C5C7" w16cex:dateUtc="2026-08-25T19:35:00Z"/>
+</w16cex:commentsExtensible>
+</file>
+
+<file path=word/commentsIds.xml><?xml version="1.0" encoding="utf-8"?>
+<w16cid:commentsIds xmlns:wpc="http://schemas.microsoft.com/office/word/2010/wordprocessingCanvas" xmlns:cx="http://schemas.microsoft.com/office/drawing/2014/chartex" xmlns:cx1="http://schemas.microsoft.com/office/drawing/2015/9/8/chartex" xmlns:cx2="http://schemas.microsoft.com/office/drawing/2015/10/21/chartex" xmlns:cx3="http://schemas.microsoft.com/office/drawing/2016/5/9/chartex" xmlns:cx4="http://schemas.microsoft.com/office/drawing/2016/5/10/chartex" xmlns:cx5="http://schemas.microsoft.com/office/drawing/2016/5/11/chartex" xmlns:cx6="http://schemas.microsoft.com/office/drawing/2016/5/12/chartex" xmlns:cx7="http://schemas.microsoft.com/office/drawing/2016/5/13/chartex" xmlns:cx8="http://schemas.microsoft.com/office/drawing/2016/5/14/chartex" xmlns:mc="http://schemas.openxmlformats.org/markup-compatibility/2006" xmlns:aink="http://schemas.microsoft.com/office/drawing/2016/ink" xmlns:am3d="http://schemas.microsoft.com/office/drawing/2017/model3d" xmlns:o="urn:schemas-microsoft-com:office:office" xmlns:oel="http://schemas.microsoft.com/office/2019/extlst" xmlns:r="http://schemas.openxmlformats.org/officeDocument/2006/relationships" xmlns:m="http://schemas.openxmlformats.org/officeDocument/2006/math" xmlns:v="urn:schemas-microsoft-com:vml" xmlns:wp14="http://schemas.microsoft.com/office/word/2010/wordprocessingDrawing" xmlns:wp="http://schemas.openxmlformats.org/drawingml/2006/wordprocessingDrawing" xmlns:w10="urn:schemas-microsoft-com:office:word" xmlns:w="http://schemas.openxmlformats.org/wordprocessingml/2006/main" xmlns:w14="http://schemas.microsoft.com/office/word/2010/wordml" xmlns:w15="http://schemas.microsoft.com/office/word/2012/wordml" xmlns:w16cex="http://schemas.microsoft.com/office/word/2018/wordml/cex" xmlns:w16cid="http://schemas.microsoft.com/office/word/2016/wordml/cid" xmlns:w16="http://schemas.microsoft.com/office/word/2018/wordml" xmlns:w16du="http://schemas.microsoft.com/office/word/2023/wordml/word16du" xmlns:w16sdtdh="http://schemas.microsoft.com/office/word/2020/wordml/sdtdatahash" xmlns:w16sdtfl="http://schemas.microsoft.com/office/word/2024/wordml/sdtformatlock" xmlns:w16se="http://schemas.microsoft.com/office/word/2015/wordml/symex" xmlns:wpg="http://schemas.microsoft.com/office/word/2010/wordprocessingGroup" xmlns:wpi="http://schemas.microsoft.com/office/word/2010/wordprocessingInk" xmlns:wne="http://schemas.microsoft.com/office/word/2006/wordml" xmlns:wps="http://schemas.microsoft.com/office/word/2010/wordprocessingShape" mc:Ignorable="w14 w15 w16se w16cid w16 w16cex w16sdtdh w16sdtfl w16du wp14">
+  <w16cid:commentId w16cid:paraId="592B9A8A" w16cid:durableId="14969B87"/>
+  <w16cid:commentId w16cid:paraId="4D255365" w16cid:durableId="2C4B0949"/>
+  <w16cid:commentId w16cid:paraId="612C4526" w16cid:durableId="6435CBFC"/>
+  <w16cid:commentId w16cid:paraId="58B815D1" w16cid:durableId="6E64C5C7"/>
+</w16cid:commentsIds>
 </file>
 
 <file path=word/endnotes.xml><?xml version="1.0" encoding="utf-8"?>
@@ -7162,6 +7267,14 @@
     <w:abstractNumId w:val="2"/>
   </w:num>
 </w:numbering>
+</file>
+
+<file path=word/people.xml><?xml version="1.0" encoding="utf-8"?>
+<w15:people xmlns:wpc="http://schemas.microsoft.com/office/word/2010/wordprocessingCanvas" xmlns:cx="http://schemas.microsoft.com/office/drawing/2014/chartex" xmlns:cx1="http://schemas.microsoft.com/office/drawing/2015/9/8/chartex" xmlns:cx2="http://schemas.microsoft.com/office/drawing/2015/10/21/chartex" xmlns:cx3="http://schemas.microsoft.com/office/drawing/2016/5/9/chartex" xmlns:cx4="http://schemas.microsoft.com/office/drawing/2016/5/10/chartex" xmlns:cx5="http://schemas.microsoft.com/office/drawing/2016/5/11/chartex" xmlns:cx6="http://schemas.microsoft.com/office/drawing/2016/5/12/chartex" xmlns:cx7="http://schemas.microsoft.com/office/drawing/2016/5/13/chartex" xmlns:cx8="http://schemas.microsoft.com/office/drawing/2016/5/14/chartex" xmlns:mc="http://schemas.openxmlformats.org/markup-compatibility/2006" xmlns:aink="http://schemas.microsoft.com/office/drawing/2016/ink" xmlns:am3d="http://schemas.microsoft.com/office/drawing/2017/model3d" xmlns:o="urn:schemas-microsoft-com:office:office" xmlns:oel="http://schemas.microsoft.com/office/2019/extlst" xmlns:r="http://schemas.openxmlformats.org/officeDocument/2006/relationships" xmlns:m="http://schemas.openxmlformats.org/officeDocument/2006/math" xmlns:v="urn:schemas-microsoft-com:vml" xmlns:wp14="http://schemas.microsoft.com/office/word/2010/wordprocessingDrawing" xmlns:wp="http://schemas.openxmlformats.org/drawingml/2006/wordprocessingDrawing" xmlns:w10="urn:schemas-microsoft-com:office:word" xmlns:w="http://schemas.openxmlformats.org/wordprocessingml/2006/main" xmlns:w14="http://schemas.microsoft.com/office/word/2010/wordml" xmlns:w15="http://schemas.microsoft.com/office/word/2012/wordml" xmlns:w16cex="http://schemas.microsoft.com/office/word/2018/wordml/cex" xmlns:w16cid="http://schemas.microsoft.com/office/word/2016/wordml/cid" xmlns:w16="http://schemas.microsoft.com/office/word/2018/wordml" xmlns:w16du="http://schemas.microsoft.com/office/word/2023/wordml/word16du" xmlns:w16sdtdh="http://schemas.microsoft.com/office/word/2020/wordml/sdtdatahash" xmlns:w16sdtfl="http://schemas.microsoft.com/office/word/2024/wordml/sdtformatlock" xmlns:w16se="http://schemas.microsoft.com/office/word/2015/wordml/symex" xmlns:wpg="http://schemas.microsoft.com/office/word/2010/wordprocessingGroup" xmlns:wpi="http://schemas.microsoft.com/office/word/2010/wordprocessingInk" xmlns:wne="http://schemas.microsoft.com/office/word/2006/wordml" xmlns:wps="http://schemas.microsoft.com/office/word/2010/wordprocessingShape" mc:Ignorable="w14 w15 w16se w16cid w16 w16cex w16sdtdh w16sdtfl w16du wp14">
+  <w15:person w15:author="Cleverson S. Sobrinho">
+    <w15:presenceInfo w15:providerId="Windows Live" w15:userId="0cd7cd78bee6268b"/>
+  </w15:person>
+</w15:people>
 </file>
 
 <file path=word/styles.xml><?xml version="1.0" encoding="utf-8"?>
@@ -7972,6 +8085,69 @@
       <w:noProof/>
     </w:rPr>
   </w:style>
+  <w:style w:type="character" w:styleId="Refdecomentrio">
+    <w:name w:val="annotation reference"/>
+    <w:basedOn w:val="Fontepargpadro"/>
+    <w:uiPriority w:val="99"/>
+    <w:semiHidden/>
+    <w:unhideWhenUsed/>
+    <w:rsid w:val="00364B2F"/>
+    <w:rPr>
+      <w:sz w:val="16"/>
+      <w:szCs w:val="16"/>
+    </w:rPr>
+  </w:style>
+  <w:style w:type="paragraph" w:styleId="Textodecomentrio">
+    <w:name w:val="annotation text"/>
+    <w:basedOn w:val="Normal"/>
+    <w:link w:val="TextodecomentrioChar"/>
+    <w:uiPriority w:val="99"/>
+    <w:unhideWhenUsed/>
+    <w:rsid w:val="00364B2F"/>
+    <w:rPr>
+      <w:sz w:val="20"/>
+      <w:szCs w:val="20"/>
+    </w:rPr>
+  </w:style>
+  <w:style w:type="character" w:customStyle="1" w:styleId="TextodecomentrioChar">
+    <w:name w:val="Texto de comentário Char"/>
+    <w:basedOn w:val="Fontepargpadro"/>
+    <w:link w:val="Textodecomentrio"/>
+    <w:uiPriority w:val="99"/>
+    <w:rsid w:val="00364B2F"/>
+    <w:rPr>
+      <w:sz w:val="20"/>
+      <w:szCs w:val="20"/>
+    </w:rPr>
+  </w:style>
+  <w:style w:type="paragraph" w:styleId="Assuntodocomentrio">
+    <w:name w:val="annotation subject"/>
+    <w:basedOn w:val="Textodecomentrio"/>
+    <w:next w:val="Textodecomentrio"/>
+    <w:link w:val="AssuntodocomentrioChar"/>
+    <w:uiPriority w:val="99"/>
+    <w:semiHidden/>
+    <w:unhideWhenUsed/>
+    <w:rsid w:val="00364B2F"/>
+    <w:rPr>
+      <w:b/>
+      <w:bCs/>
+    </w:rPr>
+  </w:style>
+  <w:style w:type="character" w:customStyle="1" w:styleId="AssuntodocomentrioChar">
+    <w:name w:val="Assunto do comentário Char"/>
+    <w:basedOn w:val="TextodecomentrioChar"/>
+    <w:link w:val="Assuntodocomentrio"/>
+    <w:uiPriority w:val="99"/>
+    <w:semiHidden/>
+    <w:rsid w:val="00364B2F"/>
+    <w:rPr>
+      <w:b/>
+      <w:bCs/>
+      <w:sz w:val="20"/>
+      <w:szCs w:val="20"/>
+    </w:rPr>
+  </w:style>
 </w:styles>
 </file>
 

</xml_diff>

<commit_message>
Add sumario no relatorio
</commit_message>
<xml_diff>
--- a/doc/_RELATORIOS DE ATIV. PRATICAS - GRUPO 04.docx
+++ b/doc/_RELATORIOS DE ATIV. PRATICAS - GRUPO 04.docx
@@ -65,8 +65,8 @@
           <w:rFonts w:ascii="Arial" w:eastAsia="Arial" w:hAnsi="Arial" w:cs="Arial"/>
           <w:b/>
           <w:bCs/>
-          <w:sz w:val="28"/>
-          <w:szCs w:val="28"/>
+          <w:sz w:val="24"/>
+          <w:szCs w:val="24"/>
         </w:rPr>
       </w:pPr>
       <w:commentRangeStart w:id="0"/>
@@ -75,8 +75,8 @@
           <w:rFonts w:ascii="Arial" w:eastAsia="Arial" w:hAnsi="Arial" w:cs="Arial"/>
           <w:b/>
           <w:bCs/>
-          <w:sz w:val="28"/>
-          <w:szCs w:val="28"/>
+          <w:sz w:val="24"/>
+          <w:szCs w:val="24"/>
         </w:rPr>
         <w:t xml:space="preserve">CENTRO DE EDUCAÇÃO TECNOLÓGICA DO AMAZONAS </w:t>
       </w:r>
@@ -90,17 +90,17 @@
           <w:b/>
           <w:bCs/>
           <w:color w:val="C55911"/>
-          <w:sz w:val="28"/>
-          <w:szCs w:val="28"/>
-        </w:rPr>
-      </w:pPr>
-      <w:r>
-        <w:rPr>
-          <w:rFonts w:ascii="Arial" w:eastAsia="Arial" w:hAnsi="Arial" w:cs="Arial"/>
-          <w:b/>
-          <w:bCs/>
-          <w:sz w:val="28"/>
-          <w:szCs w:val="28"/>
+          <w:sz w:val="24"/>
+          <w:szCs w:val="24"/>
+        </w:rPr>
+      </w:pPr>
+      <w:r>
+        <w:rPr>
+          <w:rFonts w:ascii="Arial" w:eastAsia="Arial" w:hAnsi="Arial" w:cs="Arial"/>
+          <w:b/>
+          <w:bCs/>
+          <w:sz w:val="24"/>
+          <w:szCs w:val="24"/>
         </w:rPr>
         <w:t>CETAM</w:t>
       </w:r>
@@ -112,8 +112,8 @@
           <w:b/>
           <w:bCs/>
           <w:color w:val="C55911"/>
-          <w:sz w:val="28"/>
-          <w:szCs w:val="28"/>
+          <w:sz w:val="24"/>
+          <w:szCs w:val="24"/>
         </w:rPr>
         <w:commentReference w:id="0"/>
       </w:r>
@@ -367,7 +367,27 @@
           <w:sz w:val="24"/>
           <w:szCs w:val="24"/>
         </w:rPr>
-        <w:t>ISAQUE REIS</w:t>
+        <w:t>ISAQUE</w:t>
+      </w:r>
+      <w:r>
+        <w:rPr>
+          <w:rFonts w:ascii="Arial" w:eastAsia="Arial" w:hAnsi="Arial" w:cs="Arial"/>
+          <w:b/>
+          <w:bCs/>
+          <w:sz w:val="24"/>
+          <w:szCs w:val="24"/>
+        </w:rPr>
+        <w:t xml:space="preserve"> BEZERRA</w:t>
+      </w:r>
+      <w:r>
+        <w:rPr>
+          <w:rFonts w:ascii="Arial" w:eastAsia="Arial" w:hAnsi="Arial" w:cs="Arial"/>
+          <w:b/>
+          <w:bCs/>
+          <w:sz w:val="24"/>
+          <w:szCs w:val="24"/>
+        </w:rPr>
+        <w:t xml:space="preserve"> REIS</w:t>
       </w:r>
     </w:p>
     <w:p>
@@ -391,7 +411,27 @@
           <w:sz w:val="24"/>
           <w:szCs w:val="24"/>
         </w:rPr>
-        <w:t>JOQUEBEDE SANTOS</w:t>
+        <w:t xml:space="preserve">JOQUEBEDE </w:t>
+      </w:r>
+      <w:r>
+        <w:rPr>
+          <w:rFonts w:ascii="Arial" w:eastAsia="Arial" w:hAnsi="Arial" w:cs="Arial"/>
+          <w:b/>
+          <w:bCs/>
+          <w:sz w:val="24"/>
+          <w:szCs w:val="24"/>
+        </w:rPr>
+        <w:t xml:space="preserve">BARBOSA </w:t>
+      </w:r>
+      <w:r>
+        <w:rPr>
+          <w:rFonts w:ascii="Arial" w:eastAsia="Arial" w:hAnsi="Arial" w:cs="Arial"/>
+          <w:b/>
+          <w:bCs/>
+          <w:sz w:val="24"/>
+          <w:szCs w:val="24"/>
+        </w:rPr>
+        <w:t>SANTOS</w:t>
       </w:r>
     </w:p>
     <w:p>
@@ -415,7 +455,37 @@
           <w:sz w:val="24"/>
           <w:szCs w:val="24"/>
         </w:rPr>
-        <w:t>SUELEN TAVARES</w:t>
+        <w:t>SUEL</w:t>
+      </w:r>
+      <w:r>
+        <w:rPr>
+          <w:rFonts w:ascii="Arial" w:eastAsia="Arial" w:hAnsi="Arial" w:cs="Arial"/>
+          <w:b/>
+          <w:bCs/>
+          <w:sz w:val="24"/>
+          <w:szCs w:val="24"/>
+        </w:rPr>
+        <w:t>L</w:t>
+      </w:r>
+      <w:r>
+        <w:rPr>
+          <w:rFonts w:ascii="Arial" w:eastAsia="Arial" w:hAnsi="Arial" w:cs="Arial"/>
+          <w:b/>
+          <w:bCs/>
+          <w:sz w:val="24"/>
+          <w:szCs w:val="24"/>
+        </w:rPr>
+        <w:t>EN TAVARES</w:t>
+      </w:r>
+      <w:r>
+        <w:rPr>
+          <w:rFonts w:ascii="Arial" w:eastAsia="Arial" w:hAnsi="Arial" w:cs="Arial"/>
+          <w:b/>
+          <w:bCs/>
+          <w:sz w:val="24"/>
+          <w:szCs w:val="24"/>
+        </w:rPr>
+        <w:t xml:space="preserve"> DOS SANTOS</w:t>
       </w:r>
     </w:p>
     <w:p>
@@ -441,6 +511,16 @@
         </w:rPr>
         <w:t>SUELY NASCIMENTO</w:t>
       </w:r>
+      <w:r>
+        <w:rPr>
+          <w:rFonts w:ascii="Arial" w:eastAsia="Arial" w:hAnsi="Arial" w:cs="Arial"/>
+          <w:b/>
+          <w:bCs/>
+          <w:sz w:val="24"/>
+          <w:szCs w:val="24"/>
+        </w:rPr>
+        <w:t xml:space="preserve"> COSTA</w:t>
+      </w:r>
     </w:p>
     <w:p>
       <w:pPr>
@@ -607,10 +687,90 @@
           <w:rFonts w:ascii="Arial" w:eastAsia="Arial" w:hAnsi="Arial" w:cs="Arial"/>
           <w:b/>
           <w:bCs/>
-          <w:sz w:val="24"/>
-          <w:szCs w:val="24"/>
-        </w:rPr>
-        <w:lastRenderedPageBreak/>
+          <w:noProof/>
+          <w:sz w:val="24"/>
+          <w:szCs w:val="24"/>
+        </w:rPr>
+        <mc:AlternateContent>
+          <mc:Choice Requires="wps">
+            <w:drawing>
+              <wp:anchor distT="0" distB="0" distL="114300" distR="114300" simplePos="0" relativeHeight="251663360" behindDoc="0" locked="0" layoutInCell="1" allowOverlap="1" wp14:anchorId="780C39D2" wp14:editId="036B35F7">
+                <wp:simplePos x="0" y="0"/>
+                <wp:positionH relativeFrom="column">
+                  <wp:posOffset>5543550</wp:posOffset>
+                </wp:positionH>
+                <wp:positionV relativeFrom="paragraph">
+                  <wp:posOffset>157480</wp:posOffset>
+                </wp:positionV>
+                <wp:extent cx="295275" cy="219075"/>
+                <wp:effectExtent l="0" t="0" r="28575" b="28575"/>
+                <wp:wrapNone/>
+                <wp:docPr id="1735986890" name="Retângulo 2"/>
+                <wp:cNvGraphicFramePr/>
+                <a:graphic xmlns:a="http://schemas.openxmlformats.org/drawingml/2006/main">
+                  <a:graphicData uri="http://schemas.microsoft.com/office/word/2010/wordprocessingShape">
+                    <wps:wsp>
+                      <wps:cNvSpPr/>
+                      <wps:spPr>
+                        <a:xfrm>
+                          <a:off x="0" y="0"/>
+                          <a:ext cx="295275" cy="219075"/>
+                        </a:xfrm>
+                        <a:prstGeom prst="rect">
+                          <a:avLst/>
+                        </a:prstGeom>
+                        <a:solidFill>
+                          <a:schemeClr val="bg1"/>
+                        </a:solidFill>
+                        <a:ln>
+                          <a:solidFill>
+                            <a:schemeClr val="bg1"/>
+                          </a:solidFill>
+                        </a:ln>
+                      </wps:spPr>
+                      <wps:style>
+                        <a:lnRef idx="2">
+                          <a:schemeClr val="accent1">
+                            <a:shade val="15000"/>
+                          </a:schemeClr>
+                        </a:lnRef>
+                        <a:fillRef idx="1">
+                          <a:schemeClr val="accent1"/>
+                        </a:fillRef>
+                        <a:effectRef idx="0">
+                          <a:schemeClr val="accent1"/>
+                        </a:effectRef>
+                        <a:fontRef idx="minor">
+                          <a:schemeClr val="lt1"/>
+                        </a:fontRef>
+                      </wps:style>
+                      <wps:bodyPr rot="0" spcFirstLastPara="0" vertOverflow="overflow" horzOverflow="overflow" vert="horz" wrap="square" lIns="91440" tIns="45720" rIns="91440" bIns="45720" numCol="1" spcCol="0" rtlCol="0" fromWordArt="0" anchor="ctr" anchorCtr="0" forceAA="0" compatLnSpc="1">
+                        <a:prstTxWarp prst="textNoShape">
+                          <a:avLst/>
+                        </a:prstTxWarp>
+                        <a:noAutofit/>
+                      </wps:bodyPr>
+                    </wps:wsp>
+                  </a:graphicData>
+                </a:graphic>
+              </wp:anchor>
+            </w:drawing>
+          </mc:Choice>
+          <mc:Fallback>
+            <w:pict>
+              <v:rect w14:anchorId="0A1BDE14" id="Retângulo 2" o:spid="_x0000_s1026" style="position:absolute;margin-left:436.5pt;margin-top:12.4pt;width:23.25pt;height:17.25pt;z-index:251663360;visibility:visible;mso-wrap-style:square;mso-wrap-distance-left:9pt;mso-wrap-distance-top:0;mso-wrap-distance-right:9pt;mso-wrap-distance-bottom:0;mso-position-horizontal:absolute;mso-position-horizontal-relative:text;mso-position-vertical:absolute;mso-position-vertical-relative:text;v-text-anchor:middle" o:gfxdata="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" fillcolor="white [3212]" strokecolor="white [3212]" strokeweight="2pt"/>
+            </w:pict>
+          </mc:Fallback>
+        </mc:AlternateContent>
+      </w:r>
+      <w:r>
+        <w:rPr>
+          <w:rFonts w:ascii="Arial" w:eastAsia="Arial" w:hAnsi="Arial" w:cs="Arial"/>
+          <w:b/>
+          <w:bCs/>
+          <w:sz w:val="24"/>
+          <w:szCs w:val="24"/>
+        </w:rPr>
         <w:t>MANAUS/AM - 2026</w:t>
       </w:r>
     </w:p>
@@ -944,24 +1104,525 @@
       <w:r>
         <w:rPr>
           <w:rFonts w:ascii="Arial" w:eastAsia="Arial" w:hAnsi="Arial" w:cs="Arial"/>
+          <w:b/>
+          <w:bCs/>
+          <w:noProof/>
+          <w:sz w:val="24"/>
+          <w:szCs w:val="24"/>
+        </w:rPr>
+        <mc:AlternateContent>
+          <mc:Choice Requires="wps">
+            <w:drawing>
+              <wp:anchor distT="0" distB="0" distL="114300" distR="114300" simplePos="0" relativeHeight="251661312" behindDoc="0" locked="0" layoutInCell="1" allowOverlap="1" wp14:anchorId="7E35E53B" wp14:editId="0F13C010">
+                <wp:simplePos x="0" y="0"/>
+                <wp:positionH relativeFrom="column">
+                  <wp:posOffset>5514975</wp:posOffset>
+                </wp:positionH>
+                <wp:positionV relativeFrom="paragraph">
+                  <wp:posOffset>456565</wp:posOffset>
+                </wp:positionV>
+                <wp:extent cx="295275" cy="219075"/>
+                <wp:effectExtent l="0" t="0" r="28575" b="28575"/>
+                <wp:wrapNone/>
+                <wp:docPr id="1299297883" name="Retângulo 2"/>
+                <wp:cNvGraphicFramePr/>
+                <a:graphic xmlns:a="http://schemas.openxmlformats.org/drawingml/2006/main">
+                  <a:graphicData uri="http://schemas.microsoft.com/office/word/2010/wordprocessingShape">
+                    <wps:wsp>
+                      <wps:cNvSpPr/>
+                      <wps:spPr>
+                        <a:xfrm>
+                          <a:off x="0" y="0"/>
+                          <a:ext cx="295275" cy="219075"/>
+                        </a:xfrm>
+                        <a:prstGeom prst="rect">
+                          <a:avLst/>
+                        </a:prstGeom>
+                        <a:solidFill>
+                          <a:schemeClr val="bg1"/>
+                        </a:solidFill>
+                        <a:ln>
+                          <a:solidFill>
+                            <a:schemeClr val="bg1"/>
+                          </a:solidFill>
+                        </a:ln>
+                      </wps:spPr>
+                      <wps:style>
+                        <a:lnRef idx="2">
+                          <a:schemeClr val="accent1">
+                            <a:shade val="15000"/>
+                          </a:schemeClr>
+                        </a:lnRef>
+                        <a:fillRef idx="1">
+                          <a:schemeClr val="accent1"/>
+                        </a:fillRef>
+                        <a:effectRef idx="0">
+                          <a:schemeClr val="accent1"/>
+                        </a:effectRef>
+                        <a:fontRef idx="minor">
+                          <a:schemeClr val="lt1"/>
+                        </a:fontRef>
+                      </wps:style>
+                      <wps:bodyPr rot="0" spcFirstLastPara="0" vertOverflow="overflow" horzOverflow="overflow" vert="horz" wrap="square" lIns="91440" tIns="45720" rIns="91440" bIns="45720" numCol="1" spcCol="0" rtlCol="0" fromWordArt="0" anchor="ctr" anchorCtr="0" forceAA="0" compatLnSpc="1">
+                        <a:prstTxWarp prst="textNoShape">
+                          <a:avLst/>
+                        </a:prstTxWarp>
+                        <a:noAutofit/>
+                      </wps:bodyPr>
+                    </wps:wsp>
+                  </a:graphicData>
+                </a:graphic>
+              </wp:anchor>
+            </w:drawing>
+          </mc:Choice>
+          <mc:Fallback>
+            <w:pict>
+              <v:rect w14:anchorId="57A8D9BD" id="Retângulo 2" o:spid="_x0000_s1026" style="position:absolute;margin-left:434.25pt;margin-top:35.95pt;width:23.25pt;height:17.25pt;z-index:251661312;visibility:visible;mso-wrap-style:square;mso-wrap-distance-left:9pt;mso-wrap-distance-top:0;mso-wrap-distance-right:9pt;mso-wrap-distance-bottom:0;mso-position-horizontal:absolute;mso-position-horizontal-relative:text;mso-position-vertical:absolute;mso-position-vertical-relative:text;v-text-anchor:middle" o:gfxdata="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" fillcolor="white [3212]" strokecolor="white [3212]" strokeweight="2pt"/>
+            </w:pict>
+          </mc:Fallback>
+        </mc:AlternateContent>
+      </w:r>
+      <w:r>
+        <w:rPr>
+          <w:rFonts w:ascii="Arial" w:eastAsia="Arial" w:hAnsi="Arial" w:cs="Arial"/>
           <w:sz w:val="24"/>
           <w:szCs w:val="24"/>
         </w:rPr>
         <w:t>Professor/Orientador:______________________________________________</w:t>
       </w:r>
+      <w:r>
+        <w:rPr>
+          <w:rFonts w:ascii="Arial" w:eastAsia="Arial" w:hAnsi="Arial" w:cs="Arial"/>
+          <w:b/>
+          <w:bCs/>
+          <w:noProof/>
+          <w:sz w:val="24"/>
+          <w:szCs w:val="24"/>
+        </w:rPr>
+        <w:t xml:space="preserve"> </w:t>
+      </w:r>
     </w:p>
     <w:p>
       <w:pPr>
         <w:widowControl/>
         <w:spacing w:after="200" w:line="360" w:lineRule="auto"/>
         <w:ind w:firstLine="851"/>
-        <w:jc w:val="both"/>
-        <w:rPr>
-          <w:rFonts w:ascii="Arial" w:eastAsia="Arial" w:hAnsi="Arial" w:cs="Arial"/>
-          <w:sz w:val="24"/>
-          <w:szCs w:val="24"/>
-        </w:rPr>
-      </w:pPr>
+        <w:jc w:val="center"/>
+        <w:rPr>
+          <w:rFonts w:ascii="Arial" w:eastAsia="Arial" w:hAnsi="Arial" w:cs="Arial"/>
+          <w:b/>
+          <w:bCs/>
+          <w:sz w:val="24"/>
+          <w:szCs w:val="24"/>
+        </w:rPr>
+      </w:pPr>
+      <w:r>
+        <w:rPr>
+          <w:rFonts w:ascii="Arial" w:eastAsia="Arial" w:hAnsi="Arial" w:cs="Arial"/>
+          <w:b/>
+          <w:bCs/>
+          <w:sz w:val="24"/>
+          <w:szCs w:val="24"/>
+        </w:rPr>
+        <w:lastRenderedPageBreak/>
+        <w:t>Sumario</w:t>
+      </w:r>
+    </w:p>
+    <w:p>
+      <w:pPr>
+        <w:widowControl/>
+        <w:spacing w:after="200" w:line="360" w:lineRule="auto"/>
+        <w:ind w:firstLine="851"/>
+        <w:jc w:val="center"/>
+        <w:rPr>
+          <w:rFonts w:ascii="Arial" w:eastAsia="Arial" w:hAnsi="Arial" w:cs="Arial"/>
+          <w:b/>
+          <w:bCs/>
+          <w:sz w:val="24"/>
+          <w:szCs w:val="24"/>
+        </w:rPr>
+      </w:pPr>
+    </w:p>
+    <w:p>
+      <w:pPr>
+        <w:widowControl/>
+        <w:spacing w:after="200" w:line="360" w:lineRule="auto"/>
+        <w:ind w:firstLine="851"/>
+        <w:jc w:val="center"/>
+        <w:rPr>
+          <w:rFonts w:ascii="Arial" w:eastAsia="Arial" w:hAnsi="Arial" w:cs="Arial"/>
+          <w:b/>
+          <w:bCs/>
+          <w:sz w:val="24"/>
+          <w:szCs w:val="24"/>
+        </w:rPr>
+      </w:pPr>
+    </w:p>
+    <w:p>
+      <w:pPr>
+        <w:widowControl/>
+        <w:spacing w:after="200" w:line="360" w:lineRule="auto"/>
+        <w:ind w:firstLine="851"/>
+        <w:jc w:val="center"/>
+        <w:rPr>
+          <w:rFonts w:ascii="Arial" w:eastAsia="Arial" w:hAnsi="Arial" w:cs="Arial"/>
+          <w:b/>
+          <w:bCs/>
+          <w:sz w:val="24"/>
+          <w:szCs w:val="24"/>
+        </w:rPr>
+      </w:pPr>
+    </w:p>
+    <w:p>
+      <w:pPr>
+        <w:widowControl/>
+        <w:spacing w:after="200" w:line="360" w:lineRule="auto"/>
+        <w:ind w:firstLine="851"/>
+        <w:jc w:val="center"/>
+        <w:rPr>
+          <w:rFonts w:ascii="Arial" w:eastAsia="Arial" w:hAnsi="Arial" w:cs="Arial"/>
+          <w:b/>
+          <w:bCs/>
+          <w:sz w:val="24"/>
+          <w:szCs w:val="24"/>
+        </w:rPr>
+      </w:pPr>
+    </w:p>
+    <w:p>
+      <w:pPr>
+        <w:widowControl/>
+        <w:spacing w:after="200" w:line="360" w:lineRule="auto"/>
+        <w:ind w:firstLine="851"/>
+        <w:jc w:val="center"/>
+        <w:rPr>
+          <w:rFonts w:ascii="Arial" w:eastAsia="Arial" w:hAnsi="Arial" w:cs="Arial"/>
+          <w:b/>
+          <w:bCs/>
+          <w:sz w:val="24"/>
+          <w:szCs w:val="24"/>
+        </w:rPr>
+      </w:pPr>
+    </w:p>
+    <w:p>
+      <w:pPr>
+        <w:widowControl/>
+        <w:spacing w:after="200" w:line="360" w:lineRule="auto"/>
+        <w:ind w:firstLine="851"/>
+        <w:jc w:val="center"/>
+        <w:rPr>
+          <w:rFonts w:ascii="Arial" w:eastAsia="Arial" w:hAnsi="Arial" w:cs="Arial"/>
+          <w:b/>
+          <w:bCs/>
+          <w:sz w:val="24"/>
+          <w:szCs w:val="24"/>
+        </w:rPr>
+      </w:pPr>
+    </w:p>
+    <w:p>
+      <w:pPr>
+        <w:widowControl/>
+        <w:spacing w:after="200" w:line="360" w:lineRule="auto"/>
+        <w:ind w:firstLine="851"/>
+        <w:jc w:val="center"/>
+        <w:rPr>
+          <w:rFonts w:ascii="Arial" w:eastAsia="Arial" w:hAnsi="Arial" w:cs="Arial"/>
+          <w:b/>
+          <w:bCs/>
+          <w:sz w:val="24"/>
+          <w:szCs w:val="24"/>
+        </w:rPr>
+      </w:pPr>
+    </w:p>
+    <w:p>
+      <w:pPr>
+        <w:widowControl/>
+        <w:spacing w:after="200" w:line="360" w:lineRule="auto"/>
+        <w:ind w:firstLine="851"/>
+        <w:jc w:val="center"/>
+        <w:rPr>
+          <w:rFonts w:ascii="Arial" w:eastAsia="Arial" w:hAnsi="Arial" w:cs="Arial"/>
+          <w:b/>
+          <w:bCs/>
+          <w:sz w:val="24"/>
+          <w:szCs w:val="24"/>
+        </w:rPr>
+      </w:pPr>
+    </w:p>
+    <w:p>
+      <w:pPr>
+        <w:widowControl/>
+        <w:spacing w:after="200" w:line="360" w:lineRule="auto"/>
+        <w:ind w:firstLine="851"/>
+        <w:jc w:val="center"/>
+        <w:rPr>
+          <w:rFonts w:ascii="Arial" w:eastAsia="Arial" w:hAnsi="Arial" w:cs="Arial"/>
+          <w:b/>
+          <w:bCs/>
+          <w:sz w:val="24"/>
+          <w:szCs w:val="24"/>
+        </w:rPr>
+      </w:pPr>
+    </w:p>
+    <w:p>
+      <w:pPr>
+        <w:widowControl/>
+        <w:spacing w:after="200" w:line="360" w:lineRule="auto"/>
+        <w:ind w:firstLine="851"/>
+        <w:jc w:val="center"/>
+        <w:rPr>
+          <w:rFonts w:ascii="Arial" w:eastAsia="Arial" w:hAnsi="Arial" w:cs="Arial"/>
+          <w:b/>
+          <w:bCs/>
+          <w:sz w:val="24"/>
+          <w:szCs w:val="24"/>
+        </w:rPr>
+      </w:pPr>
+    </w:p>
+    <w:p>
+      <w:pPr>
+        <w:widowControl/>
+        <w:spacing w:after="200" w:line="360" w:lineRule="auto"/>
+        <w:ind w:firstLine="851"/>
+        <w:jc w:val="center"/>
+        <w:rPr>
+          <w:rFonts w:ascii="Arial" w:eastAsia="Arial" w:hAnsi="Arial" w:cs="Arial"/>
+          <w:b/>
+          <w:bCs/>
+          <w:sz w:val="24"/>
+          <w:szCs w:val="24"/>
+        </w:rPr>
+      </w:pPr>
+    </w:p>
+    <w:p>
+      <w:pPr>
+        <w:widowControl/>
+        <w:spacing w:after="200" w:line="360" w:lineRule="auto"/>
+        <w:ind w:firstLine="851"/>
+        <w:jc w:val="center"/>
+        <w:rPr>
+          <w:rFonts w:ascii="Arial" w:eastAsia="Arial" w:hAnsi="Arial" w:cs="Arial"/>
+          <w:b/>
+          <w:bCs/>
+          <w:sz w:val="24"/>
+          <w:szCs w:val="24"/>
+        </w:rPr>
+      </w:pPr>
+    </w:p>
+    <w:p>
+      <w:pPr>
+        <w:widowControl/>
+        <w:spacing w:after="200" w:line="360" w:lineRule="auto"/>
+        <w:ind w:firstLine="851"/>
+        <w:jc w:val="center"/>
+        <w:rPr>
+          <w:rFonts w:ascii="Arial" w:eastAsia="Arial" w:hAnsi="Arial" w:cs="Arial"/>
+          <w:b/>
+          <w:bCs/>
+          <w:sz w:val="24"/>
+          <w:szCs w:val="24"/>
+        </w:rPr>
+      </w:pPr>
+    </w:p>
+    <w:p>
+      <w:pPr>
+        <w:widowControl/>
+        <w:spacing w:after="200" w:line="360" w:lineRule="auto"/>
+        <w:ind w:firstLine="851"/>
+        <w:jc w:val="center"/>
+        <w:rPr>
+          <w:rFonts w:ascii="Arial" w:eastAsia="Arial" w:hAnsi="Arial" w:cs="Arial"/>
+          <w:b/>
+          <w:bCs/>
+          <w:sz w:val="24"/>
+          <w:szCs w:val="24"/>
+        </w:rPr>
+      </w:pPr>
+    </w:p>
+    <w:p>
+      <w:pPr>
+        <w:widowControl/>
+        <w:spacing w:after="200" w:line="360" w:lineRule="auto"/>
+        <w:ind w:firstLine="851"/>
+        <w:jc w:val="center"/>
+        <w:rPr>
+          <w:rFonts w:ascii="Arial" w:eastAsia="Arial" w:hAnsi="Arial" w:cs="Arial"/>
+          <w:b/>
+          <w:bCs/>
+          <w:sz w:val="24"/>
+          <w:szCs w:val="24"/>
+        </w:rPr>
+      </w:pPr>
+    </w:p>
+    <w:p>
+      <w:pPr>
+        <w:widowControl/>
+        <w:spacing w:after="200" w:line="360" w:lineRule="auto"/>
+        <w:ind w:firstLine="851"/>
+        <w:jc w:val="center"/>
+        <w:rPr>
+          <w:rFonts w:ascii="Arial" w:eastAsia="Arial" w:hAnsi="Arial" w:cs="Arial"/>
+          <w:b/>
+          <w:bCs/>
+          <w:sz w:val="24"/>
+          <w:szCs w:val="24"/>
+        </w:rPr>
+      </w:pPr>
+    </w:p>
+    <w:p>
+      <w:pPr>
+        <w:widowControl/>
+        <w:spacing w:after="200" w:line="360" w:lineRule="auto"/>
+        <w:ind w:firstLine="851"/>
+        <w:jc w:val="center"/>
+        <w:rPr>
+          <w:rFonts w:ascii="Arial" w:eastAsia="Arial" w:hAnsi="Arial" w:cs="Arial"/>
+          <w:b/>
+          <w:bCs/>
+          <w:sz w:val="24"/>
+          <w:szCs w:val="24"/>
+        </w:rPr>
+      </w:pPr>
+    </w:p>
+    <w:p>
+      <w:pPr>
+        <w:widowControl/>
+        <w:spacing w:after="200" w:line="360" w:lineRule="auto"/>
+        <w:ind w:firstLine="851"/>
+        <w:jc w:val="center"/>
+        <w:rPr>
+          <w:rFonts w:ascii="Arial" w:eastAsia="Arial" w:hAnsi="Arial" w:cs="Arial"/>
+          <w:b/>
+          <w:bCs/>
+          <w:sz w:val="24"/>
+          <w:szCs w:val="24"/>
+        </w:rPr>
+      </w:pPr>
+    </w:p>
+    <w:p>
+      <w:pPr>
+        <w:widowControl/>
+        <w:spacing w:after="200" w:line="360" w:lineRule="auto"/>
+        <w:ind w:firstLine="851"/>
+        <w:jc w:val="center"/>
+        <w:rPr>
+          <w:rFonts w:ascii="Arial" w:eastAsia="Arial" w:hAnsi="Arial" w:cs="Arial"/>
+          <w:b/>
+          <w:bCs/>
+          <w:sz w:val="24"/>
+          <w:szCs w:val="24"/>
+        </w:rPr>
+      </w:pPr>
+    </w:p>
+    <w:p>
+      <w:pPr>
+        <w:widowControl/>
+        <w:spacing w:after="200" w:line="360" w:lineRule="auto"/>
+        <w:ind w:firstLine="851"/>
+        <w:jc w:val="center"/>
+        <w:rPr>
+          <w:rFonts w:ascii="Arial" w:eastAsia="Arial" w:hAnsi="Arial" w:cs="Arial"/>
+          <w:b/>
+          <w:bCs/>
+          <w:sz w:val="24"/>
+          <w:szCs w:val="24"/>
+        </w:rPr>
+      </w:pPr>
+    </w:p>
+    <w:p>
+      <w:pPr>
+        <w:widowControl/>
+        <w:spacing w:after="200" w:line="360" w:lineRule="auto"/>
+        <w:ind w:firstLine="851"/>
+        <w:jc w:val="center"/>
+        <w:rPr>
+          <w:rFonts w:ascii="Arial" w:eastAsia="Arial" w:hAnsi="Arial" w:cs="Arial"/>
+          <w:b/>
+          <w:bCs/>
+          <w:sz w:val="24"/>
+          <w:szCs w:val="24"/>
+        </w:rPr>
+      </w:pPr>
+      <w:r>
+        <w:rPr>
+          <w:rFonts w:ascii="Arial" w:eastAsia="Arial" w:hAnsi="Arial" w:cs="Arial"/>
+          <w:b/>
+          <w:bCs/>
+          <w:noProof/>
+          <w:sz w:val="24"/>
+          <w:szCs w:val="24"/>
+        </w:rPr>
+        <mc:AlternateContent>
+          <mc:Choice Requires="wps">
+            <w:drawing>
+              <wp:anchor distT="0" distB="0" distL="114300" distR="114300" simplePos="0" relativeHeight="251659264" behindDoc="0" locked="0" layoutInCell="1" allowOverlap="1" wp14:anchorId="36819929" wp14:editId="0B02015E">
+                <wp:simplePos x="0" y="0"/>
+                <wp:positionH relativeFrom="column">
+                  <wp:posOffset>5558790</wp:posOffset>
+                </wp:positionH>
+                <wp:positionV relativeFrom="paragraph">
+                  <wp:posOffset>179070</wp:posOffset>
+                </wp:positionV>
+                <wp:extent cx="295275" cy="219075"/>
+                <wp:effectExtent l="0" t="0" r="28575" b="28575"/>
+                <wp:wrapNone/>
+                <wp:docPr id="1018855010" name="Retângulo 2"/>
+                <wp:cNvGraphicFramePr/>
+                <a:graphic xmlns:a="http://schemas.openxmlformats.org/drawingml/2006/main">
+                  <a:graphicData uri="http://schemas.microsoft.com/office/word/2010/wordprocessingShape">
+                    <wps:wsp>
+                      <wps:cNvSpPr/>
+                      <wps:spPr>
+                        <a:xfrm>
+                          <a:off x="0" y="0"/>
+                          <a:ext cx="295275" cy="219075"/>
+                        </a:xfrm>
+                        <a:prstGeom prst="rect">
+                          <a:avLst/>
+                        </a:prstGeom>
+                        <a:solidFill>
+                          <a:schemeClr val="bg1"/>
+                        </a:solidFill>
+                        <a:ln>
+                          <a:solidFill>
+                            <a:schemeClr val="bg1"/>
+                          </a:solidFill>
+                        </a:ln>
+                      </wps:spPr>
+                      <wps:style>
+                        <a:lnRef idx="2">
+                          <a:schemeClr val="accent1">
+                            <a:shade val="15000"/>
+                          </a:schemeClr>
+                        </a:lnRef>
+                        <a:fillRef idx="1">
+                          <a:schemeClr val="accent1"/>
+                        </a:fillRef>
+                        <a:effectRef idx="0">
+                          <a:schemeClr val="accent1"/>
+                        </a:effectRef>
+                        <a:fontRef idx="minor">
+                          <a:schemeClr val="lt1"/>
+                        </a:fontRef>
+                      </wps:style>
+                      <wps:bodyPr rot="0" spcFirstLastPara="0" vertOverflow="overflow" horzOverflow="overflow" vert="horz" wrap="square" lIns="91440" tIns="45720" rIns="91440" bIns="45720" numCol="1" spcCol="0" rtlCol="0" fromWordArt="0" anchor="ctr" anchorCtr="0" forceAA="0" compatLnSpc="1">
+                        <a:prstTxWarp prst="textNoShape">
+                          <a:avLst/>
+                        </a:prstTxWarp>
+                        <a:noAutofit/>
+                      </wps:bodyPr>
+                    </wps:wsp>
+                  </a:graphicData>
+                </a:graphic>
+              </wp:anchor>
+            </w:drawing>
+          </mc:Choice>
+          <mc:Fallback>
+            <w:pict>
+              <v:rect w14:anchorId="1731DFEC" id="Retângulo 2" o:spid="_x0000_s1026" style="position:absolute;margin-left:437.7pt;margin-top:14.1pt;width:23.25pt;height:17.25pt;z-index:251659264;visibility:visible;mso-wrap-style:square;mso-wrap-distance-left:9pt;mso-wrap-distance-top:0;mso-wrap-distance-right:9pt;mso-wrap-distance-bottom:0;mso-position-horizontal:absolute;mso-position-horizontal-relative:text;mso-position-vertical:absolute;mso-position-vertical-relative:text;v-text-anchor:middle" o:gfxdata="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" fillcolor="white [3212]" strokecolor="white [3212]" strokeweight="2pt"/>
+            </w:pict>
+          </mc:Fallback>
+        </mc:AlternateContent>
+      </w:r>
     </w:p>
     <w:p>
       <w:pPr>
@@ -1127,6 +1788,83 @@
           <w:szCs w:val="24"/>
         </w:rPr>
       </w:pPr>
+    </w:p>
+    <w:p>
+      <w:pPr>
+        <w:widowControl/>
+        <w:tabs>
+          <w:tab w:val="left" w:pos="567"/>
+        </w:tabs>
+        <w:spacing w:before="240" w:after="240" w:line="360" w:lineRule="auto"/>
+        <w:jc w:val="both"/>
+        <w:rPr>
+          <w:rFonts w:ascii="Arial" w:eastAsia="Arial" w:hAnsi="Arial" w:cs="Arial"/>
+          <w:sz w:val="24"/>
+          <w:szCs w:val="24"/>
+        </w:rPr>
+      </w:pPr>
+      <w:r>
+        <w:rPr>
+          <w:noProof/>
+        </w:rPr>
+        <w:drawing>
+          <wp:anchor distT="0" distB="0" distL="114300" distR="114300" simplePos="0" relativeHeight="251658240" behindDoc="1" locked="0" layoutInCell="1" allowOverlap="1" wp14:anchorId="7BE4798A" wp14:editId="01D5970D">
+            <wp:simplePos x="0" y="0"/>
+            <wp:positionH relativeFrom="column">
+              <wp:posOffset>5301615</wp:posOffset>
+            </wp:positionH>
+            <wp:positionV relativeFrom="paragraph">
+              <wp:posOffset>100330</wp:posOffset>
+            </wp:positionV>
+            <wp:extent cx="266700" cy="238125"/>
+            <wp:effectExtent l="0" t="0" r="0" b="9525"/>
+            <wp:wrapTight wrapText="bothSides">
+              <wp:wrapPolygon edited="0">
+                <wp:start x="0" y="0"/>
+                <wp:lineTo x="0" y="20736"/>
+                <wp:lineTo x="20057" y="20736"/>
+                <wp:lineTo x="20057" y="0"/>
+                <wp:lineTo x="0" y="0"/>
+              </wp:wrapPolygon>
+            </wp:wrapTight>
+            <wp:docPr id="1483886214" name="Imagem 1"/>
+            <wp:cNvGraphicFramePr>
+              <a:graphicFrameLocks xmlns:a="http://schemas.openxmlformats.org/drawingml/2006/main" noChangeAspect="1"/>
+            </wp:cNvGraphicFramePr>
+            <a:graphic xmlns:a="http://schemas.openxmlformats.org/drawingml/2006/main">
+              <a:graphicData uri="http://schemas.openxmlformats.org/drawingml/2006/picture">
+                <pic:pic xmlns:pic="http://schemas.openxmlformats.org/drawingml/2006/picture">
+                  <pic:nvPicPr>
+                    <pic:cNvPr id="1483886214" name=""/>
+                    <pic:cNvPicPr/>
+                  </pic:nvPicPr>
+                  <pic:blipFill>
+                    <a:blip r:embed="rId13">
+                      <a:extLst>
+                        <a:ext uri="{28A0092B-C50C-407E-A947-70E740481C1C}">
+                          <a14:useLocalDpi xmlns:a14="http://schemas.microsoft.com/office/drawing/2010/main" val="0"/>
+                        </a:ext>
+                      </a:extLst>
+                    </a:blip>
+                    <a:stretch>
+                      <a:fillRect/>
+                    </a:stretch>
+                  </pic:blipFill>
+                  <pic:spPr>
+                    <a:xfrm>
+                      <a:off x="0" y="0"/>
+                      <a:ext cx="266700" cy="238125"/>
+                    </a:xfrm>
+                    <a:prstGeom prst="rect">
+                      <a:avLst/>
+                    </a:prstGeom>
+                  </pic:spPr>
+                </pic:pic>
+              </a:graphicData>
+            </a:graphic>
+          </wp:anchor>
+        </w:drawing>
+      </w:r>
     </w:p>
     <w:p>
       <w:pPr>
@@ -1804,7 +2542,7 @@
                     <pic:cNvPicPr/>
                   </pic:nvPicPr>
                   <pic:blipFill>
-                    <a:blip r:embed="rId12"/>
+                    <a:blip r:embed="rId14"/>
                     <a:stretch>
                       <a:fillRect/>
                     </a:stretch>
@@ -1832,14 +2570,27 @@
       <w:r>
         <w:t xml:space="preserve">Figura </w:t>
       </w:r>
-      <w:fldSimple w:instr=" SEQ Figura \* ARABIC ">
-        <w:r>
-          <w:rPr>
-            <w:noProof/>
-          </w:rPr>
-          <w:t>1</w:t>
-        </w:r>
-      </w:fldSimple>
+      <w:r>
+        <w:fldChar w:fldCharType="begin"/>
+      </w:r>
+      <w:r>
+        <w:instrText xml:space="preserve"> SEQ Figura \* ARABIC </w:instrText>
+      </w:r>
+      <w:r>
+        <w:fldChar w:fldCharType="separate"/>
+      </w:r>
+      <w:r>
+        <w:rPr>
+          <w:noProof/>
+        </w:rPr>
+        <w:t>1</w:t>
+      </w:r>
+      <w:r>
+        <w:rPr>
+          <w:noProof/>
+        </w:rPr>
+        <w:fldChar w:fldCharType="end"/>
+      </w:r>
       <w:r>
         <w:t xml:space="preserve"> 1Estrutura do Projeto em Camadas (MVC)</w:t>
       </w:r>
@@ -2018,7 +2769,23 @@
           <w:sz w:val="24"/>
           <w:szCs w:val="24"/>
         </w:rPr>
-        <w:t>6.Ciação do banco de dados.</w:t>
+        <w:t>6.C</w:t>
+      </w:r>
+      <w:r>
+        <w:rPr>
+          <w:rFonts w:ascii="Arial" w:eastAsia="Arial" w:hAnsi="Arial" w:cs="Arial"/>
+          <w:sz w:val="24"/>
+          <w:szCs w:val="24"/>
+        </w:rPr>
+        <w:t>r</w:t>
+      </w:r>
+      <w:r>
+        <w:rPr>
+          <w:rFonts w:ascii="Arial" w:eastAsia="Arial" w:hAnsi="Arial" w:cs="Arial"/>
+          <w:sz w:val="24"/>
+          <w:szCs w:val="24"/>
+        </w:rPr>
+        <w:t>iação do banco de dados.</w:t>
       </w:r>
     </w:p>
     <w:p>
@@ -2053,7 +2820,7 @@
                     <pic:cNvPicPr/>
                   </pic:nvPicPr>
                   <pic:blipFill>
-                    <a:blip r:embed="rId13"/>
+                    <a:blip r:embed="rId15"/>
                     <a:stretch>
                       <a:fillRect/>
                     </a:stretch>
@@ -2081,14 +2848,27 @@
       <w:r>
         <w:t xml:space="preserve">Figura </w:t>
       </w:r>
-      <w:fldSimple w:instr=" SEQ Figura \* ARABIC ">
-        <w:r>
-          <w:rPr>
-            <w:noProof/>
-          </w:rPr>
-          <w:t>2</w:t>
-        </w:r>
-      </w:fldSimple>
+      <w:r>
+        <w:fldChar w:fldCharType="begin"/>
+      </w:r>
+      <w:r>
+        <w:instrText xml:space="preserve"> SEQ Figura \* ARABIC </w:instrText>
+      </w:r>
+      <w:r>
+        <w:fldChar w:fldCharType="separate"/>
+      </w:r>
+      <w:r>
+        <w:rPr>
+          <w:noProof/>
+        </w:rPr>
+        <w:t>2</w:t>
+      </w:r>
+      <w:r>
+        <w:rPr>
+          <w:noProof/>
+        </w:rPr>
+        <w:fldChar w:fldCharType="end"/>
+      </w:r>
       <w:r>
         <w:t xml:space="preserve"> Banco de Dados da Loja Virtual de Roupa</w:t>
       </w:r>
@@ -2327,7 +3107,7 @@
                     <pic:cNvPicPr/>
                   </pic:nvPicPr>
                   <pic:blipFill>
-                    <a:blip r:embed="rId14"/>
+                    <a:blip r:embed="rId16"/>
                     <a:stretch>
                       <a:fillRect/>
                     </a:stretch>
@@ -2360,14 +3140,27 @@
       <w:r>
         <w:t xml:space="preserve">Figura </w:t>
       </w:r>
-      <w:fldSimple w:instr=" SEQ Figura \* ARABIC ">
-        <w:r>
-          <w:rPr>
-            <w:noProof/>
-          </w:rPr>
-          <w:t>3</w:t>
-        </w:r>
-      </w:fldSimple>
+      <w:r>
+        <w:fldChar w:fldCharType="begin"/>
+      </w:r>
+      <w:r>
+        <w:instrText xml:space="preserve"> SEQ Figura \* ARABIC </w:instrText>
+      </w:r>
+      <w:r>
+        <w:fldChar w:fldCharType="separate"/>
+      </w:r>
+      <w:r>
+        <w:rPr>
+          <w:noProof/>
+        </w:rPr>
+        <w:t>3</w:t>
+      </w:r>
+      <w:r>
+        <w:rPr>
+          <w:noProof/>
+        </w:rPr>
+        <w:fldChar w:fldCharType="end"/>
+      </w:r>
       <w:r>
         <w:t xml:space="preserve"> Clonagem do Projeto do Grupo 4</w:t>
       </w:r>
@@ -2522,7 +3315,7 @@
                     <pic:cNvPicPr/>
                   </pic:nvPicPr>
                   <pic:blipFill>
-                    <a:blip r:embed="rId15"/>
+                    <a:blip r:embed="rId17"/>
                     <a:stretch>
                       <a:fillRect/>
                     </a:stretch>
@@ -2555,14 +3348,27 @@
       <w:r>
         <w:t xml:space="preserve">Figura </w:t>
       </w:r>
-      <w:fldSimple w:instr=" SEQ Figura \* ARABIC ">
-        <w:r>
-          <w:rPr>
-            <w:noProof/>
-          </w:rPr>
-          <w:t>4</w:t>
-        </w:r>
-      </w:fldSimple>
+      <w:r>
+        <w:fldChar w:fldCharType="begin"/>
+      </w:r>
+      <w:r>
+        <w:instrText xml:space="preserve"> SEQ Figura \* ARABIC </w:instrText>
+      </w:r>
+      <w:r>
+        <w:fldChar w:fldCharType="separate"/>
+      </w:r>
+      <w:r>
+        <w:rPr>
+          <w:noProof/>
+        </w:rPr>
+        <w:t>4</w:t>
+      </w:r>
+      <w:r>
+        <w:rPr>
+          <w:noProof/>
+        </w:rPr>
+        <w:fldChar w:fldCharType="end"/>
+      </w:r>
       <w:r>
         <w:t xml:space="preserve"> Criação das Branches</w:t>
       </w:r>
@@ -2952,7 +3758,7 @@
                     <pic:cNvPicPr/>
                   </pic:nvPicPr>
                   <pic:blipFill>
-                    <a:blip r:embed="rId16">
+                    <a:blip r:embed="rId18">
                       <a:extLst>
                         <a:ext uri="{28A0092B-C50C-407E-A947-70E740481C1C}">
                           <a14:useLocalDpi xmlns:a14="http://schemas.microsoft.com/office/drawing/2010/main" val="0"/>
@@ -2986,14 +3792,27 @@
       <w:r>
         <w:t xml:space="preserve">Figura </w:t>
       </w:r>
-      <w:fldSimple w:instr=" SEQ Figura \* ARABIC ">
-        <w:r>
-          <w:rPr>
-            <w:noProof/>
-          </w:rPr>
-          <w:t>5</w:t>
-        </w:r>
-      </w:fldSimple>
+      <w:r>
+        <w:fldChar w:fldCharType="begin"/>
+      </w:r>
+      <w:r>
+        <w:instrText xml:space="preserve"> SEQ Figura \* ARABIC </w:instrText>
+      </w:r>
+      <w:r>
+        <w:fldChar w:fldCharType="separate"/>
+      </w:r>
+      <w:r>
+        <w:rPr>
+          <w:noProof/>
+        </w:rPr>
+        <w:t>5</w:t>
+      </w:r>
+      <w:r>
+        <w:rPr>
+          <w:noProof/>
+        </w:rPr>
+        <w:fldChar w:fldCharType="end"/>
+      </w:r>
       <w:r>
         <w:t xml:space="preserve"> Diagrama Entidade-Relacionamento (DER)</w:t>
       </w:r>
@@ -3801,7 +4620,7 @@
           <w:sz w:val="24"/>
           <w:szCs w:val="24"/>
         </w:rPr>
-        <w:t xml:space="preserve">Durante a aula, foi dada continuidade ao desenvolvimento do backend do sistema da loja de moda. Inicialmente, foi realizada a implementação e configuração da classe Pessoa, responsável pelo mapeamento da tabela pessoa existente no banco de dados. Foram configurados os atributos da entidade e suas respectivas anotações do </w:t>
+        <w:t xml:space="preserve">Durante a aula, foi dada continuidade ao desenvolvimento do backend do sistema da loja de moda. Inicialmente, foi realizada a implementação e configuração da classe Pessoa, responsável pelo mapeamento da tabela pessoa existente no banco de dados. Foram configurados os atributos da entidade e suas respectivas </w:t>
       </w:r>
       <w:r>
         <w:rPr>
@@ -3810,7 +4629,7 @@
           <w:szCs w:val="24"/>
         </w:rPr>
         <w:lastRenderedPageBreak/>
-        <w:t>JPA para permitir a comunicação correta entre a aplicação Java e o banco de dados.</w:t>
+        <w:t>anotações do JPA para permitir a comunicação correta entre a aplicação Java e o banco de dados.</w:t>
       </w:r>
     </w:p>
     <w:p>
@@ -3844,7 +4663,7 @@
                     <pic:cNvPicPr/>
                   </pic:nvPicPr>
                   <pic:blipFill>
-                    <a:blip r:embed="rId17"/>
+                    <a:blip r:embed="rId19"/>
                     <a:stretch>
                       <a:fillRect/>
                     </a:stretch>
@@ -3872,14 +4691,27 @@
       <w:r>
         <w:t xml:space="preserve">Figura </w:t>
       </w:r>
-      <w:fldSimple w:instr=" SEQ Figura \* ARABIC ">
-        <w:r>
-          <w:rPr>
-            <w:noProof/>
-          </w:rPr>
-          <w:t>6</w:t>
-        </w:r>
-      </w:fldSimple>
+      <w:r>
+        <w:fldChar w:fldCharType="begin"/>
+      </w:r>
+      <w:r>
+        <w:instrText xml:space="preserve"> SEQ Figura \* ARABIC </w:instrText>
+      </w:r>
+      <w:r>
+        <w:fldChar w:fldCharType="separate"/>
+      </w:r>
+      <w:r>
+        <w:rPr>
+          <w:noProof/>
+        </w:rPr>
+        <w:t>6</w:t>
+      </w:r>
+      <w:r>
+        <w:rPr>
+          <w:noProof/>
+        </w:rPr>
+        <w:fldChar w:fldCharType="end"/>
+      </w:r>
       <w:r>
         <w:t xml:space="preserve"> Classe Model Pessoa</w:t>
       </w:r>
@@ -3919,7 +4751,7 @@
           <w:sz w:val="24"/>
           <w:szCs w:val="24"/>
         </w:rPr>
-        <w:t xml:space="preserve"> seguida, foi desenvolvido o PessoaRepository, utilizando o JpaRepository para disponibilizar as operações de acesso aos registros da tabela pessoa. Também foram realizadas configurações para </w:t>
+        <w:t xml:space="preserve"> seguida, foi desenvolvido o PessoaRepository, utilizando o JpaRepository para disponibilizar as operações de acesso aos registros da tabela pessoa. Também foram realizadas </w:t>
       </w:r>
       <w:r>
         <w:rPr>
@@ -3928,7 +4760,7 @@
           <w:szCs w:val="24"/>
         </w:rPr>
         <w:lastRenderedPageBreak/>
-        <w:t>permitir a busca das pessoas de acordo com o seu tipo, possibilitando trabalhar com clientes, funcionários e fornecedores.</w:t>
+        <w:t>configurações para permitir a busca das pessoas de acordo com o seu tipo, possibilitando trabalhar com clientes, funcionários e fornecedores.</w:t>
       </w:r>
     </w:p>
     <w:p>
@@ -3962,7 +4794,7 @@
                     <pic:cNvPicPr/>
                   </pic:nvPicPr>
                   <pic:blipFill>
-                    <a:blip r:embed="rId18"/>
+                    <a:blip r:embed="rId20"/>
                     <a:stretch>
                       <a:fillRect/>
                     </a:stretch>
@@ -3995,14 +4827,27 @@
       <w:r>
         <w:t xml:space="preserve">Figura </w:t>
       </w:r>
-      <w:fldSimple w:instr=" SEQ Figura \* ARABIC ">
-        <w:r>
-          <w:rPr>
-            <w:noProof/>
-          </w:rPr>
-          <w:t>7</w:t>
-        </w:r>
-      </w:fldSimple>
+      <w:r>
+        <w:fldChar w:fldCharType="begin"/>
+      </w:r>
+      <w:r>
+        <w:instrText xml:space="preserve"> SEQ Figura \* ARABIC </w:instrText>
+      </w:r>
+      <w:r>
+        <w:fldChar w:fldCharType="separate"/>
+      </w:r>
+      <w:r>
+        <w:rPr>
+          <w:noProof/>
+        </w:rPr>
+        <w:t>7</w:t>
+      </w:r>
+      <w:r>
+        <w:rPr>
+          <w:noProof/>
+        </w:rPr>
+        <w:fldChar w:fldCharType="end"/>
+      </w:r>
       <w:r>
         <w:t xml:space="preserve"> Classe Repository Pessoa</w:t>
       </w:r>
@@ -4237,6 +5082,7 @@
         <w:rPr>
           <w:noProof/>
         </w:rPr>
+        <w:lastRenderedPageBreak/>
         <w:drawing>
           <wp:inline distT="0" distB="0" distL="0" distR="0" wp14:anchorId="48E53201" wp14:editId="0C9C4B23">
             <wp:extent cx="4844673" cy="3694430"/>
@@ -4253,7 +5099,7 @@
                     <pic:cNvPicPr/>
                   </pic:nvPicPr>
                   <pic:blipFill>
-                    <a:blip r:embed="rId19"/>
+                    <a:blip r:embed="rId21"/>
                     <a:stretch>
                       <a:fillRect/>
                     </a:stretch>
@@ -4281,14 +5127,27 @@
       <w:r>
         <w:t xml:space="preserve">Figura </w:t>
       </w:r>
-      <w:fldSimple w:instr=" SEQ Figura \* ARABIC ">
-        <w:r>
-          <w:rPr>
-            <w:noProof/>
-          </w:rPr>
-          <w:t>8</w:t>
-        </w:r>
-      </w:fldSimple>
+      <w:r>
+        <w:fldChar w:fldCharType="begin"/>
+      </w:r>
+      <w:r>
+        <w:instrText xml:space="preserve"> SEQ Figura \* ARABIC </w:instrText>
+      </w:r>
+      <w:r>
+        <w:fldChar w:fldCharType="separate"/>
+      </w:r>
+      <w:r>
+        <w:rPr>
+          <w:noProof/>
+        </w:rPr>
+        <w:t>8</w:t>
+      </w:r>
+      <w:r>
+        <w:rPr>
+          <w:noProof/>
+        </w:rPr>
+        <w:fldChar w:fldCharType="end"/>
+      </w:r>
       <w:r>
         <w:t xml:space="preserve"> Classe Pessoa Controller</w:t>
       </w:r>
@@ -4303,7 +5162,6 @@
         <w:ind w:left="1425"/>
       </w:pPr>
       <w:r>
-        <w:lastRenderedPageBreak/>
         <w:t>Em seguida, foi criado o pacote service e desenvolvida a classe PessoaService. Nessa classe foram organizadas as regras de negócio relacionadas ao gerenciamento das pessoas, incluindo cadastro, consulta, atualização, exclusão, validação e diferenciação dos tipos de pessoa.</w:t>
       </w:r>
     </w:p>
@@ -4322,6 +5180,7 @@
         <w:rPr>
           <w:noProof/>
         </w:rPr>
+        <w:lastRenderedPageBreak/>
         <w:drawing>
           <wp:inline distT="0" distB="0" distL="0" distR="0" wp14:anchorId="363A4631" wp14:editId="2AA60B6F">
             <wp:extent cx="4881563" cy="3905250"/>
@@ -4338,7 +5197,7 @@
                     <pic:cNvPicPr/>
                   </pic:nvPicPr>
                   <pic:blipFill>
-                    <a:blip r:embed="rId20"/>
+                    <a:blip r:embed="rId22"/>
                     <a:stretch>
                       <a:fillRect/>
                     </a:stretch>
@@ -4366,14 +5225,27 @@
       <w:r>
         <w:t xml:space="preserve">Figura </w:t>
       </w:r>
-      <w:fldSimple w:instr=" SEQ Figura \* ARABIC ">
-        <w:r>
-          <w:rPr>
-            <w:noProof/>
-          </w:rPr>
-          <w:t>9</w:t>
-        </w:r>
-      </w:fldSimple>
+      <w:r>
+        <w:fldChar w:fldCharType="begin"/>
+      </w:r>
+      <w:r>
+        <w:instrText xml:space="preserve"> SEQ Figura \* ARABIC </w:instrText>
+      </w:r>
+      <w:r>
+        <w:fldChar w:fldCharType="separate"/>
+      </w:r>
+      <w:r>
+        <w:rPr>
+          <w:noProof/>
+        </w:rPr>
+        <w:t>9</w:t>
+      </w:r>
+      <w:r>
+        <w:rPr>
+          <w:noProof/>
+        </w:rPr>
+        <w:fldChar w:fldCharType="end"/>
+      </w:r>
       <w:r>
         <w:t xml:space="preserve"> Classe Pessoa Service</w:t>
       </w:r>
@@ -4523,7 +5395,6 @@
           <w:sz w:val="24"/>
           <w:szCs w:val="24"/>
         </w:rPr>
-        <w:lastRenderedPageBreak/>
         <w:t>AULA 8 – CORREÇÃO DE ERROS E PADRONIZAÇÃO DO PROJETO</w:t>
       </w:r>
     </w:p>
@@ -4611,6 +5482,7 @@
           <w:sz w:val="24"/>
           <w:szCs w:val="24"/>
         </w:rPr>
+        <w:lastRenderedPageBreak/>
         <w:t>Objetivo:</w:t>
       </w:r>
     </w:p>
@@ -4959,7 +5831,6 @@
           <w:sz w:val="24"/>
           <w:szCs w:val="24"/>
         </w:rPr>
-        <w:lastRenderedPageBreak/>
         <w:t>Também foi identificada uma inconsistência na nomenclatura dos pacotes de serviços. A pasta estava nomeada como servicos, enquanto algumas classes utilizavam servico, causando conflitos e erros de referência. Para solucionar o problema, foram renomeadas as pastas e ajustadas as referências necessárias, buscando manter um padrão único de nomenclatura em todo o projeto.</w:t>
       </w:r>
     </w:p>
@@ -4989,6 +5860,7 @@
           <w:sz w:val="24"/>
           <w:szCs w:val="24"/>
         </w:rPr>
+        <w:lastRenderedPageBreak/>
         <w:t>Após as alterações, o grupo realizou novas verificações para identificar outros erros e garantir que as classes e funcionalidades voltassem a se comunicar corretamente.</w:t>
       </w:r>
     </w:p>
@@ -6317,7 +7189,6 @@
           <w:sz w:val="24"/>
           <w:szCs w:val="24"/>
         </w:rPr>
-        <w:lastRenderedPageBreak/>
         <w:t>Utilizar a ABNT como norma.</w:t>
       </w:r>
     </w:p>
@@ -6625,8 +7496,8 @@
       </w:pPr>
     </w:p>
     <w:sectPr>
-      <w:headerReference w:type="default" r:id="rId21"/>
-      <w:footerReference w:type="default" r:id="rId22"/>
+      <w:headerReference w:type="default" r:id="rId23"/>
+      <w:footerReference w:type="default" r:id="rId24"/>
       <w:pgSz w:w="11920" w:h="16860"/>
       <w:pgMar w:top="1701" w:right="1134" w:bottom="1134" w:left="1701" w:header="284" w:footer="624" w:gutter="0"/>
       <w:pgNumType w:start="1"/>
@@ -6780,8 +7651,32 @@
 
 <file path=word/commentsExtensible.xml><?xml version="1.0" encoding="utf-8"?>
 <w16cex:commentsExtensible xmlns:wpc="http://schemas.microsoft.com/office/word/2010/wordprocessingCanvas" xmlns:cx="http://schemas.microsoft.com/office/drawing/2014/chartex" xmlns:cx1="http://schemas.microsoft.com/office/drawing/2015/9/8/chartex" xmlns:cx2="http://schemas.microsoft.com/office/drawing/2015/10/21/chartex" xmlns:cx3="http://schemas.microsoft.com/office/drawing/2016/5/9/chartex" xmlns:cx4="http://schemas.microsoft.com/office/drawing/2016/5/10/chartex" xmlns:cx5="http://schemas.microsoft.com/office/drawing/2016/5/11/chartex" xmlns:cx6="http://schemas.microsoft.com/office/drawing/2016/5/12/chartex" xmlns:cx7="http://schemas.microsoft.com/office/drawing/2016/5/13/chartex" xmlns:cx8="http://schemas.microsoft.com/office/drawing/2016/5/14/chartex" xmlns:cr="http://schemas.microsoft.com/office/comments/2020/reactions" xmlns:mc="http://schemas.openxmlformats.org/markup-compatibility/2006" xmlns:aink="http://schemas.microsoft.com/office/drawing/2016/ink" xmlns:am3d="http://schemas.microsoft.com/office/drawing/2017/model3d" xmlns:o="urn:schemas-microsoft-com:office:office" xmlns:oel="http://schemas.microsoft.com/office/2019/extlst" xmlns:r="http://schemas.openxmlformats.org/officeDocument/2006/relationships" xmlns:m="http://schemas.openxmlformats.org/officeDocument/2006/math" xmlns:v="urn:schemas-microsoft-com:vml" xmlns:wp14="http://schemas.microsoft.com/office/word/2010/wordprocessingDrawing" xmlns:wp="http://schemas.openxmlformats.org/drawingml/2006/wordprocessingDrawing" xmlns:w10="urn:schemas-microsoft-com:office:word" xmlns:w="http://schemas.openxmlformats.org/wordprocessingml/2006/main" xmlns:w14="http://schemas.microsoft.com/office/word/2010/wordml" xmlns:w15="http://schemas.microsoft.com/office/word/2012/wordml" xmlns:w16cex="http://schemas.microsoft.com/office/word/2018/wordml/cex" xmlns:w16cid="http://schemas.microsoft.com/office/word/2016/wordml/cid" xmlns:w16="http://schemas.microsoft.com/office/word/2018/wordml" xmlns:w16du="http://schemas.microsoft.com/office/word/2023/wordml/word16du" xmlns:w16sdtdh="http://schemas.microsoft.com/office/word/2020/wordml/sdtdatahash" xmlns:w16sdtfl="http://schemas.microsoft.com/office/word/2024/wordml/sdtformatlock" xmlns:w16se="http://schemas.microsoft.com/office/word/2015/wordml/symex" xmlns:wpg="http://schemas.microsoft.com/office/word/2010/wordprocessingGroup" xmlns:wpi="http://schemas.microsoft.com/office/word/2010/wordprocessingInk" xmlns:wne="http://schemas.microsoft.com/office/word/2006/wordml" xmlns:wps="http://schemas.microsoft.com/office/word/2010/wordprocessingShape" mc:Ignorable="w14 w15 w16se w16cid w16 w16cex w16sdtdh w16sdtfl cr w16du wp14">
-  <w16cex:commentExtensible w16cex:durableId="14969B87" w16cex:dateUtc="2026-08-25T19:34:00Z"/>
-  <w16cex:commentExtensible w16cex:durableId="2C4B0949" w16cex:dateUtc="2026-08-25T19:26:00Z"/>
+  <w16cex:commentExtensible w16cex:durableId="14969B87" w16cex:dateUtc="2026-08-25T19:34:00Z">
+    <w16cex:extLst>
+      <w16:ext w16:uri="{CE6994B0-6A32-4C9F-8C6B-6E91EDA988CE}">
+        <cr:reactions xmlns:cr="http://schemas.microsoft.com/office/comments/2020/reactions">
+          <cr:reaction reactionType="1">
+            <cr:reactionInfo dateUtc="2026-08-25T20:16:51Z">
+              <cr:user userId="Aluno" userProvider="None" userName="Aluno"/>
+            </cr:reactionInfo>
+          </cr:reaction>
+        </cr:reactions>
+      </w16:ext>
+    </w16cex:extLst>
+  </w16cex:commentExtensible>
+  <w16cex:commentExtensible w16cex:durableId="2C4B0949" w16cex:dateUtc="2026-08-25T19:26:00Z">
+    <w16cex:extLst>
+      <w16:ext w16:uri="{CE6994B0-6A32-4C9F-8C6B-6E91EDA988CE}">
+        <cr:reactions xmlns:cr="http://schemas.microsoft.com/office/comments/2020/reactions">
+          <cr:reaction reactionType="1">
+            <cr:reactionInfo dateUtc="2026-08-25T19:56:25Z">
+              <cr:user userId="Aluno" userProvider="None" userName="Aluno"/>
+            </cr:reactionInfo>
+          </cr:reaction>
+        </cr:reactions>
+      </w16:ext>
+    </w16cex:extLst>
+  </w16cex:commentExtensible>
   <w16cex:commentExtensible w16cex:durableId="6435CBFC" w16cex:dateUtc="2026-08-25T19:35:00Z"/>
   <w16cex:commentExtensible w16cex:durableId="6E64C5C7" w16cex:dateUtc="2026-08-25T19:35:00Z"/>
 </w16cex:commentsExtensible>
@@ -6819,21 +7714,170 @@
 <w:ftr xmlns:wpc="http://schemas.microsoft.com/office/word/2010/wordprocessingCanvas" xmlns:cx="http://schemas.microsoft.com/office/drawing/2014/chartex" xmlns:cx1="http://schemas.microsoft.com/office/drawing/2015/9/8/chartex" xmlns:cx2="http://schemas.microsoft.com/office/drawing/2015/10/21/chartex" xmlns:cx3="http://schemas.microsoft.com/office/drawing/2016/5/9/chartex" xmlns:cx4="http://schemas.microsoft.com/office/drawing/2016/5/10/chartex" xmlns:cx5="http://schemas.microsoft.com/office/drawing/2016/5/11/chartex" xmlns:cx6="http://schemas.microsoft.com/office/drawing/2016/5/12/chartex" xmlns:cx7="http://schemas.microsoft.com/office/drawing/2016/5/13/chartex" xmlns:cx8="http://schemas.microsoft.com/office/drawing/2016/5/14/chartex" xmlns:mc="http://schemas.openxmlformats.org/markup-compatibility/2006" xmlns:aink="http://schemas.microsoft.com/office/drawing/2016/ink" xmlns:am3d="http://schemas.microsoft.com/office/drawing/2017/model3d" xmlns:o="urn:schemas-microsoft-com:office:office" xmlns:oel="http://schemas.microsoft.com/office/2019/extlst" xmlns:r="http://schemas.openxmlformats.org/officeDocument/2006/relationships" xmlns:m="http://schemas.openxmlformats.org/officeDocument/2006/math" xmlns:v="urn:schemas-microsoft-com:vml" xmlns:wp14="http://schemas.microsoft.com/office/word/2010/wordprocessingDrawing" xmlns:wp="http://schemas.openxmlformats.org/drawingml/2006/wordprocessingDrawing" xmlns:w10="urn:schemas-microsoft-com:office:word" xmlns:w="http://schemas.openxmlformats.org/wordprocessingml/2006/main" xmlns:w14="http://schemas.microsoft.com/office/word/2010/wordml" xmlns:w15="http://schemas.microsoft.com/office/word/2012/wordml" xmlns:w16cex="http://schemas.microsoft.com/office/word/2018/wordml/cex" xmlns:w16cid="http://schemas.microsoft.com/office/word/2016/wordml/cid" xmlns:w16="http://schemas.microsoft.com/office/word/2018/wordml" xmlns:w16du="http://schemas.microsoft.com/office/word/2023/wordml/word16du" xmlns:w16sdtdh="http://schemas.microsoft.com/office/word/2020/wordml/sdtdatahash" xmlns:w16sdtfl="http://schemas.microsoft.com/office/word/2024/wordml/sdtformatlock" xmlns:w16se="http://schemas.microsoft.com/office/word/2015/wordml/symex" xmlns:wpg="http://schemas.microsoft.com/office/word/2010/wordprocessingGroup" xmlns:wpi="http://schemas.microsoft.com/office/word/2010/wordprocessingInk" xmlns:wne="http://schemas.microsoft.com/office/word/2006/wordml" xmlns:wps="http://schemas.microsoft.com/office/word/2010/wordprocessingShape" mc:Ignorable="w14 w15 w16se w16cid w16 w16cex w16sdtdh w16sdtfl w16du wp14">
   <w:p>
     <w:pPr>
-      <w:pBdr>
-        <w:top w:val="nil"/>
-        <w:left w:val="nil"/>
-        <w:bottom w:val="nil"/>
-        <w:right w:val="nil"/>
-        <w:between w:val="nil"/>
-      </w:pBdr>
-      <w:tabs>
-        <w:tab w:val="center" w:pos="4252"/>
-        <w:tab w:val="right" w:pos="8504"/>
-      </w:tabs>
+      <w:pStyle w:val="Rodap"/>
+      <w:jc w:val="right"/>
+    </w:pPr>
+    <w:r>
       <w:rPr>
-        <w:color w:val="000000"/>
+        <w:noProof/>
       </w:rPr>
-    </w:pPr>
+      <mc:AlternateContent>
+        <mc:Choice Requires="wps">
+          <w:drawing>
+            <wp:anchor distT="0" distB="0" distL="114300" distR="114300" simplePos="0" relativeHeight="251661312" behindDoc="0" locked="0" layoutInCell="1" allowOverlap="1" wp14:anchorId="1C4DF0C9" wp14:editId="04920B51">
+              <wp:simplePos x="0" y="0"/>
+              <wp:positionH relativeFrom="margin">
+                <wp:posOffset>4151630</wp:posOffset>
+              </wp:positionH>
+              <wp:positionV relativeFrom="paragraph">
+                <wp:posOffset>-854075</wp:posOffset>
+              </wp:positionV>
+              <wp:extent cx="762000" cy="314325"/>
+              <wp:effectExtent l="0" t="0" r="19050" b="28575"/>
+              <wp:wrapNone/>
+              <wp:docPr id="978218606" name="Retângulo 1"/>
+              <wp:cNvGraphicFramePr/>
+              <a:graphic xmlns:a="http://schemas.openxmlformats.org/drawingml/2006/main">
+                <a:graphicData uri="http://schemas.microsoft.com/office/word/2010/wordprocessingShape">
+                  <wps:wsp>
+                    <wps:cNvSpPr/>
+                    <wps:spPr>
+                      <a:xfrm>
+                        <a:off x="0" y="0"/>
+                        <a:ext cx="762000" cy="314325"/>
+                      </a:xfrm>
+                      <a:prstGeom prst="rect">
+                        <a:avLst/>
+                      </a:prstGeom>
+                      <a:solidFill>
+                        <a:schemeClr val="bg1"/>
+                      </a:solidFill>
+                      <a:ln>
+                        <a:solidFill>
+                          <a:schemeClr val="bg1"/>
+                        </a:solidFill>
+                      </a:ln>
+                    </wps:spPr>
+                    <wps:style>
+                      <a:lnRef idx="2">
+                        <a:schemeClr val="accent1">
+                          <a:shade val="15000"/>
+                        </a:schemeClr>
+                      </a:lnRef>
+                      <a:fillRef idx="1">
+                        <a:schemeClr val="accent1"/>
+                      </a:fillRef>
+                      <a:effectRef idx="0">
+                        <a:schemeClr val="accent1"/>
+                      </a:effectRef>
+                      <a:fontRef idx="minor">
+                        <a:schemeClr val="lt1"/>
+                      </a:fontRef>
+                    </wps:style>
+                    <wps:bodyPr rot="0" spcFirstLastPara="0" vertOverflow="overflow" horzOverflow="overflow" vert="horz" wrap="square" lIns="91440" tIns="45720" rIns="91440" bIns="45720" numCol="1" spcCol="0" rtlCol="0" fromWordArt="0" anchor="ctr" anchorCtr="0" forceAA="0" compatLnSpc="1">
+                      <a:prstTxWarp prst="textNoShape">
+                        <a:avLst/>
+                      </a:prstTxWarp>
+                      <a:noAutofit/>
+                    </wps:bodyPr>
+                  </wps:wsp>
+                </a:graphicData>
+              </a:graphic>
+            </wp:anchor>
+          </w:drawing>
+        </mc:Choice>
+        <mc:Fallback>
+          <w:pict>
+            <v:rect w14:anchorId="79C92B40" id="Retângulo 1" o:spid="_x0000_s1026" style="position:absolute;margin-left:326.9pt;margin-top:-67.25pt;width:60pt;height:24.75pt;z-index:251661312;visibility:visible;mso-wrap-style:square;mso-wrap-distance-left:9pt;mso-wrap-distance-top:0;mso-wrap-distance-right:9pt;mso-wrap-distance-bottom:0;mso-position-horizontal:absolute;mso-position-horizontal-relative:margin;mso-position-vertical:absolute;mso-position-vertical-relative:text;v-text-anchor:middle" o:gfxdata="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" fillcolor="white [3212]" strokecolor="white [3212]" strokeweight="2pt">
+              <w10:wrap anchorx="margin"/>
+            </v:rect>
+          </w:pict>
+        </mc:Fallback>
+      </mc:AlternateContent>
+    </w:r>
+    <w:sdt>
+      <w:sdtPr>
+        <w:id w:val="221187583"/>
+        <w:docPartObj>
+          <w:docPartGallery w:val="Page Numbers (Bottom of Page)"/>
+          <w:docPartUnique/>
+        </w:docPartObj>
+      </w:sdtPr>
+      <w:sdtContent>
+        <w:r>
+          <w:rPr>
+            <w:noProof/>
+          </w:rPr>
+          <w:drawing>
+            <wp:anchor distT="0" distB="0" distL="114300" distR="114300" simplePos="0" relativeHeight="251658240" behindDoc="0" locked="0" layoutInCell="1" allowOverlap="1" wp14:anchorId="4FF9C1BE" wp14:editId="42B1F07E">
+              <wp:simplePos x="0" y="0"/>
+              <wp:positionH relativeFrom="column">
+                <wp:posOffset>5520690</wp:posOffset>
+              </wp:positionH>
+              <wp:positionV relativeFrom="page">
+                <wp:posOffset>9401175</wp:posOffset>
+              </wp:positionV>
+              <wp:extent cx="266700" cy="285750"/>
+              <wp:effectExtent l="0" t="0" r="0" b="0"/>
+              <wp:wrapSquare wrapText="bothSides"/>
+              <wp:docPr id="749774672" name="Imagem 1"/>
+              <wp:cNvGraphicFramePr>
+                <a:graphicFrameLocks xmlns:a="http://schemas.openxmlformats.org/drawingml/2006/main" noChangeAspect="1"/>
+              </wp:cNvGraphicFramePr>
+              <a:graphic xmlns:a="http://schemas.openxmlformats.org/drawingml/2006/main">
+                <a:graphicData uri="http://schemas.openxmlformats.org/drawingml/2006/picture">
+                  <pic:pic xmlns:pic="http://schemas.openxmlformats.org/drawingml/2006/picture">
+                    <pic:nvPicPr>
+                      <pic:cNvPr id="749774672" name=""/>
+                      <pic:cNvPicPr/>
+                    </pic:nvPicPr>
+                    <pic:blipFill>
+                      <a:blip r:embed="rId1">
+                        <a:extLst>
+                          <a:ext uri="{28A0092B-C50C-407E-A947-70E740481C1C}">
+                            <a14:useLocalDpi xmlns:a14="http://schemas.microsoft.com/office/drawing/2010/main" val="0"/>
+                          </a:ext>
+                        </a:extLst>
+                      </a:blip>
+                      <a:stretch>
+                        <a:fillRect/>
+                      </a:stretch>
+                    </pic:blipFill>
+                    <pic:spPr>
+                      <a:xfrm>
+                        <a:off x="0" y="0"/>
+                        <a:ext cx="266700" cy="285750"/>
+                      </a:xfrm>
+                      <a:prstGeom prst="rect">
+                        <a:avLst/>
+                      </a:prstGeom>
+                    </pic:spPr>
+                  </pic:pic>
+                </a:graphicData>
+              </a:graphic>
+              <wp14:sizeRelV relativeFrom="margin">
+                <wp14:pctHeight>0</wp14:pctHeight>
+              </wp14:sizeRelV>
+            </wp:anchor>
+          </w:drawing>
+        </w:r>
+        <w:r>
+          <w:fldChar w:fldCharType="begin"/>
+        </w:r>
+        <w:r>
+          <w:instrText>PAGE   \* MERGEFORMAT</w:instrText>
+        </w:r>
+        <w:r>
+          <w:fldChar w:fldCharType="separate"/>
+        </w:r>
+        <w:r>
+          <w:t>2</w:t>
+        </w:r>
+        <w:r>
+          <w:fldChar w:fldCharType="end"/>
+        </w:r>
+      </w:sdtContent>
+    </w:sdt>
   </w:p>
   <w:p>
     <w:pPr>
@@ -8440,6 +9484,10 @@
 </go:gDocsCustomXmlDataStorage>
 </file>
 
+<file path=customXml/item2.xml><?xml version="1.0" encoding="utf-8"?>
+<b:Sources xmlns:b="http://schemas.openxmlformats.org/officeDocument/2006/bibliography" xmlns="http://schemas.openxmlformats.org/officeDocument/2006/bibliography" SelectedStyle="\APASixthEditionOfficeOnline.xsl" StyleName="APA" Version="6"/>
+</file>
+
 <file path=customXml/itemProps1.xml><?xml version="1.0" encoding="utf-8"?>
 <ds:datastoreItem xmlns:ds="http://schemas.openxmlformats.org/officeDocument/2006/customXml" ds:itemID="{11111111-1234-1234-1234-123412341234}">
   <ds:schemaRefs>
@@ -8447,4 +9495,12 @@
     <ds:schemaRef ds:uri="http://schemas.openxmlformats.org/officeDocument/2006/relationships"/>
   </ds:schemaRefs>
 </ds:datastoreItem>
+</file>
+
+<file path=customXml/itemProps2.xml><?xml version="1.0" encoding="utf-8"?>
+<ds:datastoreItem xmlns:ds="http://schemas.openxmlformats.org/officeDocument/2006/customXml" ds:itemID="{4A9E14FC-19FF-437D-AD81-D4AB5363452A}">
+  <ds:schemaRefs>
+    <ds:schemaRef ds:uri="http://schemas.openxmlformats.org/officeDocument/2006/bibliography"/>
+  </ds:schemaRefs>
+</ds:datastoreItem>
 </file>
</xml_diff>